<commit_message>
Publish website from 088cda9
</commit_message>
<xml_diff>
--- a/main-docx/manuscript.docx
+++ b/main-docx/manuscript.docx
@@ -2,30 +2,6 @@
 <file path=word/document.xml><?xml version="1.0" encoding="utf-8"?>
 <w:document xmlns:w="http://schemas.openxmlformats.org/wordprocessingml/2006/main" xmlns:m="http://schemas.openxmlformats.org/officeDocument/2006/math" xmlns:r="http://schemas.openxmlformats.org/officeDocument/2006/relationships" xmlns:o="urn:schemas-microsoft-com:office:office" xmlns:v="urn:schemas-microsoft-com:vml" xmlns:w10="urn:schemas-microsoft-com:office:word" xmlns:a="http://schemas.openxmlformats.org/drawingml/2006/main" xmlns:pic="http://schemas.openxmlformats.org/drawingml/2006/picture" xmlns:wp="http://schemas.openxmlformats.org/drawingml/2006/wordprocessingDrawing">
   <w:body>
-    <w:p>
-      <w:pPr>
-        <w:pStyle w:val="Title"/>
-      </w:pPr>
-      <w:r>
-        <w:t xml:space="preserve">Main Manuscript</w:t>
-      </w:r>
-    </w:p>
-    <w:p>
-      <w:pPr>
-        <w:pStyle w:val="Author"/>
-      </w:pPr>
-      <w:r>
-        <w:t xml:space="preserve">Sabou Rani Stocker, Emanuel de Bellis, Anne-Kathrin Klesse &amp; Ana Valenzuela</w:t>
-      </w:r>
-    </w:p>
-    <w:p>
-      <w:pPr>
-        <w:pStyle w:val="Date"/>
-      </w:pPr>
-      <w:r>
-        <w:t xml:space="preserve">2026-07-23</w:t>
-      </w:r>
-    </w:p>
     <w:sdt>
       <w:sdtPr>
         <w:docPartObj>
@@ -170,12 +146,12 @@
         <w:t xml:space="preserve">ESADE Business School</w:t>
       </w:r>
     </w:p>
+    <w:bookmarkEnd w:id="20"/>
     <w:p>
       <w:r>
         <w:br w:type="page"/>
       </w:r>
     </w:p>
-    <w:bookmarkEnd w:id="20"/>
     <w:bookmarkStart w:id="21" w:name="Xafe68fb07b0f0d8b3ea921713925e0ff66638bd"/>
     <w:p>
       <w:pPr>
@@ -210,7 +186,7 @@
         <w:pStyle w:val="Heading1"/>
       </w:pPr>
       <w:r>
-        <w:t xml:space="preserve">Introduction</w:t>
+        <w:t xml:space="preserve">1. Introduction</w:t>
       </w:r>
     </w:p>
     <w:p>
@@ -219,6 +195,143 @@
       </w:pPr>
       <w:r>
         <w:t xml:space="preserve">Background</w:t>
+      </w:r>
+      <w:r>
+        <w:t xml:space="preserve"> </w:t>
+      </w:r>
+      <w:r>
+        <w:t xml:space="preserve">- Marketing has always absorbed technological disruption, from mass media and digital channels to database marketing and programmatic advertising, and emerged richer for it.</w:t>
+      </w:r>
+      <w:r>
+        <w:t xml:space="preserve"> </w:t>
+      </w:r>
+      <w:r>
+        <w:t xml:space="preserve"> </w:t>
+      </w:r>
+      <w:r>
+        <w:t xml:space="preserve">- Consumer technologies are being rapidly adopted and penetrate many aspects of our society and living</w:t>
+      </w:r>
+      <w:r>
+        <w:t xml:space="preserve"> </w:t>
+      </w:r>
+      <w:r>
+        <w:t xml:space="preserve">[1,2]</w:t>
+      </w:r>
+      <w:r>
+        <w:t xml:space="preserve"> </w:t>
+      </w:r>
+      <w:r>
+        <w:t xml:space="preserve">- in the 21st century, various media has rapidly spread and fundamentally changed our research areas -&gt; social media, e-commerce and online spaces, …</w:t>
+      </w:r>
+      <w:r>
+        <w:t xml:space="preserve"> </w:t>
+      </w:r>
+      <w:r>
+        <w:t xml:space="preserve">- it follows naturally that the domain of marketing &amp; consumer research follows suit with technological developments, especially consumer technology.</w:t>
+      </w:r>
+      <w:r>
+        <w:t xml:space="preserve"> </w:t>
+      </w:r>
+      <w:r>
+        <w:t xml:space="preserve">-</w:t>
+      </w:r>
+      <w:r>
+        <w:t xml:space="preserve"> </w:t>
+      </w:r>
+      <w:r>
+        <w:rPr>
+          <w:b/>
+          <w:bCs/>
+        </w:rPr>
+        <w:t xml:space="preserve">Definition of consumer facing technologies (ideally adapted from previous work in the Marketing). Indicate the sheer amount of work that has been done in this area (i.e., give number of papers published, authors involved or some other stats).</w:t>
+      </w:r>
+    </w:p>
+    <w:p>
+      <w:pPr>
+        <w:pStyle w:val="BodyText"/>
+      </w:pPr>
+      <w:r>
+        <w:t xml:space="preserve">The term</w:t>
+      </w:r>
+      <w:r>
+        <w:t xml:space="preserve"> </w:t>
+      </w:r>
+      <w:r>
+        <w:rPr>
+          <w:i/>
+          <w:iCs/>
+        </w:rPr>
+        <w:t xml:space="preserve">technology</w:t>
+      </w:r>
+      <w:r>
+        <w:t xml:space="preserve"> </w:t>
+      </w:r>
+      <w:r>
+        <w:t xml:space="preserve">in the domain of marketing and consumer research as scientific knowledge and its application for firms or consumers that can influence value creation and exchange</w:t>
+      </w:r>
+      <w:r>
+        <w:t xml:space="preserve"> </w:t>
+      </w:r>
+      <w:r>
+        <w:t xml:space="preserve">[3]</w:t>
+      </w:r>
+      <w:r>
+        <w:t xml:space="preserve">. Following influential work by</w:t>
+      </w:r>
+      <w:r>
+        <w:t xml:space="preserve"> </w:t>
+      </w:r>
+      <w:r>
+        <w:t xml:space="preserve">[4]</w:t>
+      </w:r>
+      <w:r>
+        <w:t xml:space="preserve">;</w:t>
+      </w:r>
+      <w:r>
+        <w:t xml:space="preserve"> </w:t>
+      </w:r>
+      <w:r>
+        <w:t xml:space="preserve">[5]</w:t>
+      </w:r>
+      <w:r>
+        <w:t xml:space="preserve">;</w:t>
+      </w:r>
+      <w:r>
+        <w:t xml:space="preserve"> </w:t>
+      </w:r>
+      <w:r>
+        <w:t xml:space="preserve">[6]</w:t>
+      </w:r>
+      <w:r>
+        <w:t xml:space="preserve"> </w:t>
+      </w:r>
+      <w:r>
+        <w:t xml:space="preserve">and</w:t>
+      </w:r>
+      <w:r>
+        <w:t xml:space="preserve"> </w:t>
+      </w:r>
+      <w:r>
+        <w:t xml:space="preserve">[7]</w:t>
+      </w:r>
+      <w:r>
+        <w:t xml:space="preserve">, we define</w:t>
+      </w:r>
+      <w:r>
+        <w:t xml:space="preserve"> </w:t>
+      </w:r>
+      <w:r>
+        <w:rPr>
+          <w:i/>
+          <w:iCs/>
+        </w:rPr>
+        <w:t xml:space="preserve">consumer-facing technologies</w:t>
+      </w:r>
+      <w:r>
+        <w:t xml:space="preserve"> </w:t>
+      </w:r>
+      <w:r>
+        <w:t xml:space="preserve">as the subset of technologies through which consumers directly use, encounter, or interact with in the context of retail, (digital) services, smart products, or the Internet of Things (among others), thereby shaping consumer experience.</w:t>
       </w:r>
     </w:p>
     <w:p>
@@ -230,7 +343,69 @@
         </w:numPr>
       </w:pPr>
       <w:r>
-        <w:t xml:space="preserve">Consumer-facing technologies increasingly shape how people choose, communicate, work, travel, access services, and manage everyday life.</w:t>
+        <w:t xml:space="preserve">There are studies in the research domain of consumer technology that demonstrate how rapidly this discipline has grown:</w:t>
+      </w:r>
+    </w:p>
+    <w:p>
+      <w:pPr>
+        <w:pStyle w:val="Compact"/>
+        <w:numPr>
+          <w:ilvl w:val="1"/>
+          <w:numId w:val="1002"/>
+        </w:numPr>
+      </w:pPr>
+      <w:r>
+        <w:t xml:space="preserve">[8]</w:t>
+      </w:r>
+      <w:r>
+        <w:t xml:space="preserve"> </w:t>
+      </w:r>
+      <w:r>
+        <w:t xml:space="preserve">synthesize 471 studies on mobile apps, publications on the topic rose exponentially</w:t>
+      </w:r>
+    </w:p>
+    <w:p>
+      <w:pPr>
+        <w:pStyle w:val="Compact"/>
+        <w:numPr>
+          <w:ilvl w:val="1"/>
+          <w:numId w:val="1002"/>
+        </w:numPr>
+      </w:pPr>
+      <w:r>
+        <w:t xml:space="preserve">[9]</w:t>
+      </w:r>
+      <w:r>
+        <w:t xml:space="preserve"> </w:t>
+      </w:r>
+      <w:r>
+        <w:t xml:space="preserve">thematically explore digital, social media, and mobile marketing, demonstrating that both the nuimner of studies as well as the citations per study exploded exponentially</w:t>
+      </w:r>
+    </w:p>
+    <w:p>
+      <w:pPr>
+        <w:pStyle w:val="Compact"/>
+        <w:numPr>
+          <w:ilvl w:val="1"/>
+          <w:numId w:val="1002"/>
+        </w:numPr>
+      </w:pPr>
+      <w:r>
+        <w:t xml:space="preserve">other studies highlight the rapid advancements in other domains of consumer tech</w:t>
+      </w:r>
+      <w:r>
+        <w:t xml:space="preserve"> </w:t>
+      </w:r>
+      <w:r>
+        <w:t xml:space="preserve">[10,11]</w:t>
+      </w:r>
+    </w:p>
+    <w:p>
+      <w:pPr>
+        <w:pStyle w:val="FirstParagraph"/>
+      </w:pPr>
+      <w:r>
+        <w:t xml:space="preserve">Problem 1:</w:t>
       </w:r>
     </w:p>
     <w:p>
@@ -238,67 +413,27 @@
         <w:pStyle w:val="Compact"/>
         <w:numPr>
           <w:ilvl w:val="0"/>
-          <w:numId w:val="1001"/>
+          <w:numId w:val="1003"/>
         </w:numPr>
       </w:pPr>
       <w:r>
-        <w:t xml:space="preserve">quantify</w:t>
-      </w:r>
-      <w:r>
-        <w:t xml:space="preserve"> </w:t>
-      </w:r>
-      <w:r>
-        <w:t xml:space="preserve">“shape”</w:t>
-      </w:r>
-      <w:r>
-        <w:t xml:space="preserve"> </w:t>
-      </w:r>
-      <w:r>
-        <w:t xml:space="preserve">with economic impact -&gt; tech-millionaires, consumer-tech adoption, …</w:t>
-      </w:r>
-    </w:p>
-    <w:p>
-      <w:pPr>
-        <w:pStyle w:val="Compact"/>
-        <w:numPr>
-          <w:ilvl w:val="0"/>
-          <w:numId w:val="1001"/>
-        </w:numPr>
-      </w:pPr>
-      <w:r>
-        <w:t xml:space="preserve">lead over to that this also naturally increases the research interest to understand how consumers and technologies interact</w:t>
-      </w:r>
-    </w:p>
-    <w:p>
-      <w:pPr>
-        <w:pStyle w:val="FirstParagraph"/>
-      </w:pPr>
-      <w:r>
-        <w:t xml:space="preserve">Problem</w:t>
-      </w:r>
-    </w:p>
-    <w:p>
-      <w:pPr>
-        <w:pStyle w:val="Compact"/>
-        <w:numPr>
-          <w:ilvl w:val="0"/>
-          <w:numId w:val="1002"/>
-        </w:numPr>
-      </w:pPr>
-      <w:r>
-        <w:t xml:space="preserve">Research on these technologies has expanded rapidly, but it is distributed and hard to parsimonoiusly express</w:t>
-      </w:r>
-    </w:p>
-    <w:p>
-      <w:pPr>
-        <w:pStyle w:val="Compact"/>
-        <w:numPr>
-          <w:ilvl w:val="0"/>
-          <w:numId w:val="1002"/>
-        </w:numPr>
-      </w:pPr>
-      <w:r>
-        <w:t xml:space="preserve">What has the domain of consumer-technology-research been up to over the past 26 years?</w:t>
+        <w:t xml:space="preserve">we are missing a unified picture of</w:t>
+      </w:r>
+      <w:r>
+        <w:t xml:space="preserve"> </w:t>
+      </w:r>
+      <w:r>
+        <w:rPr>
+          <w:i/>
+          <w:iCs/>
+        </w:rPr>
+        <w:t xml:space="preserve">what</w:t>
+      </w:r>
+      <w:r>
+        <w:t xml:space="preserve"> </w:t>
+      </w:r>
+      <w:r>
+        <w:t xml:space="preserve">our discipline has been up to for the past quarter-century</w:t>
       </w:r>
     </w:p>
     <w:p>
@@ -306,142 +441,59 @@
         <w:pStyle w:val="Compact"/>
         <w:numPr>
           <w:ilvl w:val="1"/>
-          <w:numId w:val="1003"/>
+          <w:numId w:val="1004"/>
         </w:numPr>
       </w:pPr>
       <w:r>
-        <w:t xml:space="preserve">What do we study?</w:t>
+        <w:t xml:space="preserve">Why is that a problem?</w:t>
       </w:r>
     </w:p>
     <w:p>
       <w:pPr>
         <w:pStyle w:val="Compact"/>
         <w:numPr>
-          <w:ilvl w:val="1"/>
-          <w:numId w:val="1003"/>
+          <w:ilvl w:val="2"/>
+          <w:numId w:val="1005"/>
         </w:numPr>
       </w:pPr>
       <w:r>
-        <w:t xml:space="preserve">When do we study it?</w:t>
+        <w:t xml:space="preserve">broad claims about consumer-technology research are currently difficult to evaluate against the field as a whole.</w:t>
       </w:r>
     </w:p>
     <w:p>
       <w:pPr>
         <w:pStyle w:val="Compact"/>
         <w:numPr>
-          <w:ilvl w:val="0"/>
-          <w:numId w:val="1002"/>
+          <w:ilvl w:val="2"/>
+          <w:numId w:val="1005"/>
         </w:numPr>
       </w:pPr>
       <w:r>
-        <w:t xml:space="preserve">Aim of this review article: By conducting a bibliometric and semantic corpus-analysis of seven leading journals in the marketing and consumer-behavior domain, this review article aims to provide an overview over the evolving landscape of empirical consumer-technology-research over the last 26 years.</w:t>
-      </w:r>
-    </w:p>
-    <w:p>
-      <w:pPr>
-        <w:pStyle w:val="FirstParagraph"/>
-      </w:pPr>
-      <w:r>
-        <w:t xml:space="preserve">Contribution</w:t>
+        <w:t xml:space="preserve">Existing reviews typically focus on salient technologies or bounded domains, making it unclear whether observed patterns represent the wider literature or only a selected research stream.</w:t>
       </w:r>
     </w:p>
     <w:p>
       <w:pPr>
         <w:pStyle w:val="Compact"/>
         <w:numPr>
-          <w:ilvl w:val="0"/>
-          <w:numId w:val="1004"/>
+          <w:ilvl w:val="2"/>
+          <w:numId w:val="1005"/>
         </w:numPr>
       </w:pPr>
       <w:r>
-        <w:t xml:space="preserve">Use novel methods to defragment a landscape</w:t>
+        <w:t xml:space="preserve">Without a common representation across technologies and time, researchers cannot reliably assess where academic attention is concentrated, how the field’s priorities have shifted, or whether an apparently emerging topic is situated near an established body of work.</w:t>
       </w:r>
     </w:p>
     <w:p>
       <w:pPr>
         <w:pStyle w:val="Compact"/>
         <w:numPr>
-          <w:ilvl w:val="0"/>
-          <w:numId w:val="1004"/>
-        </w:numPr>
-      </w:pPr>
-      <w:r>
-        <w:t xml:space="preserve">Disentangle academic interest temporally and overall over 26 years of research</w:t>
-      </w:r>
-    </w:p>
-    <w:p>
-      <w:pPr>
-        <w:pStyle w:val="Compact"/>
-        <w:numPr>
-          <w:ilvl w:val="0"/>
-          <w:numId w:val="1004"/>
-        </w:numPr>
-      </w:pPr>
-      <w:r>
-        <w:t xml:space="preserve">Compare academic focus against media discourse to identify if what we study is what matters to consumers</w:t>
-      </w:r>
-    </w:p>
-    <w:p>
-      <w:pPr>
-        <w:pStyle w:val="Compact"/>
-        <w:numPr>
-          <w:ilvl w:val="0"/>
-          <w:numId w:val="1004"/>
-        </w:numPr>
-      </w:pPr>
-      <w:r>
-        <w:t xml:space="preserve">Overall contribution: Show where we came from, what we are doing, and point towards what we could be doing in the future</w:t>
-      </w:r>
-    </w:p>
-    <w:bookmarkEnd w:id="23"/>
-    <w:bookmarkStart w:id="24" w:name="theoretical-background"/>
-    <w:p>
-      <w:pPr>
-        <w:pStyle w:val="Heading1"/>
-      </w:pPr>
-      <w:r>
-        <w:t xml:space="preserve">Theoretical Background</w:t>
-      </w:r>
-    </w:p>
-    <w:p>
-      <w:pPr>
-        <w:pStyle w:val="FirstParagraph"/>
-      </w:pPr>
-      <w:r>
-        <w:t xml:space="preserve">What do we mean, when we say, we study consumer-technologies</w:t>
-      </w:r>
-    </w:p>
-    <w:p>
-      <w:pPr>
-        <w:pStyle w:val="Compact"/>
-        <w:numPr>
-          <w:ilvl w:val="0"/>
+          <w:ilvl w:val="2"/>
           <w:numId w:val="1005"/>
         </w:numPr>
       </w:pPr>
       <w:r>
-        <w:t xml:space="preserve">Define technology as scientific knowledge and its application for firms or consumers that can influence value creation and exchange</w:t>
-      </w:r>
-      <w:r>
-        <w:t xml:space="preserve"> </w:t>
-      </w:r>
-      <w:r>
-        <w:t xml:space="preserve">[1]</w:t>
-      </w:r>
-      <w:r>
-        <w:t xml:space="preserve">.</w:t>
-      </w:r>
-    </w:p>
-    <w:p>
-      <w:pPr>
-        <w:pStyle w:val="Compact"/>
-        <w:numPr>
-          <w:ilvl w:val="0"/>
-          <w:numId w:val="1005"/>
-        </w:numPr>
-      </w:pPr>
-      <w:r>
-        <w:t xml:space="preserve">Define consumer-facing technologies as technologies that consumers directly use, encounter, or experience.</w:t>
+        <w:t xml:space="preserve">An integrated map therefore provides an empirical baseline for locating individual research streams and evaluating field-level claims about growth, prominence, and change.</w:t>
       </w:r>
     </w:p>
     <w:p>
@@ -449,16 +501,23 @@
         <w:pStyle w:val="FirstParagraph"/>
       </w:pPr>
       <w:r>
-        <w:t xml:space="preserve">Why can’t we just google-scholar</w:t>
-      </w:r>
-      <w:r>
-        <w:t xml:space="preserve"> </w:t>
-      </w:r>
-      <w:r>
-        <w:t xml:space="preserve">“consumer-tech”</w:t>
-      </w:r>
-      <w:r>
-        <w:t xml:space="preserve">?</w:t>
+        <w:t xml:space="preserve">Keeping track of consumer-technology research is particularly difficult because technology does not denote a stable or clearly bounded substantive domain. New technologies emerge rapidly, established technologies are renamed or absorbed into broader systems, and the same technology may be described at different levels of abstraction—for example, as artificial intelligence, a recommender system, a chatbot, or a specific application. Moreover, consumer-facing technologies often perform multiple functions and cut across established research domains such as retailing, services, communication, and consumer decision-making. Consequently, relevant studies are distributed across overlapping labels and research streams rather than organized within a single identifiable literature. This makes it difficult to determine the boundaries, composition, and development of consumer-technology research using conventional search and classification strategies.</w:t>
+      </w:r>
+    </w:p>
+    <w:p>
+      <w:pPr>
+        <w:pStyle w:val="BodyText"/>
+      </w:pPr>
+      <w:r>
+        <w:t xml:space="preserve">Objective 1: We therefore construct a bottom-up map that integrates this fragmented terminology and provides a common basis for examining which consumer-facing technologies have been studied and how academic attention to them has developed over time.</w:t>
+      </w:r>
+    </w:p>
+    <w:p>
+      <w:pPr>
+        <w:pStyle w:val="BodyText"/>
+      </w:pPr>
+      <w:r>
+        <w:t xml:space="preserve">Problem 2:</w:t>
       </w:r>
     </w:p>
     <w:p>
@@ -470,73 +529,7 @@
         </w:numPr>
       </w:pPr>
       <w:r>
-        <w:t xml:space="preserve">The problem with fragmentation: Hard to provide a comprehensive overview if you don’t know what is out there.</w:t>
-      </w:r>
-    </w:p>
-    <w:p>
-      <w:pPr>
-        <w:pStyle w:val="Compact"/>
-        <w:numPr>
-          <w:ilvl w:val="1"/>
-          <w:numId w:val="1007"/>
-        </w:numPr>
-      </w:pPr>
-      <w:r>
-        <w:t xml:space="preserve">jingle-jangle fallacy</w:t>
-      </w:r>
-    </w:p>
-    <w:p>
-      <w:pPr>
-        <w:pStyle w:val="Compact"/>
-        <w:numPr>
-          <w:ilvl w:val="1"/>
-          <w:numId w:val="1007"/>
-        </w:numPr>
-      </w:pPr>
-      <w:r>
-        <w:t xml:space="preserve">Without consolidating related labels, a field-level review may misrepresent both the size and the boundaries of research areas.</w:t>
-      </w:r>
-    </w:p>
-    <w:p>
-      <w:pPr>
-        <w:pStyle w:val="Compact"/>
-        <w:numPr>
-          <w:ilvl w:val="1"/>
-          <w:numId w:val="1007"/>
-        </w:numPr>
-      </w:pPr>
-      <w:r>
-        <w:t xml:space="preserve">we cannot say what areas have been studied how if we cannot even say what the areas are to begin with</w:t>
-      </w:r>
-    </w:p>
-    <w:p>
-      <w:pPr>
-        <w:pStyle w:val="Compact"/>
-        <w:numPr>
-          <w:ilvl w:val="1"/>
-          <w:numId w:val="1007"/>
-        </w:numPr>
-      </w:pPr>
-      <w:r>
-        <w:t xml:space="preserve">also tie into the superficial traps of comparing</w:t>
-      </w:r>
-      <w:r>
-        <w:t xml:space="preserve"> </w:t>
-      </w:r>
-      <w:r>
-        <w:t xml:space="preserve">“Chatgpt 4”</w:t>
-      </w:r>
-      <w:r>
-        <w:t xml:space="preserve"> </w:t>
-      </w:r>
-      <w:r>
-        <w:t xml:space="preserve">with</w:t>
-      </w:r>
-      <w:r>
-        <w:t xml:space="preserve"> </w:t>
-      </w:r>
-      <w:r>
-        <w:t xml:space="preserve">“4.1”</w:t>
+        <w:t xml:space="preserve">Academic attention is finite. Every technology that becomes a research object does so at the expense of others, so the distribution of attention across consumer-facing technologies is a substantive choice rather than a neutral by-product of individual research interests.</w:t>
       </w:r>
     </w:p>
     <w:p>
@@ -548,19 +541,47 @@
         </w:numPr>
       </w:pPr>
       <w:r>
-        <w:t xml:space="preserve">The problem with attention: It doesn’t only matter what we study, it also matters when, and how much. This is important because academic research is shaped by many factors</w:t>
-      </w:r>
-    </w:p>
-    <w:p>
-      <w:pPr>
-        <w:pStyle w:val="Compact"/>
-        <w:numPr>
-          <w:ilvl w:val="1"/>
-          <w:numId w:val="1008"/>
-        </w:numPr>
-      </w:pPr>
-      <w:r>
-        <w:t xml:space="preserve">reference tech-traps paper?</w:t>
+        <w:t xml:space="preserve">That choice has consequences outside the academy. Consumer-facing technologies reach large populations quickly, and their effects on consumers are frequently contested in public before they are examined empirically. The evidence available to regulators, consumer advocates, and policy makers at that moment is largely the evidence this field has chosen to produce. Where attention concentrates on a narrow set of technologies, the evidence base for the remainder stays thin precisely when it is called upon.</w:t>
+      </w:r>
+    </w:p>
+    <w:p>
+      <w:pPr>
+        <w:pStyle w:val="FirstParagraph"/>
+      </w:pPr>
+      <w:r>
+        <w:t xml:space="preserve">A second dynamic compounds this. Technologies do not necessarily lose relevance when they cease to be new, but they do become harder to see as research objects. As a technology is absorbed into ordinary consumption, it tends to be treated as the setting of a study rather than its subject: mobile-mediated shopping in 2005 is research on mobile technology, whereas the same behavior in 2024 may simply be research on shopping. Academic attention to a technology may therefore decline while its consumer reach continues to grow. Neither pattern—concentration or normalization—is detectable from the academic corpus alone, because both concern what the corpus does</w:t>
+      </w:r>
+      <w:r>
+        <w:t xml:space="preserve"> </w:t>
+      </w:r>
+      <w:r>
+        <w:rPr>
+          <w:i/>
+          <w:iCs/>
+        </w:rPr>
+        <w:t xml:space="preserve">not</w:t>
+      </w:r>
+      <w:r>
+        <w:t xml:space="preserve"> </w:t>
+      </w:r>
+      <w:r>
+        <w:t xml:space="preserve">contain. Assessing them requires an external reference point.</w:t>
+      </w:r>
+    </w:p>
+    <w:p>
+      <w:pPr>
+        <w:pStyle w:val="BodyText"/>
+      </w:pPr>
+      <w:r>
+        <w:t xml:space="preserve">Objective 2: To contextualize academic attention by comparing the prevalence and temporal development of academically identified consumer technologies with their coverage in U.S. national news media, and to identify technologies that carry substantial public visibility while receiving comparatively limited academic attention.</w:t>
+      </w:r>
+    </w:p>
+    <w:p>
+      <w:pPr>
+        <w:pStyle w:val="BodyText"/>
+      </w:pPr>
+      <w:r>
+        <w:t xml:space="preserve">Contribution:</w:t>
       </w:r>
     </w:p>
     <w:p>
@@ -568,31 +589,11 @@
         <w:pStyle w:val="Compact"/>
         <w:numPr>
           <w:ilvl w:val="0"/>
-          <w:numId w:val="1006"/>
+          <w:numId w:val="1007"/>
         </w:numPr>
       </w:pPr>
       <w:r>
-        <w:t xml:space="preserve">The problem with disconnect from the public discourse: Is the devotion to certain topics given by academics appropriate when looking at what</w:t>
-      </w:r>
-      <w:r>
-        <w:t xml:space="preserve"> </w:t>
-      </w:r>
-      <w:r>
-        <w:t xml:space="preserve">“real consumers out there”</w:t>
-      </w:r>
-      <w:r>
-        <w:t xml:space="preserve"> </w:t>
-      </w:r>
-      <w:r>
-        <w:t xml:space="preserve">are interested in?</w:t>
-      </w:r>
-    </w:p>
-    <w:p>
-      <w:pPr>
-        <w:pStyle w:val="FirstParagraph"/>
-      </w:pPr>
-      <w:r>
-        <w:t xml:space="preserve">Methodological Background</w:t>
+        <w:t xml:space="preserve">We provide the first integrated, bottom-up map of consumer-technology research across seven leading marketing and consumer-behavior journals over the past quarter-century. By consolidating fragmented and overlapping technology labels into a common semantic representation, we show which technologies have been studied, how they relate to one another, and where academic attention is concentrated. This provides an empirical baseline for evaluating claims about the growth, prominence, and structure of specific research streams against the field as a whole.</w:t>
       </w:r>
     </w:p>
     <w:p>
@@ -600,57 +601,30 @@
         <w:pStyle w:val="Compact"/>
         <w:numPr>
           <w:ilvl w:val="0"/>
-          <w:numId w:val="1009"/>
+          <w:numId w:val="1007"/>
         </w:numPr>
       </w:pPr>
       <w:r>
-        <w:t xml:space="preserve">Jingle jangle fallacy as an example of what we do</w:t>
-      </w:r>
-    </w:p>
-    <w:p>
-      <w:pPr>
-        <w:pStyle w:val="Compact"/>
-        <w:numPr>
-          <w:ilvl w:val="0"/>
-          <w:numId w:val="1009"/>
-        </w:numPr>
-      </w:pPr>
-      <w:r>
-        <w:t xml:space="preserve">bibliometric analysis as a way to map a field</w:t>
-      </w:r>
-      <w:r>
-        <w:t xml:space="preserve"> </w:t>
-      </w:r>
-      <w:r>
-        <w:t xml:space="preserve">[2,3, and others]</w:t>
-      </w:r>
-    </w:p>
-    <w:p>
-      <w:pPr>
-        <w:pStyle w:val="Compact"/>
-        <w:numPr>
-          <w:ilvl w:val="0"/>
-          <w:numId w:val="1009"/>
-        </w:numPr>
-      </w:pPr>
-      <w:r>
-        <w:t xml:space="preserve">semantic analysis and clustering, semantic topic modelling as a way to utilize language to organize large corpora of data into themes</w:t>
-      </w:r>
-      <w:r>
-        <w:t xml:space="preserve"> </w:t>
-      </w:r>
-      <w:r>
-        <w:t xml:space="preserve">[4]</w:t>
-      </w:r>
-    </w:p>
-    <w:bookmarkEnd w:id="24"/>
-    <w:bookmarkStart w:id="28" w:name="methods"/>
+        <w:t xml:space="preserve">We contextualize the allocation of academic attention by comparing academically identified technologies with their visibility in U.S. national news media. Because the evidence base available when a consumer technology becomes publicly contested is largely the one this field produces, systematic divergence between the two identifies technologies on which the field is generating more or less evidence than their public visibility would suggest. The comparison also provides an external check on technologies whose academic visibility declines as they become normalized, a pattern the academic corpus cannot reveal on its own.</w:t>
+      </w:r>
+    </w:p>
+    <w:bookmarkEnd w:id="23"/>
+    <w:bookmarkStart w:id="26" w:name="theoretical-background"/>
     <w:p>
       <w:pPr>
         <w:pStyle w:val="Heading1"/>
       </w:pPr>
       <w:r>
-        <w:t xml:space="preserve">Methods</w:t>
+        <w:t xml:space="preserve">2. Theoretical Background</w:t>
+      </w:r>
+    </w:p>
+    <w:bookmarkStart w:id="24" w:name="X619ecd5bbf2e57749a355082ff3f62b2834c864"/>
+    <w:p>
+      <w:pPr>
+        <w:pStyle w:val="Heading2"/>
+      </w:pPr>
+      <w:r>
+        <w:t xml:space="preserve">2.1 From Traditional Literature Reviews to A Map of Consumer Technology Research</w:t>
       </w:r>
     </w:p>
     <w:p>
@@ -658,22 +632,7 @@
         <w:pStyle w:val="FirstParagraph"/>
       </w:pPr>
       <w:r>
-        <w:t xml:space="preserve">To gain insights into these questions, we follow a bibliometric and semantic analysis</w:t>
-      </w:r>
-      <w:r>
-        <w:t xml:space="preserve"> </w:t>
-      </w:r>
-      <w:r>
-        <w:t xml:space="preserve">[see e.g., 5]</w:t>
-      </w:r>
-      <w:r>
-        <w:t xml:space="preserve"> </w:t>
-      </w:r>
-      <w:r>
-        <w:t xml:space="preserve">spanning across seven leading journals in the domain of marketing and consumer research:</w:t>
-      </w:r>
-      <w:r>
-        <w:t xml:space="preserve"> </w:t>
+        <w:t xml:space="preserve">A conventional approach to the question of which consumer-facing technologies have been studied in leading marketing journals—</w:t>
       </w:r>
       <w:r>
         <w:rPr>
@@ -761,13 +720,649 @@
         <w:t xml:space="preserve">Journal of Marketing</w:t>
       </w:r>
       <w:r>
+        <w:t xml:space="preserve">—over the past quarter-century would begin with a systematic literature review. Following the definition introduced above, we searched Scopus using general technology-related terms alongside established labels from prior research, including</w:t>
+      </w:r>
+      <w:r>
+        <w:t xml:space="preserve"> </w:t>
+      </w:r>
+      <w:r>
+        <w:rPr>
+          <w:i/>
+          <w:iCs/>
+        </w:rPr>
+        <w:t xml:space="preserve">smart products</w:t>
+      </w:r>
+      <w:r>
+        <w:t xml:space="preserve">,</w:t>
+      </w:r>
+      <w:r>
+        <w:t xml:space="preserve"> </w:t>
+      </w:r>
+      <w:r>
+        <w:rPr>
+          <w:i/>
+          <w:iCs/>
+        </w:rPr>
+        <w:t xml:space="preserve">smart devices</w:t>
+      </w:r>
+      <w:r>
+        <w:t xml:space="preserve">, and the</w:t>
+      </w:r>
+      <w:r>
+        <w:t xml:space="preserve"> </w:t>
+      </w:r>
+      <w:r>
+        <w:rPr>
+          <w:i/>
+          <w:iCs/>
+        </w:rPr>
+        <w:t xml:space="preserve">Internet of Things</w:t>
+      </w:r>
+      <w:r>
+        <w:t xml:space="preserve">. We screened the resulting records for empirical studies examining technologies that consumers directly use, encounter, or experience. For each included article, we coded the focal technology and iteratively consolidated related codes into higher-order categories based on their primary consumer-facing function. The complete search string, eligibility criteria, screening procedure, article-level decisions, and classification results are reported in Supplementary Materials</w:t>
+      </w:r>
+      <w:r>
+        <w:t xml:space="preserve"> </w:t>
+      </w:r>
+      <w:r>
+        <w:rPr>
+          <w:b/>
+          <w:bCs/>
+        </w:rPr>
+        <w:t xml:space="preserve">?@sec-prisma</w:t>
+      </w:r>
+      <w:r>
+        <w:t xml:space="preserve"> </w:t>
+      </w:r>
+      <w:r>
+        <w:t xml:space="preserve">following the PRISMA framework</w:t>
+      </w:r>
+      <w:r>
+        <w:t xml:space="preserve"> </w:t>
+      </w:r>
+      <w:r>
+        <w:t xml:space="preserve">[12]</w:t>
+      </w:r>
+      <w:r>
+        <w:t xml:space="preserve">. Of the</w:t>
+      </w:r>
+      <w:r>
+        <w:t xml:space="preserve"> </w:t>
+      </w:r>
+      <m:oMath>
+        <m:r>
+          <m:t>432</m:t>
+        </m:r>
+      </m:oMath>
+      <w:r>
+        <w:t xml:space="preserve"> </w:t>
+      </w:r>
+      <w:r>
+        <w:t xml:space="preserve">records identified,</w:t>
+      </w:r>
+      <w:r>
+        <w:t xml:space="preserve"> </w:t>
+      </w:r>
+      <m:oMath>
+        <m:r>
+          <m:t>182</m:t>
+        </m:r>
+      </m:oMath>
+      <w:r>
+        <w:t xml:space="preserve"> </w:t>
+      </w:r>
+      <w:r>
+        <w:t xml:space="preserve">met the inclusion criteria.</w:t>
+      </w:r>
+    </w:p>
+    <w:p>
+      <w:pPr>
+        <w:pStyle w:val="BodyText"/>
+      </w:pPr>
+      <w:r>
+        <w:t xml:space="preserve">This exercise illustrates both the usefulness and the limitations of a conventional systematic review for mapping a broad and evolving research domain. Most immediately, the relatively small number of included articles indicates that the search did not capture the full range of consumer-technology research published in the selected journals. This limitation cannot be resolved simply by adding more search terms. Any database query must be finite and therefore depends on the terminology that reviewers already associate with the domain. Although this constraint is generally manageable for a narrowly bounded substantive question, it creates a circularity when the objective is to map an entire field: researchers must already know which technologies belong to the field in order to construct the search intended to identify them. The resulting corpus is therefore particularly vulnerable to omissions of technologies described using unexpected, historically specific, or highly application-oriented terminology—that is, to</w:t>
+      </w:r>
+      <w:r>
+        <w:t xml:space="preserve"> </w:t>
+      </w:r>
+      <w:r>
+        <w:t xml:space="preserve">“unknown unknowns.”</w:t>
+      </w:r>
+    </w:p>
+    <w:p>
+      <w:pPr>
+        <w:pStyle w:val="BodyText"/>
+      </w:pPr>
+      <w:r>
+        <w:t xml:space="preserve">The categories produced by the review likewise reflect the conceptual literature used to define the search space.</w:t>
+      </w:r>
+      <w:r>
+        <w:t xml:space="preserve"> </w:t>
+      </w:r>
+      <w:r>
+        <w:t xml:space="preserve">[4]</w:t>
+      </w:r>
+      <w:r>
+        <w:t xml:space="preserve"> </w:t>
+      </w:r>
+      <w:r>
+        <w:t xml:space="preserve">foreground the ways in which technologies transform customer experiences across the customer journey;</w:t>
+      </w:r>
+      <w:r>
+        <w:t xml:space="preserve"> </w:t>
+      </w:r>
+      <w:r>
+        <w:t xml:space="preserve">[6]</w:t>
+      </w:r>
+      <w:r>
+        <w:t xml:space="preserve"> </w:t>
+      </w:r>
+      <w:r>
+        <w:t xml:space="preserve">examine evolving relationships among consumers and connected objects;</w:t>
+      </w:r>
+      <w:r>
+        <w:t xml:space="preserve"> </w:t>
+      </w:r>
+      <w:r>
+        <w:t xml:space="preserve">[7]</w:t>
+      </w:r>
+      <w:r>
+        <w:t xml:space="preserve"> </w:t>
+      </w:r>
+      <w:r>
+        <w:t xml:space="preserve">characterize technologies through the capabilities of smart products; and</w:t>
+      </w:r>
+      <w:r>
+        <w:t xml:space="preserve"> </w:t>
+      </w:r>
+      <w:r>
+        <w:t xml:space="preserve">[5]</w:t>
+      </w:r>
+      <w:r>
+        <w:t xml:space="preserve"> </w:t>
+      </w:r>
+      <w:r>
+        <w:t xml:space="preserve">organize artificial intelligence around the experiences it creates for consumers. These perspectives provide a theoretically appropriate foundation for marketing research, but they also direct attention toward technologies that can readily be understood in terms of service encounters, connected products, digital exchange, and customer journeys. Consistent with this emphasis,</w:t>
+      </w:r>
+      <w:r>
+        <w:t xml:space="preserve"> </w:t>
+      </w:r>
+      <w:r>
+        <w:rPr>
+          <w:i/>
+          <w:iCs/>
+        </w:rPr>
+        <w:t xml:space="preserve">E-Commerce &amp; Business</w:t>
+      </w:r>
+      <w:r>
+        <w:t xml:space="preserve"> </w:t>
+      </w:r>
+      <w:r>
+        <w:t xml:space="preserve">(</w:t>
+      </w:r>
+      <m:oMath>
+        <m:r>
+          <m:t>17</m:t>
+        </m:r>
+      </m:oMath>
+      <w:r>
+        <w:t xml:space="preserve"> </w:t>
+      </w:r>
+      <w:r>
+        <w:t xml:space="preserve">articles),</w:t>
+      </w:r>
+      <w:r>
+        <w:t xml:space="preserve"> </w:t>
+      </w:r>
+      <w:r>
+        <w:rPr>
+          <w:i/>
+          <w:iCs/>
+        </w:rPr>
+        <w:t xml:space="preserve">Financial Technologies</w:t>
+      </w:r>
+      <w:r>
+        <w:t xml:space="preserve"> </w:t>
+      </w:r>
+      <w:r>
+        <w:t xml:space="preserve">(</w:t>
+      </w:r>
+      <m:oMath>
+        <m:r>
+          <m:t>12</m:t>
+        </m:r>
+      </m:oMath>
+      <w:r>
+        <w:t xml:space="preserve">),</w:t>
+      </w:r>
+      <w:r>
+        <w:t xml:space="preserve"> </w:t>
+      </w:r>
+      <w:r>
+        <w:rPr>
+          <w:i/>
+          <w:iCs/>
+        </w:rPr>
+        <w:t xml:space="preserve">Service Technology</w:t>
+      </w:r>
+      <w:r>
+        <w:t xml:space="preserve"> </w:t>
+      </w:r>
+      <w:r>
+        <w:t xml:space="preserve">(</w:t>
+      </w:r>
+      <m:oMath>
+        <m:r>
+          <m:t>14</m:t>
+        </m:r>
+      </m:oMath>
+      <w:r>
+        <w:t xml:space="preserve">), and</w:t>
+      </w:r>
+      <w:r>
+        <w:t xml:space="preserve"> </w:t>
+      </w:r>
+      <w:r>
+        <w:rPr>
+          <w:i/>
+          <w:iCs/>
+        </w:rPr>
+        <w:t xml:space="preserve">Online Platforms</w:t>
+      </w:r>
+      <w:r>
+        <w:t xml:space="preserve"> </w:t>
+      </w:r>
+      <w:r>
+        <w:t xml:space="preserve">(</w:t>
+      </w:r>
+      <m:oMath>
+        <m:r>
+          <m:t>18</m:t>
+        </m:r>
+      </m:oMath>
+      <w:r>
+        <w:t xml:space="preserve">) jointly accounted for 61 of the 182 included articles, or approximately 34% of the corpus. Categories such as</w:t>
+      </w:r>
+      <w:r>
+        <w:t xml:space="preserve"> </w:t>
+      </w:r>
+      <w:r>
+        <w:rPr>
+          <w:i/>
+          <w:iCs/>
+        </w:rPr>
+        <w:t xml:space="preserve">AR &amp; VR</w:t>
+      </w:r>
+      <w:r>
+        <w:t xml:space="preserve"> </w:t>
+      </w:r>
+      <w:r>
+        <w:t xml:space="preserve">(</w:t>
+      </w:r>
+      <m:oMath>
+        <m:r>
+          <m:t>6</m:t>
+        </m:r>
+      </m:oMath>
+      <w:r>
+        <w:t xml:space="preserve">) and</w:t>
+      </w:r>
+      <w:r>
+        <w:t xml:space="preserve"> </w:t>
+      </w:r>
+      <w:r>
+        <w:rPr>
+          <w:i/>
+          <w:iCs/>
+        </w:rPr>
+        <w:t xml:space="preserve">Robots</w:t>
+      </w:r>
+      <w:r>
+        <w:t xml:space="preserve"> </w:t>
+      </w:r>
+      <w:r>
+        <w:t xml:space="preserve">(</w:t>
+      </w:r>
+      <m:oMath>
+        <m:r>
+          <m:t>6</m:t>
+        </m:r>
+      </m:oMath>
+      <w:r>
+        <w:t xml:space="preserve">) similarly reflect the presence of smart, connected, immersive, and interactive technologies in the literature informing the search. Other consumer-facing technologies may be absent not because they have not been studied, but because they were not described using terminology anticipated by the query. Of the 182 included articles, 23 (12.6%) could not be assigned to any of the farther-spanning categories derived from the conceptual literature and were coded as</w:t>
+      </w:r>
+      <w:r>
+        <w:t xml:space="preserve"> </w:t>
+      </w:r>
+      <w:r>
+        <w:rPr>
+          <w:i/>
+          <w:iCs/>
+        </w:rPr>
+        <w:t xml:space="preserve">Other</w:t>
+      </w:r>
+      <w:r>
+        <w:t xml:space="preserve">.</w:t>
+      </w:r>
+    </w:p>
+    <w:p>
+      <w:pPr>
+        <w:pStyle w:val="BodyText"/>
+      </w:pPr>
+      <w:r>
+        <w:t xml:space="preserve">The subsequent classification also revealed the difficulty of representing consumer technologies through mutually exclusive categories. Research on digital food-ordering kiosks</w:t>
+      </w:r>
+      <w:r>
+        <w:t xml:space="preserve"> </w:t>
+      </w:r>
+      <w:r>
+        <w:t xml:space="preserve">[13]</w:t>
+      </w:r>
+      <w:r>
+        <w:t xml:space="preserve">, for example, may be classified as research on a service technology, a mobile or communication technology, or an e-commerce application, depending on whether the classification prioritizes the consumer interface, the underlying device, or the firm’s transaction infrastructure. Such ambiguity is especially consequential in consumer-technology research because a single technology may perform several functions, operate across multiple stages of the customer journey, and shape consumer experiences through several mechanisms simultaneously. Although categorical ambiguity cannot be eliminated entirely, imposing a single classification may obscure substantively meaningful relationships between technologies and create sharper boundaries than are present in the underlying research landscape.</w:t>
+      </w:r>
+    </w:p>
+    <w:p>
+      <w:pPr>
+        <w:pStyle w:val="BodyText"/>
+      </w:pPr>
+      <w:r>
+        <w:t xml:space="preserve">These observations motivate an approach that combines established methods for corpus identification, semantic integration, and bibliometric field mapping rather than relying on any single technique. Three requirements follow from the limitations above.</w:t>
+      </w:r>
+    </w:p>
+    <w:p>
+      <w:pPr>
+        <w:pStyle w:val="BodyText"/>
+      </w:pPr>
+      <w:r>
+        <w:t xml:space="preserve">First, corpus identification must not depend on a predefined technological vocabulary, since that vocabulary is precisely what a field map should discover rather than assume. Screening every article published in the seven journals against explicit criteria, rather than querying a database with a finite set of terms, removes the circularity that produces</w:t>
+      </w:r>
+      <w:r>
+        <w:t xml:space="preserve"> </w:t>
+      </w:r>
+      <w:r>
+        <w:t xml:space="preserve">“unknown unknowns.”</w:t>
+      </w:r>
+    </w:p>
+    <w:p>
+      <w:pPr>
+        <w:pStyle w:val="BodyText"/>
+      </w:pPr>
+      <w:r>
+        <w:t xml:space="preserve">Second, the terminology retained from those articles must be integrated before it can be analyzed. Consumer technologies are described at varying levels of abstraction and under labels that differ linguistically while referring to the same object. Representing labels numerically allows such variants to be identified and consolidated, following work addressing jingle-jangle problems in scientific terminology</w:t>
+      </w:r>
+      <w:r>
+        <w:t xml:space="preserve"> </w:t>
+      </w:r>
+      <w:r>
+        <w:t xml:space="preserve">[14]</w:t>
+      </w:r>
+      <w:r>
+        <w:t xml:space="preserve">.</w:t>
+      </w:r>
+    </w:p>
+    <w:p>
+      <w:pPr>
+        <w:pStyle w:val="BodyText"/>
+      </w:pPr>
+      <w:r>
+        <w:t xml:space="preserve">Third, the resulting structure should not impose fully discrete boundaries. Because a single technology may perform several functions simultaneously, an organizing scheme should summarize the field into interpretable groups while preserving information about similarity, overlap, and gradual transition between them. Cluster membership is then an analytical simplification of a continuous semantic landscape rather than evidence that consumer technologies form naturally distinct categories.</w:t>
+      </w:r>
+    </w:p>
+    <w:p>
+      <w:pPr>
+        <w:pStyle w:val="BodyText"/>
+      </w:pPr>
+      <w:r>
+        <w:t xml:space="preserve">Bibliometric analyses are well established as tools for mapping scientific fields and identifying patterns in publication activity</w:t>
+      </w:r>
+      <w:r>
+        <w:t xml:space="preserve"> </w:t>
+      </w:r>
+      <w:r>
+        <w:t xml:space="preserve">[15,16]</w:t>
+      </w:r>
+      <w:r>
+        <w:t xml:space="preserve">, but their conclusions remain conditional on the records included in the underlying corpus. Placing broad article screening and semantic terminology integration before the bibliometric analysis therefore enables a more comprehensive identification of the relevant literature, a less rigid representation of its conceptual boundaries, and a systematic analysis of how academic attention has developed since 2000. We return to the coverage of the conventional review reported above in Section</w:t>
+      </w:r>
+      <w:r>
+        <w:t xml:space="preserve"> </w:t>
+      </w:r>
+      <w:hyperlink w:anchor="results">
+        <w:r>
+          <w:rPr>
+            <w:rStyle w:val="Hyperlink"/>
+          </w:rPr>
+          <w:t xml:space="preserve">Results</w:t>
+        </w:r>
+      </w:hyperlink>
+      <w:r>
+        <w:t xml:space="preserve">, where we compare it directly against the corpus obtained this way.</w:t>
+      </w:r>
+    </w:p>
+    <w:bookmarkEnd w:id="24"/>
+    <w:bookmarkStart w:id="25" w:name="X11cdaa7ed06a82c1f5a1e8905ad2ceb56463ad0"/>
+    <w:p>
+      <w:pPr>
+        <w:pStyle w:val="Heading2"/>
+      </w:pPr>
+      <w:r>
+        <w:t xml:space="preserve">2.2 Mapping Academic Literature Against Media Attention</w:t>
+      </w:r>
+    </w:p>
+    <w:p>
+      <w:pPr>
+        <w:pStyle w:val="FirstParagraph"/>
+      </w:pPr>
+      <w:r>
+        <w:t xml:space="preserve">Attention is a scarce resource in public discourse, and news media allocate it selectively. Agenda-setting research has long established that the prominence a topic receives in news coverage corresponds closely to the prominence it acquires in public awareness</w:t>
+      </w:r>
+      <w:r>
+        <w:t xml:space="preserve"> </w:t>
+      </w:r>
+      <w:r>
+        <w:t xml:space="preserve">[17]</w:t>
+      </w:r>
+      <w:r>
+        <w:t xml:space="preserve">. News coverage is therefore not a direct measure of adoption, use, or societal importance, but it is a defensible indicator of which objects were publicly visible at a given time, and in what volume relative to one another. This logic has also been adopted in consumer research (see for example</w:t>
+      </w:r>
+      <w:r>
+        <w:t xml:space="preserve"> </w:t>
+      </w:r>
+      <w:r>
+        <w:t xml:space="preserve">[18]</w:t>
+      </w:r>
+      <w:r>
+        <w:t xml:space="preserve">;</w:t>
+      </w:r>
+      <w:r>
+        <w:t xml:space="preserve"> </w:t>
+      </w:r>
+      <w:r>
+        <w:t xml:space="preserve">[19]</w:t>
+      </w:r>
+      <w:r>
+        <w:t xml:space="preserve">). Closest to our own comparison,</w:t>
+      </w:r>
+      <w:r>
+        <w:t xml:space="preserve"> </w:t>
+      </w:r>
+      <w:r>
+        <w:t xml:space="preserve">[20]</w:t>
+      </w:r>
+      <w:r>
+        <w:t xml:space="preserve"> </w:t>
+      </w:r>
+      <w:r>
+        <w:t xml:space="preserve">benchmark the topical composition of academic marketing articles against the topics appearing in practitioner outlets, and use the resulting mismatch as evidence that academic and applied agendas have partially decoupled. We extend that logic in two respects: our benchmark corpus is general national news rather than trade publications, which shifts the reference point from managerial to public attention; and our unit of comparison is the technology itself rather than the topic of the article.</w:t>
+      </w:r>
+    </w:p>
+    <w:p>
+      <w:pPr>
+        <w:pStyle w:val="BodyText"/>
+      </w:pPr>
+      <w:r>
+        <w:t xml:space="preserve">The allocation of academic attention across technologies is consequential, and editorials in the field’s leading outlets have argued repeatedly that it should be evaluated against conditions outside the academy rather than against internal disciplinary convention</w:t>
+      </w:r>
+      <w:r>
+        <w:t xml:space="preserve"> </w:t>
+      </w:r>
+      <w:r>
+        <w:t xml:space="preserve">[21]</w:t>
+      </w:r>
+      <w:r>
+        <w:t xml:space="preserve">, and that the field has been slow to direct attention toward the questions its own members consider consequential</w:t>
+      </w:r>
+      <w:r>
+        <w:t xml:space="preserve"> </w:t>
+      </w:r>
+      <w:r>
+        <w:t xml:space="preserve">[22]</w:t>
+      </w:r>
+      <w:r>
+        <w:t xml:space="preserve">. Consumer-facing technologies are a case where this concern is unusually sharp: they reach large populations quickly, their effects on consumers are often contested in public before they are examined empirically, and the evidence base available to regulators and consumer advocates is largely the one the field chooses to produce. Where academic and public attention diverge substantially and persistently, the divergence identifies technologies on which the field is producing either more or less evidence than their public visibility would suggest.</w:t>
+      </w:r>
+    </w:p>
+    <w:p>
+      <w:pPr>
+        <w:pStyle w:val="BodyText"/>
+      </w:pPr>
+      <w:r>
+        <w:t xml:space="preserve">We treat the comparison as descriptive rather than normative, for two reasons. First, media visibility reflects news values—novelty, conflict, and event structure—as much as it reflects consumer relevance, so neither corpus constitutes a benchmark for the other. Second, the publication date of an academic article is separated from the decision to study a technology by a review process that in the social sciences routinely spans multiple years</w:t>
+      </w:r>
+      <w:r>
+        <w:t xml:space="preserve"> </w:t>
+      </w:r>
+      <w:r>
+        <w:t xml:space="preserve">[23]</w:t>
+      </w:r>
+      <w:r>
+        <w:t xml:space="preserve">, and that has lengthened substantially over recent decades, largely through the expansion of revision requirements</w:t>
+      </w:r>
+      <w:r>
+        <w:t xml:space="preserve"> </w:t>
+      </w:r>
+      <w:r>
+        <w:t xml:space="preserve">[24]</w:t>
+      </w:r>
+      <w:r>
+        <w:t xml:space="preserve">.</w:t>
+      </w:r>
+    </w:p>
+    <w:bookmarkEnd w:id="25"/>
+    <w:bookmarkEnd w:id="26"/>
+    <w:bookmarkStart w:id="35" w:name="methods"/>
+    <w:p>
+      <w:pPr>
+        <w:pStyle w:val="Heading1"/>
+      </w:pPr>
+      <w:r>
+        <w:t xml:space="preserve">3. Methods</w:t>
+      </w:r>
+    </w:p>
+    <w:p>
+      <w:pPr>
+        <w:pStyle w:val="FirstParagraph"/>
+      </w:pPr>
+      <w:r>
+        <w:t xml:space="preserve">Our core corpus spans across seven leading journals in the domain of marketing and consumer research:</w:t>
+      </w:r>
+      <w:r>
+        <w:t xml:space="preserve"> </w:t>
+      </w:r>
+      <w:r>
+        <w:rPr>
+          <w:i/>
+          <w:iCs/>
+        </w:rPr>
+        <w:t xml:space="preserve">Journal of Consumer Research</w:t>
+      </w:r>
+      <w:r>
+        <w:t xml:space="preserve">,</w:t>
+      </w:r>
+      <w:r>
+        <w:t xml:space="preserve"> </w:t>
+      </w:r>
+      <w:r>
+        <w:rPr>
+          <w:i/>
+          <w:iCs/>
+        </w:rPr>
+        <w:t xml:space="preserve">Marketing Science</w:t>
+      </w:r>
+      <w:r>
+        <w:t xml:space="preserve">,</w:t>
+      </w:r>
+      <w:r>
+        <w:t xml:space="preserve"> </w:t>
+      </w:r>
+      <w:r>
+        <w:rPr>
+          <w:i/>
+          <w:iCs/>
+        </w:rPr>
+        <w:t xml:space="preserve">International Journal of Research in Marketing</w:t>
+      </w:r>
+      <w:r>
+        <w:t xml:space="preserve">,</w:t>
+      </w:r>
+      <w:r>
+        <w:t xml:space="preserve"> </w:t>
+      </w:r>
+      <w:r>
+        <w:rPr>
+          <w:i/>
+          <w:iCs/>
+        </w:rPr>
+        <w:t xml:space="preserve">Journal of Marketing Research</w:t>
+      </w:r>
+      <w:r>
+        <w:t xml:space="preserve">,</w:t>
+      </w:r>
+      <w:r>
+        <w:t xml:space="preserve"> </w:t>
+      </w:r>
+      <w:r>
+        <w:rPr>
+          <w:i/>
+          <w:iCs/>
+        </w:rPr>
+        <w:t xml:space="preserve">Journal of the Academy of Marketing Science</w:t>
+      </w:r>
+      <w:r>
+        <w:t xml:space="preserve">,</w:t>
+      </w:r>
+      <w:r>
+        <w:t xml:space="preserve"> </w:t>
+      </w:r>
+      <w:r>
+        <w:rPr>
+          <w:i/>
+          <w:iCs/>
+        </w:rPr>
+        <w:t xml:space="preserve">Journal of Consumer Psychology</w:t>
+      </w:r>
+      <w:r>
+        <w:t xml:space="preserve">, and</w:t>
+      </w:r>
+      <w:r>
+        <w:t xml:space="preserve"> </w:t>
+      </w:r>
+      <w:r>
+        <w:rPr>
+          <w:i/>
+          <w:iCs/>
+        </w:rPr>
+        <w:t xml:space="preserve">Journal of Marketing</w:t>
+      </w:r>
+      <w:r>
         <w:t xml:space="preserve">. As our approach specifically follows a bottom-up, iterative identification of consumer-facing technologies, we included all articles published in these journals between January 1, 2000; and June 30, 2026, which we then screened with a two-phase process utilizing a large language model to identify articles discussing a consumer-facing technology based on their title and abstract. We then standardized the identified technology terms and represented them as semantic embeddings. We reduced the resulting high-dimensional representations using UMAP</w:t>
       </w:r>
       <w:r>
         <w:t xml:space="preserve"> </w:t>
       </w:r>
       <w:r>
-        <w:t xml:space="preserve">[6]</w:t>
+        <w:t xml:space="preserve">[25]</w:t>
       </w:r>
       <w:r>
         <w:t xml:space="preserve">, grouped semantically related terms into 16 technology clusters using k-means clustering</w:t>
@@ -776,19 +1371,19 @@
         <w:t xml:space="preserve"> </w:t>
       </w:r>
       <w:r>
-        <w:t xml:space="preserve">[7]</w:t>
+        <w:t xml:space="preserve">[26]</w:t>
       </w:r>
       <w:r>
         <w:t xml:space="preserve">, and examined both the overall composition of these clusters and changes in their prevalence over time.</w:t>
       </w:r>
     </w:p>
-    <w:bookmarkStart w:id="25" w:name="article-identification"/>
+    <w:bookmarkStart w:id="28" w:name="article-identification"/>
     <w:p>
       <w:pPr>
         <w:pStyle w:val="Heading2"/>
       </w:pPr>
       <w:r>
-        <w:t xml:space="preserve">Article Identification</w:t>
+        <w:t xml:space="preserve">3.1 Article Identification</w:t>
       </w:r>
     </w:p>
     <w:p>
@@ -892,7 +1487,7 @@
         <w:t xml:space="preserve"> </w:t>
       </w:r>
       <w:r>
-        <w:t xml:space="preserve">[2]</w:t>
+        <w:t xml:space="preserve">[15]</w:t>
       </w:r>
       <w:r>
         <w:t xml:space="preserve">, we retained</w:t>
@@ -946,7 +1541,7 @@
         <w:t xml:space="preserve"> </w:t>
       </w:r>
       <w:r>
-        <w:t xml:space="preserve">[8]</w:t>
+        <w:t xml:space="preserve">[27]</w:t>
       </w:r>
       <w:r>
         <w:t xml:space="preserve">) pipeline to identify technology discussions from titles and abstracts. Following Hoffman et al.</w:t>
@@ -955,7 +1550,7 @@
         <w:t xml:space="preserve"> </w:t>
       </w:r>
       <w:r>
-        <w:t xml:space="preserve">[1]</w:t>
+        <w:t xml:space="preserve">[3]</w:t>
       </w:r>
       <w:r>
         <w:t xml:space="preserve">, we define technologies as</w:t>
@@ -1049,7 +1644,7 @@
         <w:t xml:space="preserve"> </w:t>
       </w:r>
       <w:r>
-        <w:t xml:space="preserve">[8]</w:t>
+        <w:t xml:space="preserve">[27]</w:t>
       </w:r>
       <w:r>
         <w:t xml:space="preserve">) was instructed to assess if an article does</w:t>
@@ -1250,7 +1845,7 @@
         <w:pStyle w:val="BodyText"/>
       </w:pPr>
       <w:r>
-        <w:t xml:space="preserve">In the second phase, we then evaluated each technology mention on whether it constituted a consumer-facing technology; and whether the corresponding article was empirical. We define consumer-facing technologies as technologies that consumers directly use, encounter, or experience. We define empirical articles as articles that analyze data, including experimental, survey, observational, archival, or large-scale digital data. Of the</w:t>
+        <w:t xml:space="preserve">In the second phase, we then evaluated each technology mention on whether it constituted a consumer-facing technology; and whether the corresponding article was empirical. Of the</w:t>
       </w:r>
       <w:r>
         <w:t xml:space="preserve"> </w:t>
@@ -1415,7 +2010,7 @@
       <w:r>
         <w:t xml:space="preserve"> </w:t>
       </w:r>
-      <w:hyperlink w:anchor="sec-academic-corpus">
+      <w:hyperlink r:id="rId27">
         <w:r>
           <w:rPr>
             <w:rStyle w:val="Hyperlink"/>
@@ -1430,14 +2025,14 @@
         <w:t xml:space="preserve">.</w:t>
       </w:r>
     </w:p>
-    <w:bookmarkEnd w:id="25"/>
-    <w:bookmarkStart w:id="26" w:name="standardizing-technology-terms"/>
+    <w:bookmarkEnd w:id="28"/>
+    <w:bookmarkStart w:id="29" w:name="standardizing-technology-terms"/>
     <w:p>
       <w:pPr>
         <w:pStyle w:val="Heading2"/>
       </w:pPr>
       <w:r>
-        <w:t xml:space="preserve">Standardizing Technology Terms</w:t>
+        <w:t xml:space="preserve">3.2 Standardizing Technology Terms</w:t>
       </w:r>
     </w:p>
     <w:p>
@@ -1489,7 +2084,7 @@
         <w:t xml:space="preserve"> </w:t>
       </w:r>
       <w:r>
-        <w:t xml:space="preserve">[9–11]</w:t>
+        <w:t xml:space="preserve">[28–30]</w:t>
       </w:r>
       <w:r>
         <w:t xml:space="preserve">. We merged terms with a cosine similarity of at least .90, yielding</w:t>
@@ -1509,14 +2104,14 @@
         <w:t xml:space="preserve">canonical technologies. All subsequent analyses were performed on these 901 technologies.</w:t>
       </w:r>
     </w:p>
-    <w:bookmarkEnd w:id="26"/>
-    <w:bookmarkStart w:id="27" w:name="clustering-technology-terms"/>
+    <w:bookmarkEnd w:id="29"/>
+    <w:bookmarkStart w:id="31" w:name="clustering-technology-terms"/>
     <w:p>
       <w:pPr>
         <w:pStyle w:val="Heading2"/>
       </w:pPr>
       <w:r>
-        <w:t xml:space="preserve">Clustering Technology Terms</w:t>
+        <w:t xml:space="preserve">3.3 Clustering Technology Terms</w:t>
       </w:r>
     </w:p>
     <w:p>
@@ -1530,7 +2125,7 @@
         <w:t xml:space="preserve"> </w:t>
       </w:r>
       <w:r>
-        <w:t xml:space="preserve">[see 6]</w:t>
+        <w:t xml:space="preserve">[see 25]</w:t>
       </w:r>
       <w:r>
         <w:t xml:space="preserve">. We then applied k-means clustering</w:t>
@@ -1539,7 +2134,7 @@
         <w:t xml:space="preserve"> </w:t>
       </w:r>
       <w:r>
-        <w:t xml:space="preserve">[7]</w:t>
+        <w:t xml:space="preserve">[26]</w:t>
       </w:r>
       <w:r>
         <w:t xml:space="preserve"> </w:t>
@@ -1634,7 +2229,7 @@
       <w:r>
         <w:t xml:space="preserve"> </w:t>
       </w:r>
-      <w:hyperlink w:anchor="sec-technology-clustering">
+      <w:hyperlink r:id="rId30">
         <w:r>
           <w:rPr>
             <w:rStyle w:val="Hyperlink"/>
@@ -1652,20 +2247,343 @@
         <w:t xml:space="preserve">report all comparisons evaluated across embedding models, cluster solutions, and similarity thresholds for deduplication.</w:t>
       </w:r>
     </w:p>
-    <w:bookmarkEnd w:id="27"/>
-    <w:bookmarkEnd w:id="28"/>
-    <w:bookmarkStart w:id="42" w:name="results"/>
+    <w:bookmarkEnd w:id="31"/>
+    <w:bookmarkStart w:id="34" w:name="comparing-against-media-mentions"/>
+    <w:p>
+      <w:pPr>
+        <w:pStyle w:val="Heading2"/>
+      </w:pPr>
+      <w:r>
+        <w:t xml:space="preserve">3.4 Comparing Against Media Mentions</w:t>
+      </w:r>
+    </w:p>
+    <w:p>
+      <w:pPr>
+        <w:pStyle w:val="FirstParagraph"/>
+      </w:pPr>
+      <w:r>
+        <w:t xml:space="preserve">The academic corpus presented captures how consumer-facing technologies are selected and studied within marketing and consumer-behavior research. It does however not reveal whether these patterns correspond to the technologies receiving attention outside academia. We therefore turn to media coverage as a complementary representation of attention to consumer-facing technologies and compare the prevalence and development of the technology clusters across the two domains.</w:t>
+      </w:r>
+    </w:p>
+    <w:p>
+      <w:pPr>
+        <w:pStyle w:val="BodyText"/>
+      </w:pPr>
+      <w:r>
+        <w:t xml:space="preserve">To place the academic map in a broader context, we examined U.S. news coverage of the 901 canonical technologies using the Media Cloud API</w:t>
+      </w:r>
+      <w:r>
+        <w:t xml:space="preserve"> </w:t>
+      </w:r>
+      <w:r>
+        <w:t xml:space="preserve">[31,32]</w:t>
+      </w:r>
+      <w:r>
+        <w:t xml:space="preserve">. We searched the</w:t>
+      </w:r>
+      <w:r>
+        <w:t xml:space="preserve"> </w:t>
+      </w:r>
+      <w:r>
+        <w:rPr>
+          <w:i/>
+          <w:iCs/>
+        </w:rPr>
+        <w:t xml:space="preserve">United States–National</w:t>
+      </w:r>
+      <w:r>
+        <w:t xml:space="preserve"> </w:t>
+      </w:r>
+      <w:r>
+        <w:t xml:space="preserve">collection, comprising 247 national U.S. news sources, from January 1, 2000, through June 30, 2026, querying these 247 media sources for mentions of each of the 901 identified technologies discussed in academic discourse. Across the full collection, we identified</w:t>
+      </w:r>
+      <w:r>
+        <w:t xml:space="preserve"> </w:t>
+      </w:r>
+      <m:oMath>
+        <m:r>
+          <m:t>n</m:t>
+        </m:r>
+        <m:r>
+          <m:rPr>
+            <m:sty m:val="p"/>
+          </m:rPr>
+          <m:t>=</m:t>
+        </m:r>
+        <m:r>
+          <m:t>4</m:t>
+        </m:r>
+        <m:r>
+          <m:rPr>
+            <m:sty m:val="p"/>
+          </m:rPr>
+          <m:t>,</m:t>
+        </m:r>
+        <m:r>
+          <m:t>714</m:t>
+        </m:r>
+        <m:r>
+          <m:rPr>
+            <m:sty m:val="p"/>
+          </m:rPr>
+          <m:t>,</m:t>
+        </m:r>
+        <m:r>
+          <m:t>445</m:t>
+        </m:r>
+      </m:oMath>
+      <w:r>
+        <w:t xml:space="preserve"> </w:t>
+      </w:r>
+      <w:r>
+        <w:t xml:space="preserve">technology mentions from</w:t>
+      </w:r>
+      <w:r>
+        <w:t xml:space="preserve"> </w:t>
+      </w:r>
+      <m:oMath>
+        <m:r>
+          <m:t>n</m:t>
+        </m:r>
+        <m:r>
+          <m:rPr>
+            <m:sty m:val="p"/>
+          </m:rPr>
+          <m:t>=</m:t>
+        </m:r>
+        <m:r>
+          <m:t>4</m:t>
+        </m:r>
+        <m:r>
+          <m:rPr>
+            <m:sty m:val="p"/>
+          </m:rPr>
+          <m:t>,</m:t>
+        </m:r>
+        <m:r>
+          <m:t>074</m:t>
+        </m:r>
+        <m:r>
+          <m:rPr>
+            <m:sty m:val="p"/>
+          </m:rPr>
+          <m:t>,</m:t>
+        </m:r>
+        <m:r>
+          <m:t>851</m:t>
+        </m:r>
+      </m:oMath>
+      <w:r>
+        <w:t xml:space="preserve"> </w:t>
+      </w:r>
+      <w:r>
+        <w:t xml:space="preserve">unique articles (for details on the full media coverage analysis, see</w:t>
+      </w:r>
+      <w:r>
+        <w:t xml:space="preserve"> </w:t>
+      </w:r>
+      <w:hyperlink r:id="rId32">
+        <w:r>
+          <w:rPr>
+            <w:rStyle w:val="Hyperlink"/>
+          </w:rPr>
+          <w:t xml:space="preserve">supplementary materials D</w:t>
+        </w:r>
+      </w:hyperlink>
+      <w:r>
+        <w:t xml:space="preserve">supplementary materials D</w:t>
+      </w:r>
+      <w:r>
+        <w:t xml:space="preserve">). Because Media Cloud coverage is sparse before 2008, we restricted subsequently reported comparative analyses to the time period between January 2008 and June 2026.</w:t>
+      </w:r>
+    </w:p>
+    <w:p>
+      <w:pPr>
+        <w:pStyle w:val="BodyText"/>
+      </w:pPr>
+      <w:r>
+        <w:t xml:space="preserve">To examine whether these differences reflect temporal differences in academic and media discourse, we correlated their annual attention shares across lags from −5 to +5 years on both bases (for details on the method and results for individual technologies on both bases, see</w:t>
+      </w:r>
+      <w:r>
+        <w:t xml:space="preserve"> </w:t>
+      </w:r>
+      <w:hyperlink r:id="rId33">
+        <w:r>
+          <w:rPr>
+            <w:rStyle w:val="Hyperlink"/>
+          </w:rPr>
+          <w:t xml:space="preserve">supplementary materials E</w:t>
+        </w:r>
+      </w:hyperlink>
+      <w:r>
+        <w:t xml:space="preserve">supplementary materials E</w:t>
+      </w:r>
+      <w:r>
+        <w:t xml:space="preserve">).</w:t>
+      </w:r>
+    </w:p>
+    <w:bookmarkEnd w:id="34"/>
+    <w:bookmarkEnd w:id="35"/>
+    <w:bookmarkStart w:id="49" w:name="results"/>
     <w:p>
       <w:pPr>
         <w:pStyle w:val="Heading1"/>
       </w:pPr>
       <w:r>
-        <w:t xml:space="preserve">Results</w:t>
+        <w:t xml:space="preserve">4. Results</w:t>
       </w:r>
     </w:p>
     <w:p>
       <w:pPr>
         <w:pStyle w:val="FirstParagraph"/>
+      </w:pPr>
+      <w:r>
+        <w:t xml:space="preserve">The conventional review identified</w:t>
+      </w:r>
+      <w:r>
+        <w:t xml:space="preserve"> </w:t>
+      </w:r>
+      <m:oMath>
+        <m:r>
+          <m:t>182</m:t>
+        </m:r>
+      </m:oMath>
+      <w:r>
+        <w:t xml:space="preserve"> </w:t>
+      </w:r>
+      <w:r>
+        <w:t xml:space="preserve">empirical articles; the bottom-up procedure identified</w:t>
+      </w:r>
+      <w:r>
+        <w:t xml:space="preserve"> </w:t>
+      </w:r>
+      <m:oMath>
+        <m:r>
+          <m:t>1</m:t>
+        </m:r>
+        <m:r>
+          <m:rPr>
+            <m:sty m:val="p"/>
+          </m:rPr>
+          <m:t>,</m:t>
+        </m:r>
+        <m:r>
+          <m:t>102</m:t>
+        </m:r>
+      </m:oMath>
+      <w:r>
+        <w:t xml:space="preserve"> </w:t>
+      </w:r>
+      <w:r>
+        <w:t xml:space="preserve">from the same seven journals over the same period, recovering</w:t>
+      </w:r>
+      <w:r>
+        <w:t xml:space="preserve"> </w:t>
+      </w:r>
+      <m:oMath>
+        <m:r>
+          <m:t>176</m:t>
+        </m:r>
+      </m:oMath>
+      <w:r>
+        <w:t xml:space="preserve"> </w:t>
+      </w:r>
+      <w:r>
+        <w:t xml:space="preserve">of the</w:t>
+      </w:r>
+      <w:r>
+        <w:t xml:space="preserve"> </w:t>
+      </w:r>
+      <m:oMath>
+        <m:r>
+          <m:t>182</m:t>
+        </m:r>
+      </m:oMath>
+      <w:r>
+        <w:t xml:space="preserve">. The shortfall is not distributed evenly: three of the 16 clusters—</w:t>
+      </w:r>
+      <w:r>
+        <w:rPr>
+          <w:i/>
+          <w:iCs/>
+        </w:rPr>
+        <w:t xml:space="preserve">[NAME]</w:t>
+      </w:r>
+      <w:r>
+        <w:t xml:space="preserve">,</w:t>
+      </w:r>
+      <w:r>
+        <w:t xml:space="preserve"> </w:t>
+      </w:r>
+      <w:r>
+        <w:rPr>
+          <w:i/>
+          <w:iCs/>
+        </w:rPr>
+        <w:t xml:space="preserve">[NAME]</w:t>
+      </w:r>
+      <w:r>
+        <w:t xml:space="preserve">, and</w:t>
+      </w:r>
+      <w:r>
+        <w:t xml:space="preserve"> </w:t>
+      </w:r>
+      <w:r>
+        <w:rPr>
+          <w:i/>
+          <w:iCs/>
+        </w:rPr>
+        <w:t xml:space="preserve">[NAME]</w:t>
+      </w:r>
+      <w:r>
+        <w:t xml:space="preserve">—contain fewer than five articles from the conventional corpus. Of the</w:t>
+      </w:r>
+      <w:r>
+        <w:t xml:space="preserve"> </w:t>
+      </w:r>
+      <m:oMath>
+        <m:r>
+          <m:t>23</m:t>
+        </m:r>
+      </m:oMath>
+      <w:r>
+        <w:t xml:space="preserve"> </w:t>
+      </w:r>
+      <w:r>
+        <w:t xml:space="preserve">technologies that the conventional review could not assign to any higher-order category,</w:t>
+      </w:r>
+      <w:r>
+        <w:t xml:space="preserve"> </w:t>
+      </w:r>
+      <m:oMath>
+        <m:r>
+          <m:t>14</m:t>
+        </m:r>
+      </m:oMath>
+      <w:r>
+        <w:t xml:space="preserve"> </w:t>
+      </w:r>
+      <w:r>
+        <w:t xml:space="preserve">were placed within one of the 16 clusters, whereas</w:t>
+      </w:r>
+      <w:r>
+        <w:t xml:space="preserve"> </w:t>
+      </w:r>
+      <m:oMath>
+        <m:r>
+          <m:t>9</m:t>
+        </m:r>
+      </m:oMath>
+      <w:r>
+        <w:t xml:space="preserve"> </w:t>
+      </w:r>
+      <w:r>
+        <w:t xml:space="preserve">[SEE NOTE]. Both corpora nonetheless describe the same temporal development, which supports the convergent validity of the two approaches: articles on consumer-facing technologies increase sharply after 2013, with 25.3% of the conventional corpus and 24.8% of the bottom-up corpus published before 2014. The two approaches therefore agree on the shape of the field’s growth while differing substantially in the breadth of technologies they recover.</w:t>
+      </w:r>
+    </w:p>
+    <w:p>
+      <w:pPr>
+        <w:pStyle w:val="BodyText"/>
       </w:pPr>
       <w:hyperlink w:anchor="fig-technology-map">
         <w:r>
@@ -1696,7 +2614,15 @@
         <w:t xml:space="preserve"> </w:t>
       </w:r>
       <w:r>
-        <w:t xml:space="preserve">reports all individual technologies and their assignment to the 16 clusters. Clusters occupy recognizable thematic regions, although the transitions between them are gradual rather than sharply defined, demonstrating the reality of consumer-technology research that categories of consumer-technologies overlap and many technologies under studies may arguably fall under several higher-order clusters depending on the context. The number of academic articles assigned to each cluster is uneven across the 16 technology clusters, visualizing the concentration academic attention in some parts of the technological landscape, whereas other areas receive comparatively less attention.</w:t>
+        <w:t xml:space="preserve">reports all individual technologies and their assignment to the 16 clusters. Clusters occupy recognizable thematic regions, although the transitions between them are gradual rather than sharply defined, demonstrating the reality of consumer-technology research that categories of consumer-technologies overlap and many technologies under studies may arguably fall under several higher-order clusters depending on the context.</w:t>
+      </w:r>
+    </w:p>
+    <w:p>
+      <w:pPr>
+        <w:pStyle w:val="BodyText"/>
+      </w:pPr>
+      <w:r>
+        <w:t xml:space="preserve">The number of academic articles assigned to each cluster is uneven across the 16 technology clusters, visualizing the concentration academic attention in some parts of the technological landscape, whereas other areas receive comparatively less attention.</w:t>
       </w:r>
       <w:r>
         <w:t xml:space="preserve"> </w:t>
@@ -1910,7 +2836,7 @@
       <w:tr>
         <w:tc>
           <w:tcPr/>
-          <w:bookmarkStart w:id="32" w:name="fig-technology-map"/>
+          <w:bookmarkStart w:id="39" w:name="fig-technology-map"/>
           <w:p>
             <w:pPr>
               <w:pStyle w:val="Compact"/>
@@ -1921,18 +2847,18 @@
                 <wp:inline>
                   <wp:extent cx="5943600" cy="2786062"/>
                   <wp:effectExtent b="0" l="0" r="0" t="0"/>
-                  <wp:docPr descr="" title="" id="30" name="Picture"/>
+                  <wp:docPr descr="" title="" id="37" name="Picture"/>
                   <a:graphic>
                     <a:graphicData uri="http://schemas.openxmlformats.org/drawingml/2006/picture">
                       <pic:pic>
                         <pic:nvPicPr>
-                          <pic:cNvPr descr="./figures/technologies/map_D_vosviewer_overlay.png" id="31" name="Picture"/>
+                          <pic:cNvPr descr="./figures/technologies/map_D_vosviewer_overlay.png" id="38" name="Picture"/>
                           <pic:cNvPicPr>
                             <a:picLocks noChangeArrowheads="1" noChangeAspect="1"/>
                           </pic:cNvPicPr>
                         </pic:nvPicPr>
                         <pic:blipFill>
-                          <a:blip r:embed="rId29"/>
+                          <a:blip r:embed="rId36"/>
                           <a:stretch>
                             <a:fillRect/>
                           </a:stretch>
@@ -1972,7 +2898,7 @@
               <w:t xml:space="preserve">Figure 1: Semantic map of consumer-facing technology clusters in the academic corpus. Faded points represent individual canonical technologies, colors indicate cluster membership, and labeled bubbles represent cluster centers. Bubble size corresponds to the number of academic articles assigned to each cluster. Spatial proximity represents similarity in the two-dimensional UMAP projection.</w:t>
             </w:r>
           </w:p>
-          <w:bookmarkEnd w:id="32"/>
+          <w:bookmarkEnd w:id="39"/>
         </w:tc>
       </w:tr>
     </w:tbl>
@@ -2006,7 +2932,7 @@
         <w:pStyle w:val="BodyText"/>
       </w:pPr>
       <w:r>
-        <w:t xml:space="preserve">Two patterns stand out. First, publication activity increased sharply after 2013. Articles published before 2014 accounted for 403 (24.7%) observations, whereas 1231 (75.3%) were published between 2014 and June 2026. Second, the composition of the academic corpus changed alongside major technological developments. Until 2012,</w:t>
+        <w:t xml:space="preserve">Two patterns stand out. First, publication activity increased sharply after 2013. Articles published before 2014 accounted for 419 (24.8%) observations, whereas 1269 (75.2%) were published between 2014 and June 2026. Second, the composition of the academic corpus changed alongside major technological developments. Until 2012,</w:t>
       </w:r>
       <w:r>
         <w:t xml:space="preserve"> </w:t>
@@ -2044,7 +2970,7 @@
         <w:t xml:space="preserve"> </w:t>
       </w:r>
       <w:r>
-        <w:t xml:space="preserve">[12]</w:t>
+        <w:t xml:space="preserve">[33]</w:t>
       </w:r>
       <w:r>
         <w:t xml:space="preserve">. From 2013 onward,</w:t>
@@ -2069,7 +2995,7 @@
         <w:t xml:space="preserve"> </w:t>
       </w:r>
       <w:r>
-        <w:t xml:space="preserve">[13,14]</w:t>
+        <w:t xml:space="preserve">[34,35]</w:t>
       </w:r>
       <w:r>
         <w:t xml:space="preserve">. After 2022,</w:t>
@@ -2110,7 +3036,7 @@
         <w:t xml:space="preserve"> </w:t>
       </w:r>
       <w:r>
-        <w:t xml:space="preserve">[15]</w:t>
+        <w:t xml:space="preserve">[36]</w:t>
       </w:r>
       <w:r>
         <w:t xml:space="preserve">.</w:t>
@@ -2145,7 +3071,7 @@
       <w:tr>
         <w:tc>
           <w:tcPr/>
-          <w:bookmarkStart w:id="36" w:name="fig-academic-panels"/>
+          <w:bookmarkStart w:id="43" w:name="fig-academic-panels"/>
           <w:p>
             <w:pPr>
               <w:pStyle w:val="Compact"/>
@@ -2156,18 +3082,18 @@
                 <wp:inline>
                   <wp:extent cx="5943600" cy="2971800"/>
                   <wp:effectExtent b="0" l="0" r="0" t="0"/>
-                  <wp:docPr descr="" title="" id="34" name="Picture"/>
+                  <wp:docPr descr="" title="" id="41" name="Picture"/>
                   <a:graphic>
                     <a:graphicData uri="http://schemas.openxmlformats.org/drawingml/2006/picture">
                       <pic:pic>
                         <pic:nvPicPr>
-                          <pic:cNvPr descr="./figures/technologies/progression_panels_AB_k16.png" id="35" name="Picture"/>
+                          <pic:cNvPr descr="./figures/technologies/progression_panels_AB_k16.png" id="42" name="Picture"/>
                           <pic:cNvPicPr>
                             <a:picLocks noChangeArrowheads="1" noChangeAspect="1"/>
                           </pic:cNvPicPr>
                         </pic:nvPicPr>
                         <pic:blipFill>
-                          <a:blip r:embed="rId33"/>
+                          <a:blip r:embed="rId40"/>
                           <a:stretch>
                             <a:fillRect/>
                           </a:stretch>
@@ -2207,162 +3133,22 @@
               <w:t xml:space="preserve">Figure 2: Academic articles on consumer-facing technologies over time, 2000–2026. Panel A shows annual article counts; Panel B shows each technology cluster’s share of articles.</w:t>
             </w:r>
           </w:p>
-          <w:bookmarkEnd w:id="36"/>
+          <w:bookmarkEnd w:id="43"/>
         </w:tc>
       </w:tr>
     </w:tbl>
-    <w:bookmarkStart w:id="41" w:name="X4e6240e6ec785c3a4d37880cef56abf617949fa"/>
+    <w:bookmarkStart w:id="48" w:name="X4e6240e6ec785c3a4d37880cef56abf617949fa"/>
     <w:p>
       <w:pPr>
         <w:pStyle w:val="Heading2"/>
       </w:pPr>
       <w:r>
-        <w:t xml:space="preserve">Media Coverage of Consumer-Facing Technologies</w:t>
+        <w:t xml:space="preserve">4.1 Media Coverage of Consumer-Facing Technologies</w:t>
       </w:r>
     </w:p>
     <w:p>
       <w:pPr>
         <w:pStyle w:val="FirstParagraph"/>
-      </w:pPr>
-      <w:r>
-        <w:t xml:space="preserve">The academic corpus presented captures how consumer-facing technologies are selected and studied within marketing and consumer-behavior research. It does however not reveal whether these patterns correspond to the technologies receiving attention outside academia. We therefore turn to media coverage as a complementary representation of attention to consumer-facing technologies and compare the prevalence and development of the technology clusters across the two domains.</w:t>
-      </w:r>
-    </w:p>
-    <w:p>
-      <w:pPr>
-        <w:pStyle w:val="BodyText"/>
-      </w:pPr>
-      <w:r>
-        <w:t xml:space="preserve">To place the academic map in a broader context, we examined U.S. news coverage of the 901 canonical technologies using the Media Cloud API</w:t>
-      </w:r>
-      <w:r>
-        <w:t xml:space="preserve"> </w:t>
-      </w:r>
-      <w:r>
-        <w:t xml:space="preserve">[16,17]</w:t>
-      </w:r>
-      <w:r>
-        <w:t xml:space="preserve">. We searched the</w:t>
-      </w:r>
-      <w:r>
-        <w:t xml:space="preserve"> </w:t>
-      </w:r>
-      <w:r>
-        <w:rPr>
-          <w:i/>
-          <w:iCs/>
-        </w:rPr>
-        <w:t xml:space="preserve">United States–National</w:t>
-      </w:r>
-      <w:r>
-        <w:t xml:space="preserve"> </w:t>
-      </w:r>
-      <w:r>
-        <w:t xml:space="preserve">collection, comprising 247 national U.S. news sources, from January 1, 2000, through June 30, 2026, querying these 247 media sources for mentions of each of the 901 identified technologies discussed in academic discourse. Across the full collection, we identified</w:t>
-      </w:r>
-      <w:r>
-        <w:t xml:space="preserve"> </w:t>
-      </w:r>
-      <m:oMath>
-        <m:r>
-          <m:t>n</m:t>
-        </m:r>
-        <m:r>
-          <m:rPr>
-            <m:sty m:val="p"/>
-          </m:rPr>
-          <m:t>=</m:t>
-        </m:r>
-        <m:r>
-          <m:t>4</m:t>
-        </m:r>
-        <m:r>
-          <m:rPr>
-            <m:sty m:val="p"/>
-          </m:rPr>
-          <m:t>,</m:t>
-        </m:r>
-        <m:r>
-          <m:t>714</m:t>
-        </m:r>
-        <m:r>
-          <m:rPr>
-            <m:sty m:val="p"/>
-          </m:rPr>
-          <m:t>,</m:t>
-        </m:r>
-        <m:r>
-          <m:t>445</m:t>
-        </m:r>
-      </m:oMath>
-      <w:r>
-        <w:t xml:space="preserve"> </w:t>
-      </w:r>
-      <w:r>
-        <w:t xml:space="preserve">technology mentions from</w:t>
-      </w:r>
-      <w:r>
-        <w:t xml:space="preserve"> </w:t>
-      </w:r>
-      <m:oMath>
-        <m:r>
-          <m:t>n</m:t>
-        </m:r>
-        <m:r>
-          <m:rPr>
-            <m:sty m:val="p"/>
-          </m:rPr>
-          <m:t>=</m:t>
-        </m:r>
-        <m:r>
-          <m:t>4</m:t>
-        </m:r>
-        <m:r>
-          <m:rPr>
-            <m:sty m:val="p"/>
-          </m:rPr>
-          <m:t>,</m:t>
-        </m:r>
-        <m:r>
-          <m:t>074</m:t>
-        </m:r>
-        <m:r>
-          <m:rPr>
-            <m:sty m:val="p"/>
-          </m:rPr>
-          <m:t>,</m:t>
-        </m:r>
-        <m:r>
-          <m:t>851</m:t>
-        </m:r>
-      </m:oMath>
-      <w:r>
-        <w:t xml:space="preserve"> </w:t>
-      </w:r>
-      <w:r>
-        <w:t xml:space="preserve">unique articles (for details on the full media coverage analysis, see</w:t>
-      </w:r>
-      <w:r>
-        <w:t xml:space="preserve"> </w:t>
-      </w:r>
-      <w:hyperlink w:anchor="sec-mediacloud-analysis">
-        <w:r>
-          <w:rPr>
-            <w:rStyle w:val="Hyperlink"/>
-          </w:rPr>
-          <w:t xml:space="preserve">supplementary materials D</w:t>
-        </w:r>
-      </w:hyperlink>
-      <w:r>
-        <w:t xml:space="preserve">supplementary materials D</w:t>
-      </w:r>
-      <w:r>
-        <w:t xml:space="preserve">). Because Media Cloud coverage is sparse before 2008, we restricted subsequently reported comparative analyses to the time period between January 2008 and June 2026.</w:t>
-      </w:r>
-    </w:p>
-    <w:p>
-      <w:pPr>
-        <w:pStyle w:val="BodyText"/>
       </w:pPr>
       <w:r>
         <w:t xml:space="preserve">As the volume of academic articles and media coverage differs substantially, we compared technology clusters using two complementary attention-share bases (</w:t>
@@ -2572,24 +3358,7 @@
         <w:pStyle w:val="BodyText"/>
       </w:pPr>
       <w:r>
-        <w:t xml:space="preserve">To examine whether these differences reflect temporal differences in academic and media discourse, we correlated their annual attention shares across lags from −5 to +5 years on both bases (for details on the method and results for individual technologies on both bases, see</w:t>
-      </w:r>
-      <w:r>
-        <w:t xml:space="preserve"> </w:t>
-      </w:r>
-      <w:hyperlink w:anchor="sec-lag-analysis">
-        <w:r>
-          <w:rPr>
-            <w:rStyle w:val="Hyperlink"/>
-          </w:rPr>
-          <w:t xml:space="preserve">supplementary materials E</w:t>
-        </w:r>
-      </w:hyperlink>
-      <w:r>
-        <w:t xml:space="preserve">supplementary materials E</w:t>
-      </w:r>
-      <w:r>
-        <w:t xml:space="preserve">). Both on an absolute basis as well as on a relative basis, the strongest correspondence for most clusters occurred at a positive lag—usually between 3 and 5 years—suggesting that academic attention generally followed media attention. By contrast, academic attention preceded media attention for</w:t>
+        <w:t xml:space="preserve">Both on an absolute basis as well as on a relative basis, the strongest correspondence for most clusters occurred at a positive lag—usually between 3 and 5 years—suggesting that academic attention generally followed media attention. By contrast, academic attention preceded media attention for</w:t>
       </w:r>
       <w:r>
         <w:t xml:space="preserve"> </w:t>
@@ -2645,14 +3414,6 @@
       </w:r>
       <w:r>
         <w:t xml:space="preserve">was the only cluster which showed a similar and essentially concurrent attention trajectory over time.</w:t>
-      </w:r>
-    </w:p>
-    <w:p>
-      <w:pPr>
-        <w:pStyle w:val="BodyText"/>
-      </w:pPr>
-      <w:r>
-        <w:t xml:space="preserve">Comparing media coverage with academic articles in the fashion we do must be treated cautiously however: First, our pipeline only matches media coverage against technologies discussed in academic articles since 2000, meaning that technologies that are simply not discussed in academic discourse are missed. Second, although the data volume is substantive, lag analyses on 11 total lags are to be interpreted cautiously, as they are vulnerable to outliers and autocorrelation.</w:t>
       </w:r>
     </w:p>
     <w:tbl>
@@ -2668,7 +3429,7 @@
       <w:tr>
         <w:tc>
           <w:tcPr/>
-          <w:bookmarkStart w:id="40" w:name="fig-academic-media-comparison"/>
+          <w:bookmarkStart w:id="47" w:name="fig-academic-media-comparison"/>
           <w:p>
             <w:pPr>
               <w:pStyle w:val="Compact"/>
@@ -2679,18 +3440,18 @@
                 <wp:inline>
                   <wp:extent cx="5943600" cy="2331433"/>
                   <wp:effectExtent b="0" l="0" r="0" t="0"/>
-                  <wp:docPr descr="" title="" id="38" name="Picture"/>
+                  <wp:docPr descr="" title="" id="45" name="Picture"/>
                   <a:graphic>
                     <a:graphicData uri="http://schemas.openxmlformats.org/drawingml/2006/picture">
                       <pic:pic>
                         <pic:nvPicPr>
-                          <pic:cNvPr descr="./figures/compare/combined/coverage_scatter.png" id="39" name="Picture"/>
+                          <pic:cNvPr descr="./figures/compare/combined/coverage_scatter.png" id="46" name="Picture"/>
                           <pic:cNvPicPr>
                             <a:picLocks noChangeArrowheads="1" noChangeAspect="1"/>
                           </pic:cNvPicPr>
                         </pic:nvPicPr>
                         <pic:blipFill>
-                          <a:blip r:embed="rId37"/>
+                          <a:blip r:embed="rId44"/>
                           <a:stretch>
                             <a:fillRect/>
                           </a:stretch>
@@ -2730,19 +3491,19 @@
               <w:t xml:space="preserve">Figure 3: Mean annual academic and media attention shares across technology clusters, 2008–2026. Panel A shows the relative basis (share of technology-related mentions only); Panel B shows the absolute basis (share of all publications/articles that year). The diagonal indicates equal attention shares. Points above the line receive a comparatively larger academic share; points below the line receive a comparatively larger media share. Media attention serves as an external indicator of visibility rather than a normative benchmark for research priorities.</w:t>
             </w:r>
           </w:p>
-          <w:bookmarkEnd w:id="40"/>
+          <w:bookmarkEnd w:id="47"/>
         </w:tc>
       </w:tr>
     </w:tbl>
-    <w:bookmarkEnd w:id="41"/>
-    <w:bookmarkEnd w:id="42"/>
-    <w:bookmarkStart w:id="77" w:name="discussion"/>
+    <w:bookmarkEnd w:id="48"/>
+    <w:bookmarkEnd w:id="49"/>
+    <w:bookmarkStart w:id="123" w:name="discussion"/>
     <w:p>
       <w:pPr>
         <w:pStyle w:val="Heading1"/>
       </w:pPr>
       <w:r>
-        <w:t xml:space="preserve">Discussion</w:t>
+        <w:t xml:space="preserve">5. Discussion</w:t>
       </w:r>
     </w:p>
     <w:p>
@@ -2750,7 +3511,7 @@
         <w:pStyle w:val="Compact"/>
         <w:numPr>
           <w:ilvl w:val="0"/>
-          <w:numId w:val="1010"/>
+          <w:numId w:val="1008"/>
         </w:numPr>
       </w:pPr>
       <w:r>
@@ -2762,7 +3523,7 @@
         <w:pStyle w:val="Compact"/>
         <w:numPr>
           <w:ilvl w:val="0"/>
-          <w:numId w:val="1010"/>
+          <w:numId w:val="1008"/>
         </w:numPr>
       </w:pPr>
       <w:r>
@@ -2774,7 +3535,7 @@
         <w:pStyle w:val="Compact"/>
         <w:numPr>
           <w:ilvl w:val="0"/>
-          <w:numId w:val="1010"/>
+          <w:numId w:val="1008"/>
         </w:numPr>
       </w:pPr>
       <w:r>
@@ -2786,11 +3547,71 @@
         <w:pStyle w:val="Compact"/>
         <w:numPr>
           <w:ilvl w:val="0"/>
+          <w:numId w:val="1008"/>
+        </w:numPr>
+      </w:pPr>
+      <w:r>
+        <w:t xml:space="preserve">Question is why do we study what we do?</w:t>
+      </w:r>
+    </w:p>
+    <w:p>
+      <w:pPr>
+        <w:pStyle w:val="Compact"/>
+        <w:numPr>
+          <w:ilvl w:val="1"/>
+          <w:numId w:val="1009"/>
+        </w:numPr>
+      </w:pPr>
+      <w:r>
+        <w:t xml:space="preserve">novelty-effects: whatever is coming, or up and coming gets the biggest slice of the cake</w:t>
+      </w:r>
+    </w:p>
+    <w:p>
+      <w:pPr>
+        <w:pStyle w:val="Compact"/>
+        <w:numPr>
+          <w:ilvl w:val="2"/>
           <w:numId w:val="1010"/>
         </w:numPr>
       </w:pPr>
       <w:r>
-        <w:t xml:space="preserve">Question is why do we study what we do?</w:t>
+        <w:t xml:space="preserve">this can be okay but it should not just follow the next shiny prize</w:t>
+      </w:r>
+    </w:p>
+    <w:p>
+      <w:pPr>
+        <w:pStyle w:val="Compact"/>
+        <w:numPr>
+          <w:ilvl w:val="0"/>
+          <w:numId w:val="1008"/>
+        </w:numPr>
+      </w:pPr>
+      <w:r>
+        <w:t xml:space="preserve">pick up the idea of studying the essence of a technology &amp; question</w:t>
+      </w:r>
+    </w:p>
+    <w:p>
+      <w:pPr>
+        <w:pStyle w:val="Compact"/>
+        <w:numPr>
+          <w:ilvl w:val="0"/>
+          <w:numId w:val="1008"/>
+        </w:numPr>
+      </w:pPr>
+      <w:r>
+        <w:t xml:space="preserve">The differences may also reflect journal scope, data availability, editorial priorities, public news values, or the tendency for established technologies to become less visible as explicit research objects once they are integrated into everyday life</w:t>
+      </w:r>
+    </w:p>
+    <w:p>
+      <w:pPr>
+        <w:pStyle w:val="Compact"/>
+        <w:numPr>
+          <w:ilvl w:val="0"/>
+          <w:numId w:val="1008"/>
+        </w:numPr>
+      </w:pPr>
+      <w:r>
+        <w:t xml:space="preserve">find a recently published paper that demonstrates this well</w:t>
       </w:r>
     </w:p>
     <w:p>
@@ -2802,7 +3623,7 @@
         </w:numPr>
       </w:pPr>
       <w:r>
-        <w:t xml:space="preserve">novelty-effects: whatever is coming, or up and coming gets the biggest slice of the cake</w:t>
+        <w:t xml:space="preserve">ease of methodological tractability. Academic research may preferentially examine technologies that can be operationalized as bounded interfaces, treatments, or consumer decisions and linked to immediately observable outcomes. Technologies that function as diffuse platforms, infrastructures, or continuous social environments may be harder to isolate within prevailing empirical designs</w:t>
       </w:r>
     </w:p>
     <w:p>
@@ -2814,7 +3635,15 @@
         </w:numPr>
       </w:pPr>
       <w:r>
-        <w:t xml:space="preserve">this can be okay but it should not just follow the next shiny prize</w:t>
+        <w:t xml:space="preserve">show one paper that does this well, and maybe also add DICE as an example to show that it is possible?</w:t>
+      </w:r>
+    </w:p>
+    <w:p>
+      <w:pPr>
+        <w:pStyle w:val="FirstParagraph"/>
+      </w:pPr>
+      <w:r>
+        <w:t xml:space="preserve">Limitations</w:t>
       </w:r>
     </w:p>
     <w:p>
@@ -2822,11 +3651,11 @@
         <w:pStyle w:val="Compact"/>
         <w:numPr>
           <w:ilvl w:val="0"/>
-          <w:numId w:val="1010"/>
+          <w:numId w:val="1013"/>
         </w:numPr>
       </w:pPr>
       <w:r>
-        <w:t xml:space="preserve">pick up the idea of studying the essence of a technology &amp; question</w:t>
+        <w:t xml:space="preserve">The academic corpus is restricted to seven consumer-research journals and does not represent all psychological or interdisciplinary technology research.</w:t>
       </w:r>
     </w:p>
     <w:p>
@@ -2834,11 +3663,11 @@
         <w:pStyle w:val="Compact"/>
         <w:numPr>
           <w:ilvl w:val="0"/>
-          <w:numId w:val="1010"/>
+          <w:numId w:val="1013"/>
         </w:numPr>
       </w:pPr>
       <w:r>
-        <w:t xml:space="preserve">The differences may also reflect journal scope, data availability, editorial priorities, public news values, or the tendency for established technologies to become less visible as explicit research objects once they are integrated into everyday life</w:t>
+        <w:t xml:space="preserve">The focus on empirical articles excludes conceptual, normative, legal, and design-oriented contributions.</w:t>
       </w:r>
     </w:p>
     <w:p>
@@ -2846,43 +3675,11 @@
         <w:pStyle w:val="Compact"/>
         <w:numPr>
           <w:ilvl w:val="0"/>
-          <w:numId w:val="1010"/>
-        </w:numPr>
-      </w:pPr>
-      <w:r>
-        <w:t xml:space="preserve">find a recently published paper that demonstrates this well</w:t>
-      </w:r>
-    </w:p>
-    <w:p>
-      <w:pPr>
-        <w:pStyle w:val="Compact"/>
-        <w:numPr>
-          <w:ilvl w:val="1"/>
           <w:numId w:val="1013"/>
         </w:numPr>
       </w:pPr>
       <w:r>
-        <w:t xml:space="preserve">ease of methodological tractability. Academic research may preferentially examine technologies that can be operationalized as bounded interfaces, treatments, or consumer decisions and linked to immediately observable outcomes. Technologies that function as diffuse platforms, infrastructures, or continuous social environments may be harder to isolate within prevailing empirical designs</w:t>
-      </w:r>
-    </w:p>
-    <w:p>
-      <w:pPr>
-        <w:pStyle w:val="Compact"/>
-        <w:numPr>
-          <w:ilvl w:val="2"/>
-          <w:numId w:val="1014"/>
-        </w:numPr>
-      </w:pPr>
-      <w:r>
-        <w:t xml:space="preserve">show one paper that does this well, and maybe also add DICE as an example to show that it is possible?</w:t>
-      </w:r>
-    </w:p>
-    <w:p>
-      <w:pPr>
-        <w:pStyle w:val="FirstParagraph"/>
-      </w:pPr>
-      <w:r>
-        <w:t xml:space="preserve">Limitations</w:t>
+        <w:t xml:space="preserve">The semantic themes depend on the labels extracted from titles and abstracts.</w:t>
       </w:r>
     </w:p>
     <w:p>
@@ -2890,11 +3687,11 @@
         <w:pStyle w:val="Compact"/>
         <w:numPr>
           <w:ilvl w:val="0"/>
-          <w:numId w:val="1015"/>
+          <w:numId w:val="1013"/>
         </w:numPr>
       </w:pPr>
       <w:r>
-        <w:t xml:space="preserve">The academic corpus is restricted to seven consumer-research journals and does not represent all psychological or interdisciplinary technology research.</w:t>
+        <w:t xml:space="preserve">Technologies may be discussed without being explicitly named, particularly after becoming embedded or normalized -&gt; we cannot exclude that this might also be part of why we have a decline</w:t>
       </w:r>
     </w:p>
     <w:p>
@@ -2902,11 +3699,11 @@
         <w:pStyle w:val="Compact"/>
         <w:numPr>
           <w:ilvl w:val="0"/>
-          <w:numId w:val="1015"/>
+          <w:numId w:val="1013"/>
         </w:numPr>
       </w:pPr>
       <w:r>
-        <w:t xml:space="preserve">The focus on empirical articles excludes conceptual, normative, legal, and design-oriented contributions.</w:t>
+        <w:t xml:space="preserve">Media Cloud coverage varies across sources and years, particularly before 2008.</w:t>
       </w:r>
     </w:p>
     <w:p>
@@ -2914,11 +3711,11 @@
         <w:pStyle w:val="Compact"/>
         <w:numPr>
           <w:ilvl w:val="0"/>
-          <w:numId w:val="1015"/>
+          <w:numId w:val="1013"/>
         </w:numPr>
       </w:pPr>
       <w:r>
-        <w:t xml:space="preserve">The semantic themes depend on the labels extracted from titles and abstracts.</w:t>
+        <w:t xml:space="preserve">Media coverage indicates visibility rather than adoption or societal importance.</w:t>
       </w:r>
     </w:p>
     <w:p>
@@ -2926,11 +3723,11 @@
         <w:pStyle w:val="Compact"/>
         <w:numPr>
           <w:ilvl w:val="0"/>
-          <w:numId w:val="1015"/>
+          <w:numId w:val="1013"/>
         </w:numPr>
       </w:pPr>
       <w:r>
-        <w:t xml:space="preserve">Technologies may be discussed without being explicitly named, particularly after becoming embedded or normalized -&gt; we cannot exclude that this might also be part of why we have a decline</w:t>
+        <w:t xml:space="preserve">Temporal and media comparisons are exploratory</w:t>
       </w:r>
     </w:p>
     <w:p>
@@ -2938,11 +3735,19 @@
         <w:pStyle w:val="Compact"/>
         <w:numPr>
           <w:ilvl w:val="0"/>
-          <w:numId w:val="1015"/>
+          <w:numId w:val="1013"/>
         </w:numPr>
       </w:pPr>
       <w:r>
-        <w:t xml:space="preserve">Media Cloud coverage varies across sources and years, particularly before 2008.</w:t>
+        <w:t xml:space="preserve">Comparing media coverage with academic articles in the fashion we do must be treated cautiously however: First, our pipeline only matches media coverage against technologies discussed in academic articles since 2000, meaning that technologies that are simply not discussed in academic discourse are missed. Second, although the data volume is substantive, lag analyses on 11 total lags are to be interpreted cautiously, as they are vulnerable to outliers and autocorrelation.</w:t>
+      </w:r>
+    </w:p>
+    <w:p>
+      <w:pPr>
+        <w:pStyle w:val="FirstParagraph"/>
+      </w:pPr>
+      <w:r>
+        <w:t xml:space="preserve">Recommendations</w:t>
       </w:r>
     </w:p>
     <w:p>
@@ -2950,11 +3755,11 @@
         <w:pStyle w:val="Compact"/>
         <w:numPr>
           <w:ilvl w:val="0"/>
-          <w:numId w:val="1015"/>
+          <w:numId w:val="1014"/>
         </w:numPr>
       </w:pPr>
       <w:r>
-        <w:t xml:space="preserve">Media coverage indicates visibility rather than adoption or societal importance.</w:t>
+        <w:t xml:space="preserve">Improve consistency in naming and describing consumer-facing technologies.</w:t>
       </w:r>
     </w:p>
     <w:p>
@@ -2962,19 +3767,11 @@
         <w:pStyle w:val="Compact"/>
         <w:numPr>
           <w:ilvl w:val="0"/>
-          <w:numId w:val="1015"/>
+          <w:numId w:val="1014"/>
         </w:numPr>
       </w:pPr>
       <w:r>
-        <w:t xml:space="preserve">Temporal and media comparisons are exploratory</w:t>
-      </w:r>
-    </w:p>
-    <w:p>
-      <w:pPr>
-        <w:pStyle w:val="FirstParagraph"/>
-      </w:pPr>
-      <w:r>
-        <w:t xml:space="preserve">Recommendations</w:t>
+        <w:t xml:space="preserve">Report both specific technology labels and broader technology families, and make sure the research doesn’t focus overly narrow on one specific flavor of technology.</w:t>
       </w:r>
     </w:p>
     <w:p>
@@ -2982,11 +3779,11 @@
         <w:pStyle w:val="Compact"/>
         <w:numPr>
           <w:ilvl w:val="0"/>
-          <w:numId w:val="1016"/>
+          <w:numId w:val="1014"/>
         </w:numPr>
       </w:pPr>
       <w:r>
-        <w:t xml:space="preserve">Improve consistency in naming and describing consumer-facing technologies.</w:t>
+        <w:t xml:space="preserve">Build cumulative research across related technologies rather than treating every new label as an isolated domain.</w:t>
       </w:r>
     </w:p>
     <w:p>
@@ -2994,11 +3791,11 @@
         <w:pStyle w:val="Compact"/>
         <w:numPr>
           <w:ilvl w:val="0"/>
-          <w:numId w:val="1016"/>
+          <w:numId w:val="1014"/>
         </w:numPr>
       </w:pPr>
       <w:r>
-        <w:t xml:space="preserve">Report both specific technology labels and broader technology families, and make sure the research doesn’t focus overly narrow on one specific flavor of technology.</w:t>
+        <w:t xml:space="preserve">Revisit mature technologies whose effects may be obscured by normalization.</w:t>
       </w:r>
     </w:p>
     <w:p>
@@ -3006,11 +3803,11 @@
         <w:pStyle w:val="Compact"/>
         <w:numPr>
           <w:ilvl w:val="0"/>
-          <w:numId w:val="1016"/>
+          <w:numId w:val="1014"/>
         </w:numPr>
       </w:pPr>
       <w:r>
-        <w:t xml:space="preserve">Build cumulative research across related technologies rather than treating every new label as an isolated domain.</w:t>
+        <w:t xml:space="preserve">Examine themes that remain weakly covered despite substantial consumer reach or public visibility.</w:t>
       </w:r>
     </w:p>
     <w:p>
@@ -3018,31 +3815,7 @@
         <w:pStyle w:val="Compact"/>
         <w:numPr>
           <w:ilvl w:val="0"/>
-          <w:numId w:val="1016"/>
-        </w:numPr>
-      </w:pPr>
-      <w:r>
-        <w:t xml:space="preserve">Revisit mature technologies whose effects may be obscured by normalization.</w:t>
-      </w:r>
-    </w:p>
-    <w:p>
-      <w:pPr>
-        <w:pStyle w:val="Compact"/>
-        <w:numPr>
-          <w:ilvl w:val="0"/>
-          <w:numId w:val="1016"/>
-        </w:numPr>
-      </w:pPr>
-      <w:r>
-        <w:t xml:space="preserve">Examine themes that remain weakly covered despite substantial consumer reach or public visibility.</w:t>
-      </w:r>
-    </w:p>
-    <w:p>
-      <w:pPr>
-        <w:pStyle w:val="Compact"/>
-        <w:numPr>
-          <w:ilvl w:val="0"/>
-          <w:numId w:val="1016"/>
+          <w:numId w:val="1014"/>
         </w:numPr>
       </w:pPr>
       <w:r>
@@ -3075,7 +3848,7 @@
       <w:tr>
         <w:tc>
           <w:tcPr/>
-          <w:bookmarkStart w:id="43" w:name="tbl-academic-clusters"/>
+          <w:bookmarkStart w:id="50" w:name="tbl-academic-clusters"/>
           <w:p>
             <w:pPr>
               <w:jc w:val="center"/>
@@ -3594,7 +4367,7 @@
                       <w:szCs w:val="16"/>
                       <w:color w:val="000000"/>
                     </w:rPr>
-                    <w:t xml:space="preserve">109</w:t>
+                    <w:t xml:space="preserve">110</w:t>
                   </w:r>
                 </w:p>
               </w:tc>
@@ -3869,7 +4642,7 @@
                       <w:szCs w:val="16"/>
                       <w:color w:val="000000"/>
                     </w:rPr>
-                    <w:t xml:space="preserve">54</w:t>
+                    <w:t xml:space="preserve">55</w:t>
                   </w:r>
                 </w:p>
               </w:tc>
@@ -4419,7 +5192,7 @@
                       <w:szCs w:val="16"/>
                       <w:color w:val="000000"/>
                     </w:rPr>
-                    <w:t xml:space="preserve">134</w:t>
+                    <w:t xml:space="preserve">140</w:t>
                   </w:r>
                 </w:p>
               </w:tc>
@@ -4694,7 +5467,7 @@
                       <w:szCs w:val="16"/>
                       <w:color w:val="000000"/>
                     </w:rPr>
-                    <w:t xml:space="preserve">93</w:t>
+                    <w:t xml:space="preserve">98</w:t>
                   </w:r>
                 </w:p>
               </w:tc>
@@ -4969,7 +5742,7 @@
                       <w:szCs w:val="16"/>
                       <w:color w:val="000000"/>
                     </w:rPr>
-                    <w:t xml:space="preserve">91</w:t>
+                    <w:t xml:space="preserve">99</w:t>
                   </w:r>
                 </w:p>
               </w:tc>
@@ -5244,7 +6017,7 @@
                       <w:szCs w:val="16"/>
                       <w:color w:val="000000"/>
                     </w:rPr>
-                    <w:t xml:space="preserve">108</w:t>
+                    <w:t xml:space="preserve">112</w:t>
                   </w:r>
                 </w:p>
               </w:tc>
@@ -5519,7 +6292,7 @@
                       <w:szCs w:val="16"/>
                       <w:color w:val="000000"/>
                     </w:rPr>
-                    <w:t xml:space="preserve">225</w:t>
+                    <w:t xml:space="preserve">230</w:t>
                   </w:r>
                 </w:p>
               </w:tc>
@@ -5794,7 +6567,7 @@
                       <w:szCs w:val="16"/>
                       <w:color w:val="000000"/>
                     </w:rPr>
-                    <w:t xml:space="preserve">127</w:t>
+                    <w:t xml:space="preserve">134</w:t>
                   </w:r>
                 </w:p>
               </w:tc>
@@ -6069,7 +6842,7 @@
                       <w:szCs w:val="16"/>
                       <w:color w:val="000000"/>
                     </w:rPr>
-                    <w:t xml:space="preserve">27</w:t>
+                    <w:t xml:space="preserve">28</w:t>
                   </w:r>
                 </w:p>
               </w:tc>
@@ -6344,7 +7117,7 @@
                       <w:szCs w:val="16"/>
                       <w:color w:val="000000"/>
                     </w:rPr>
-                    <w:t xml:space="preserve">109</w:t>
+                    <w:t xml:space="preserve">115</w:t>
                   </w:r>
                 </w:p>
               </w:tc>
@@ -6619,7 +7392,7 @@
                       <w:szCs w:val="16"/>
                       <w:color w:val="000000"/>
                     </w:rPr>
-                    <w:t xml:space="preserve">148</w:t>
+                    <w:t xml:space="preserve">153</w:t>
                   </w:r>
                 </w:p>
               </w:tc>
@@ -6894,7 +7667,7 @@
                       <w:szCs w:val="16"/>
                       <w:color w:val="000000"/>
                     </w:rPr>
-                    <w:t xml:space="preserve">182</w:t>
+                    <w:t xml:space="preserve">186</w:t>
                   </w:r>
                 </w:p>
               </w:tc>
@@ -7169,7 +7942,7 @@
                       <w:szCs w:val="16"/>
                       <w:color w:val="000000"/>
                     </w:rPr>
-                    <w:t xml:space="preserve">60</w:t>
+                    <w:t xml:space="preserve">62</w:t>
                   </w:r>
                 </w:p>
               </w:tc>
@@ -7444,7 +8217,7 @@
                       <w:szCs w:val="16"/>
                       <w:color w:val="000000"/>
                     </w:rPr>
-                    <w:t xml:space="preserve">56</w:t>
+                    <w:t xml:space="preserve">57</w:t>
                   </w:r>
                 </w:p>
               </w:tc>
@@ -7719,7 +8492,7 @@
                       <w:szCs w:val="16"/>
                       <w:color w:val="000000"/>
                     </w:rPr>
-                    <w:t xml:space="preserve">85</w:t>
+                    <w:t xml:space="preserve">87</w:t>
                   </w:r>
                 </w:p>
               </w:tc>
@@ -7779,7 +8552,7 @@
               </w:tc>
             </w:tr>
           </w:tbl>
-          <w:bookmarkEnd w:id="43"/>
+          <w:bookmarkEnd w:id="50"/>
         </w:tc>
       </w:tr>
     </w:tbl>
@@ -7790,17 +8563,17 @@
         </w:sectPr>
       </w:pPr>
     </w:p>
-    <w:bookmarkStart w:id="76" w:name="references"/>
+    <w:bookmarkStart w:id="122" w:name="references"/>
     <w:p>
       <w:pPr>
         <w:pStyle w:val="Heading2"/>
       </w:pPr>
       <w:r>
-        <w:t xml:space="preserve">References</w:t>
-      </w:r>
-    </w:p>
-    <w:bookmarkStart w:id="75" w:name="refs"/>
-    <w:bookmarkStart w:id="45" w:name="ref-hoffmanRiseNewTechnologies2022"/>
+        <w:t xml:space="preserve">5.1 References</w:t>
+      </w:r>
+    </w:p>
+    <w:bookmarkStart w:id="121" w:name="refs"/>
+    <w:bookmarkStart w:id="52" w:name="X72593c4dfb69f74898c26f494bd8ac79ee05da9"/>
     <w:p>
       <w:pPr>
         <w:pStyle w:val="Bibliography"/>
@@ -7815,6 +8588,102 @@
         <w:t xml:space="preserve">	</w:t>
       </w:r>
       <w:r>
+        <w:t xml:space="preserve">A.M. Carvalho, S. Gonçalves, J. Ruffoni, J.R. Iglesias, Macroscopic and microscopic perspectives for adoption of technologies in the</w:t>
+      </w:r>
+      <w:r>
+        <w:t xml:space="preserve"> </w:t>
+      </w:r>
+      <w:r>
+        <w:t xml:space="preserve">USA</w:t>
+      </w:r>
+      <w:r>
+        <w:t xml:space="preserve">, PLoS ONE 15 (2020) e0242676. https://doi.org/</w:t>
+      </w:r>
+      <w:hyperlink r:id="rId51">
+        <w:r>
+          <w:rPr>
+            <w:rStyle w:val="Hyperlink"/>
+          </w:rPr>
+          <w:t xml:space="preserve">10.1371/journal.pone.0242676</w:t>
+        </w:r>
+      </w:hyperlink>
+      <w:r>
+        <w:t xml:space="preserve">.</w:t>
+      </w:r>
+    </w:p>
+    <w:bookmarkEnd w:id="52"/>
+    <w:bookmarkStart w:id="54" w:name="ref-NewYorkTimes"/>
+    <w:p>
+      <w:pPr>
+        <w:pStyle w:val="Bibliography"/>
+      </w:pPr>
+      <w:r>
+        <w:t xml:space="preserve">[2]</w:t>
+      </w:r>
+      <w:r>
+        <w:t xml:space="preserve"> </w:t>
+      </w:r>
+      <w:r>
+        <w:t xml:space="preserve">	</w:t>
+      </w:r>
+      <w:r>
+        <w:t xml:space="preserve">Felton, How</w:t>
+      </w:r>
+      <w:r>
+        <w:t xml:space="preserve"> </w:t>
+      </w:r>
+      <w:r>
+        <w:t xml:space="preserve">Americans Spend</w:t>
+      </w:r>
+      <w:r>
+        <w:t xml:space="preserve"> </w:t>
+      </w:r>
+      <w:r>
+        <w:t xml:space="preserve">their</w:t>
+      </w:r>
+      <w:r>
+        <w:t xml:space="preserve"> </w:t>
+      </w:r>
+      <w:r>
+        <w:t xml:space="preserve">Money</w:t>
+      </w:r>
+      <w:r>
+        <w:t xml:space="preserve">, (2008).</w:t>
+      </w:r>
+      <w:r>
+        <w:t xml:space="preserve"> </w:t>
+      </w:r>
+      <w:hyperlink r:id="rId53">
+        <w:r>
+          <w:rPr>
+            <w:rStyle w:val="Hyperlink"/>
+          </w:rPr>
+          <w:t xml:space="preserve">https://archive.nytimes.com/www.nytimes.com/imagepages/2008/02/10/opinion/10op.graphic.ready.html</w:t>
+        </w:r>
+      </w:hyperlink>
+      <w:r>
+        <w:t xml:space="preserve"> </w:t>
+      </w:r>
+      <w:r>
+        <w:t xml:space="preserve">(accessed March 5, 2026).</w:t>
+      </w:r>
+    </w:p>
+    <w:bookmarkEnd w:id="54"/>
+    <w:bookmarkStart w:id="56" w:name="ref-hoffmanRiseNewTechnologies2022"/>
+    <w:p>
+      <w:pPr>
+        <w:pStyle w:val="Bibliography"/>
+      </w:pPr>
+      <w:r>
+        <w:t xml:space="preserve">[3]</w:t>
+      </w:r>
+      <w:r>
+        <w:t xml:space="preserve"> </w:t>
+      </w:r>
+      <w:r>
+        <w:t xml:space="preserve">	</w:t>
+      </w:r>
+      <w:r>
         <w:t xml:space="preserve">D.L. Hoffman, C.P. Moreau, S. Stremersch, M. Wedel, The</w:t>
       </w:r>
       <w:r>
@@ -7869,9 +8738,9 @@
         <w:t xml:space="preserve">Outlook</w:t>
       </w:r>
       <w:r>
-        <w:t xml:space="preserve">, J. Mark. 86 (2022) 1–6. https://doi.org/</w:t>
-      </w:r>
-      <w:hyperlink r:id="rId44">
+        <w:t xml:space="preserve">, Journal of Marketing 86 (2022) 1–6. https://doi.org/</w:t>
+      </w:r>
+      <w:hyperlink r:id="rId55">
         <w:r>
           <w:rPr>
             <w:rStyle w:val="Hyperlink"/>
@@ -7883,14 +8752,14 @@
         <w:t xml:space="preserve">.</w:t>
       </w:r>
     </w:p>
-    <w:bookmarkEnd w:id="45"/>
-    <w:bookmarkStart w:id="47" w:name="X77c6a6fb7e9371a37a306d4adddd389bde7954b"/>
+    <w:bookmarkEnd w:id="56"/>
+    <w:bookmarkStart w:id="58" w:name="X1340cb48341094413e9edc50fe664b533937814"/>
     <w:p>
       <w:pPr>
         <w:pStyle w:val="Bibliography"/>
       </w:pPr>
       <w:r>
-        <w:t xml:space="preserve">[2]</w:t>
+        <w:t xml:space="preserve">[4]</w:t>
       </w:r>
       <w:r>
         <w:t xml:space="preserve"> </w:t>
@@ -7899,6 +8768,570 @@
         <w:t xml:space="preserve">	</w:t>
       </w:r>
       <w:r>
+        <w:t xml:space="preserve">W.D. Hoyer, M. Kroschke, B. Schmitt, K. Kraume, V. Shankar, Transforming the</w:t>
+      </w:r>
+      <w:r>
+        <w:t xml:space="preserve"> </w:t>
+      </w:r>
+      <w:r>
+        <w:t xml:space="preserve">Customer Experience</w:t>
+      </w:r>
+      <w:r>
+        <w:t xml:space="preserve"> </w:t>
+      </w:r>
+      <w:r>
+        <w:t xml:space="preserve">through</w:t>
+      </w:r>
+      <w:r>
+        <w:t xml:space="preserve"> </w:t>
+      </w:r>
+      <w:r>
+        <w:t xml:space="preserve">New Technologies</w:t>
+      </w:r>
+      <w:r>
+        <w:t xml:space="preserve">, Journal of Interactive Marketing 51 (2020) 57–71. https://doi.org/</w:t>
+      </w:r>
+      <w:hyperlink r:id="rId57">
+        <w:r>
+          <w:rPr>
+            <w:rStyle w:val="Hyperlink"/>
+          </w:rPr>
+          <w:t xml:space="preserve">10.1016/j.intmar.2020.04.001</w:t>
+        </w:r>
+      </w:hyperlink>
+      <w:r>
+        <w:t xml:space="preserve">.</w:t>
+      </w:r>
+    </w:p>
+    <w:bookmarkEnd w:id="58"/>
+    <w:bookmarkStart w:id="60" w:name="Xbe4389e589697fbbdacbb7038a652d2e67cde7c"/>
+    <w:p>
+      <w:pPr>
+        <w:pStyle w:val="Bibliography"/>
+      </w:pPr>
+      <w:r>
+        <w:t xml:space="preserve">[5]</w:t>
+      </w:r>
+      <w:r>
+        <w:t xml:space="preserve"> </w:t>
+      </w:r>
+      <w:r>
+        <w:t xml:space="preserve">	</w:t>
+      </w:r>
+      <w:r>
+        <w:t xml:space="preserve">S. Puntoni, R.W. Reczek, M. Giesler, S. Botti, Consumers and</w:t>
+      </w:r>
+      <w:r>
+        <w:t xml:space="preserve"> </w:t>
+      </w:r>
+      <w:r>
+        <w:t xml:space="preserve">Artificial Intelligence</w:t>
+      </w:r>
+      <w:r>
+        <w:t xml:space="preserve">:</w:t>
+      </w:r>
+      <w:r>
+        <w:t xml:space="preserve"> </w:t>
+      </w:r>
+      <w:r>
+        <w:t xml:space="preserve">An Experiential Perspective</w:t>
+      </w:r>
+      <w:r>
+        <w:t xml:space="preserve">, Journal of Marketing 85 (2021) 131–151. https://doi.org/</w:t>
+      </w:r>
+      <w:hyperlink r:id="rId59">
+        <w:r>
+          <w:rPr>
+            <w:rStyle w:val="Hyperlink"/>
+          </w:rPr>
+          <w:t xml:space="preserve">10.1177/0022242920953847</w:t>
+        </w:r>
+      </w:hyperlink>
+      <w:r>
+        <w:t xml:space="preserve">.</w:t>
+      </w:r>
+    </w:p>
+    <w:bookmarkEnd w:id="60"/>
+    <w:bookmarkStart w:id="62" w:name="X8df770385ab26c30e7652ccd1d3423a7bc02440"/>
+    <w:p>
+      <w:pPr>
+        <w:pStyle w:val="Bibliography"/>
+      </w:pPr>
+      <w:r>
+        <w:t xml:space="preserve">[6]</w:t>
+      </w:r>
+      <w:r>
+        <w:t xml:space="preserve"> </w:t>
+      </w:r>
+      <w:r>
+        <w:t xml:space="preserve">	</w:t>
+      </w:r>
+      <w:r>
+        <w:t xml:space="preserve">T.P. Novak, D.L. Hoffman, Relationship journeys in the internet of things: A new framework for understanding interactions between consumers and smart objects, J. Of the Acad. Mark. Sci. 47 (2019) 216–237. https://doi.org/</w:t>
+      </w:r>
+      <w:hyperlink r:id="rId61">
+        <w:r>
+          <w:rPr>
+            <w:rStyle w:val="Hyperlink"/>
+          </w:rPr>
+          <w:t xml:space="preserve">10.1007/s11747-018-0608-3</w:t>
+        </w:r>
+      </w:hyperlink>
+      <w:r>
+        <w:t xml:space="preserve">.</w:t>
+      </w:r>
+    </w:p>
+    <w:bookmarkEnd w:id="62"/>
+    <w:bookmarkStart w:id="64" w:name="ref-rijsdijkHowTodaysConsumers2009"/>
+    <w:p>
+      <w:pPr>
+        <w:pStyle w:val="Bibliography"/>
+      </w:pPr>
+      <w:r>
+        <w:t xml:space="preserve">[7]</w:t>
+      </w:r>
+      <w:r>
+        <w:t xml:space="preserve"> </w:t>
+      </w:r>
+      <w:r>
+        <w:t xml:space="preserve">	</w:t>
+      </w:r>
+      <w:r>
+        <w:t xml:space="preserve">S.A. Rijsdijk, E.J. Hultink, How</w:t>
+      </w:r>
+      <w:r>
+        <w:t xml:space="preserve"> </w:t>
+      </w:r>
+      <w:r>
+        <w:t xml:space="preserve">Today</w:t>
+      </w:r>
+      <w:r>
+        <w:t xml:space="preserve">’s</w:t>
+      </w:r>
+      <w:r>
+        <w:t xml:space="preserve"> </w:t>
+      </w:r>
+      <w:r>
+        <w:t xml:space="preserve">Consumers Perceive Tomorrow</w:t>
+      </w:r>
+      <w:r>
+        <w:t xml:space="preserve">’s</w:t>
+      </w:r>
+      <w:r>
+        <w:t xml:space="preserve"> </w:t>
+      </w:r>
+      <w:r>
+        <w:t xml:space="preserve">Smart Products</w:t>
+      </w:r>
+      <w:r>
+        <w:rPr>
+          <w:vertAlign w:val="superscript"/>
+        </w:rPr>
+        <w:t xml:space="preserve">*</w:t>
+      </w:r>
+      <w:r>
+        <w:t xml:space="preserve">, J of Product Innov Manag 26 (2009) 24–42. https://doi.org/</w:t>
+      </w:r>
+      <w:hyperlink r:id="rId63">
+        <w:r>
+          <w:rPr>
+            <w:rStyle w:val="Hyperlink"/>
+          </w:rPr>
+          <w:t xml:space="preserve">10.1111/j.1540-5885.2009.00332.x</w:t>
+        </w:r>
+      </w:hyperlink>
+      <w:r>
+        <w:t xml:space="preserve">.</w:t>
+      </w:r>
+    </w:p>
+    <w:bookmarkEnd w:id="64"/>
+    <w:bookmarkStart w:id="66" w:name="ref-stocchiMarketingResearchMobile2022"/>
+    <w:p>
+      <w:pPr>
+        <w:pStyle w:val="Bibliography"/>
+      </w:pPr>
+      <w:r>
+        <w:t xml:space="preserve">[8]</w:t>
+      </w:r>
+      <w:r>
+        <w:t xml:space="preserve"> </w:t>
+      </w:r>
+      <w:r>
+        <w:t xml:space="preserve">	</w:t>
+      </w:r>
+      <w:r>
+        <w:t xml:space="preserve">L. Stocchi, N. Pourazad, N. Michaelidou, A. Tanusondjaja, P. Harrigan, Marketing research on</w:t>
+      </w:r>
+      <w:r>
+        <w:t xml:space="preserve"> </w:t>
+      </w:r>
+      <w:r>
+        <w:t xml:space="preserve">Mobile</w:t>
+      </w:r>
+      <w:r>
+        <w:t xml:space="preserve"> </w:t>
+      </w:r>
+      <w:r>
+        <w:t xml:space="preserve">apps: Past, present and future, J. Of the Acad. Mark. Sci. 50 (2022) 195–225. https://doi.org/</w:t>
+      </w:r>
+      <w:hyperlink r:id="rId65">
+        <w:r>
+          <w:rPr>
+            <w:rStyle w:val="Hyperlink"/>
+          </w:rPr>
+          <w:t xml:space="preserve">10.1007/s11747-021-00815-w</w:t>
+        </w:r>
+      </w:hyperlink>
+      <w:r>
+        <w:t xml:space="preserve">.</w:t>
+      </w:r>
+    </w:p>
+    <w:bookmarkEnd w:id="66"/>
+    <w:bookmarkStart w:id="68" w:name="Xf8f9d66e4c22d7efb700b1c4dec05a624d856bf"/>
+    <w:p>
+      <w:pPr>
+        <w:pStyle w:val="Bibliography"/>
+      </w:pPr>
+      <w:r>
+        <w:t xml:space="preserve">[9]</w:t>
+      </w:r>
+      <w:r>
+        <w:t xml:space="preserve"> </w:t>
+      </w:r>
+      <w:r>
+        <w:t xml:space="preserve">	</w:t>
+      </w:r>
+      <w:r>
+        <w:t xml:space="preserve">C. Lamberton, A.T. Stephen, A</w:t>
+      </w:r>
+      <w:r>
+        <w:t xml:space="preserve"> </w:t>
+      </w:r>
+      <w:r>
+        <w:t xml:space="preserve">Thematic Exploration</w:t>
+      </w:r>
+      <w:r>
+        <w:t xml:space="preserve"> </w:t>
+      </w:r>
+      <w:r>
+        <w:t xml:space="preserve">of</w:t>
+      </w:r>
+      <w:r>
+        <w:t xml:space="preserve"> </w:t>
+      </w:r>
+      <w:r>
+        <w:t xml:space="preserve">Digital</w:t>
+      </w:r>
+      <w:r>
+        <w:t xml:space="preserve">,</w:t>
+      </w:r>
+      <w:r>
+        <w:t xml:space="preserve"> </w:t>
+      </w:r>
+      <w:r>
+        <w:t xml:space="preserve">Social Media</w:t>
+      </w:r>
+      <w:r>
+        <w:t xml:space="preserve">, and</w:t>
+      </w:r>
+      <w:r>
+        <w:t xml:space="preserve"> </w:t>
+      </w:r>
+      <w:r>
+        <w:t xml:space="preserve">Mobile Marketing</w:t>
+      </w:r>
+      <w:r>
+        <w:t xml:space="preserve">:</w:t>
+      </w:r>
+      <w:r>
+        <w:t xml:space="preserve"> </w:t>
+      </w:r>
+      <w:r>
+        <w:t xml:space="preserve">Research Evolution</w:t>
+      </w:r>
+      <w:r>
+        <w:t xml:space="preserve"> </w:t>
+      </w:r>
+      <w:r>
+        <w:t xml:space="preserve">from 2000 to 2015 and an</w:t>
+      </w:r>
+      <w:r>
+        <w:t xml:space="preserve"> </w:t>
+      </w:r>
+      <w:r>
+        <w:t xml:space="preserve">Agenda</w:t>
+      </w:r>
+      <w:r>
+        <w:t xml:space="preserve"> </w:t>
+      </w:r>
+      <w:r>
+        <w:t xml:space="preserve">for</w:t>
+      </w:r>
+      <w:r>
+        <w:t xml:space="preserve"> </w:t>
+      </w:r>
+      <w:r>
+        <w:t xml:space="preserve">Future Inquiry</w:t>
+      </w:r>
+      <w:r>
+        <w:t xml:space="preserve">, Journal of Marketing 80 (2016) 146–172. https://doi.org/</w:t>
+      </w:r>
+      <w:hyperlink r:id="rId67">
+        <w:r>
+          <w:rPr>
+            <w:rStyle w:val="Hyperlink"/>
+          </w:rPr>
+          <w:t xml:space="preserve">10.1509/jm.15.0415</w:t>
+        </w:r>
+      </w:hyperlink>
+      <w:r>
+        <w:t xml:space="preserve">.</w:t>
+      </w:r>
+    </w:p>
+    <w:bookmarkEnd w:id="68"/>
+    <w:bookmarkStart w:id="70" w:name="ref-liSocialMediaMarketing2023"/>
+    <w:p>
+      <w:pPr>
+        <w:pStyle w:val="Bibliography"/>
+      </w:pPr>
+      <w:r>
+        <w:t xml:space="preserve">[10]</w:t>
+      </w:r>
+      <w:r>
+        <w:t xml:space="preserve"> </w:t>
+      </w:r>
+      <w:r>
+        <w:t xml:space="preserve">	</w:t>
+      </w:r>
+      <w:r>
+        <w:t xml:space="preserve">F. Li, J. Larimo, L.C. Leonidou, Social media in marketing research:</w:t>
+      </w:r>
+      <w:r>
+        <w:t xml:space="preserve"> </w:t>
+      </w:r>
+      <w:r>
+        <w:t xml:space="preserve">Theoretical</w:t>
+      </w:r>
+      <w:r>
+        <w:t xml:space="preserve"> </w:t>
+      </w:r>
+      <w:r>
+        <w:t xml:space="preserve">bases, methodological aspects, and thematic focus, Psychology and Marketing 40 (2023) 124–145. https://doi.org/</w:t>
+      </w:r>
+      <w:hyperlink r:id="rId69">
+        <w:r>
+          <w:rPr>
+            <w:rStyle w:val="Hyperlink"/>
+          </w:rPr>
+          <w:t xml:space="preserve">10.1002/mar.21746</w:t>
+        </w:r>
+      </w:hyperlink>
+      <w:r>
+        <w:t xml:space="preserve">.</w:t>
+      </w:r>
+    </w:p>
+    <w:bookmarkEnd w:id="70"/>
+    <w:bookmarkStart w:id="72" w:name="X68758628a51006eed83679cb9ece873deb7b1f0"/>
+    <w:p>
+      <w:pPr>
+        <w:pStyle w:val="Bibliography"/>
+      </w:pPr>
+      <w:r>
+        <w:t xml:space="preserve">[11]</w:t>
+      </w:r>
+      <w:r>
+        <w:t xml:space="preserve"> </w:t>
+      </w:r>
+      <w:r>
+        <w:t xml:space="preserve">	</w:t>
+      </w:r>
+      <w:r>
+        <w:t xml:space="preserve">A. Ambika, H. Shin, V. Jain, Immersive technologies and consumer behavior:</w:t>
+      </w:r>
+      <w:r>
+        <w:t xml:space="preserve"> </w:t>
+      </w:r>
+      <w:r>
+        <w:t xml:space="preserve">A</w:t>
+      </w:r>
+      <w:r>
+        <w:t xml:space="preserve"> </w:t>
+      </w:r>
+      <w:r>
+        <w:t xml:space="preserve">systematic review of two decades of research, Australian Journal of Management 50 (2025) 55–79. https://doi.org/</w:t>
+      </w:r>
+      <w:hyperlink r:id="rId71">
+        <w:r>
+          <w:rPr>
+            <w:rStyle w:val="Hyperlink"/>
+          </w:rPr>
+          <w:t xml:space="preserve">10.1177/03128962231181429</w:t>
+        </w:r>
+      </w:hyperlink>
+      <w:r>
+        <w:t xml:space="preserve">.</w:t>
+      </w:r>
+    </w:p>
+    <w:bookmarkEnd w:id="72"/>
+    <w:bookmarkStart w:id="74" w:name="ref-pagePRISMA2020Explanation2021"/>
+    <w:p>
+      <w:pPr>
+        <w:pStyle w:val="Bibliography"/>
+      </w:pPr>
+      <w:r>
+        <w:t xml:space="preserve">[12]</w:t>
+      </w:r>
+      <w:r>
+        <w:t xml:space="preserve"> </w:t>
+      </w:r>
+      <w:r>
+        <w:t xml:space="preserve">	</w:t>
+      </w:r>
+      <w:r>
+        <w:t xml:space="preserve">M.J. Page, D. Moher, P.M. Bossuyt, I. Boutron, T.C. Hoffmann, C.D. Mulrow, L. Shamseer, J.M. Tetzlaff, E.A. Akl, S.E. Brennan, R. Chou, J. Glanville, J.M. Grimshaw, A. Hróbjartsson, M.M. Lalu, T. Li, E.W. Loder, E. Mayo-Wilson, S. McDonald, L.A. McGuinness, L.A. Stewart, J. Thomas, A.C. Tricco, V.A. Welch, P. Whiting, J.E. McKenzie,</w:t>
+      </w:r>
+      <w:r>
+        <w:t xml:space="preserve"> </w:t>
+      </w:r>
+      <w:r>
+        <w:t xml:space="preserve">PRISMA</w:t>
+      </w:r>
+      <w:r>
+        <w:t xml:space="preserve"> </w:t>
+      </w:r>
+      <w:r>
+        <w:t xml:space="preserve">2020 explanation and elaboration: Updated guidance and exemplars for reporting systematic reviews, BMJ (2021) n160. https://doi.org/</w:t>
+      </w:r>
+      <w:hyperlink r:id="rId73">
+        <w:r>
+          <w:rPr>
+            <w:rStyle w:val="Hyperlink"/>
+          </w:rPr>
+          <w:t xml:space="preserve">10.1136/bmj.n160</w:t>
+        </w:r>
+      </w:hyperlink>
+      <w:r>
+        <w:t xml:space="preserve">.</w:t>
+      </w:r>
+    </w:p>
+    <w:bookmarkEnd w:id="74"/>
+    <w:bookmarkStart w:id="76" w:name="ref-abellFoodTechnologyUsing2024"/>
+    <w:p>
+      <w:pPr>
+        <w:pStyle w:val="Bibliography"/>
+      </w:pPr>
+      <w:r>
+        <w:t xml:space="preserve">[13]</w:t>
+      </w:r>
+      <w:r>
+        <w:t xml:space="preserve"> </w:t>
+      </w:r>
+      <w:r>
+        <w:t xml:space="preserve">	</w:t>
+      </w:r>
+      <w:r>
+        <w:t xml:space="preserve">A. Abell, D. Biswas, C. Arroyo Mera, Food and technology:</w:t>
+      </w:r>
+      <w:r>
+        <w:t xml:space="preserve"> </w:t>
+      </w:r>
+      <w:r>
+        <w:t xml:space="preserve">Using</w:t>
+      </w:r>
+      <w:r>
+        <w:t xml:space="preserve"> </w:t>
+      </w:r>
+      <w:r>
+        <w:t xml:space="preserve">digital devices for restaurant orders leads to indulgent outcomes, J. Of the Acad. Mark. Sci. 52 (2024) 1673–1691. https://doi.org/</w:t>
+      </w:r>
+      <w:hyperlink r:id="rId75">
+        <w:r>
+          <w:rPr>
+            <w:rStyle w:val="Hyperlink"/>
+          </w:rPr>
+          <w:t xml:space="preserve">10.1007/s11747-024-01029-6</w:t>
+        </w:r>
+      </w:hyperlink>
+      <w:r>
+        <w:t xml:space="preserve">.</w:t>
+      </w:r>
+    </w:p>
+    <w:bookmarkEnd w:id="76"/>
+    <w:bookmarkStart w:id="78" w:name="ref-wulffEscapingJingleJangleJungle2026"/>
+    <w:p>
+      <w:pPr>
+        <w:pStyle w:val="Bibliography"/>
+      </w:pPr>
+      <w:r>
+        <w:t xml:space="preserve">[14]</w:t>
+      </w:r>
+      <w:r>
+        <w:t xml:space="preserve"> </w:t>
+      </w:r>
+      <w:r>
+        <w:t xml:space="preserve">	</w:t>
+      </w:r>
+      <w:r>
+        <w:t xml:space="preserve">D.U. Wulff, R. Mata, Escaping the</w:t>
+      </w:r>
+      <w:r>
+        <w:t xml:space="preserve"> </w:t>
+      </w:r>
+      <w:r>
+        <w:t xml:space="preserve">Jingle-Jangle Jungle</w:t>
+      </w:r>
+      <w:r>
+        <w:t xml:space="preserve">:</w:t>
+      </w:r>
+      <w:r>
+        <w:t xml:space="preserve"> </w:t>
+      </w:r>
+      <w:r>
+        <w:t xml:space="preserve">Increasing Conceptual Clarity</w:t>
+      </w:r>
+      <w:r>
+        <w:t xml:space="preserve"> </w:t>
+      </w:r>
+      <w:r>
+        <w:t xml:space="preserve">in</w:t>
+      </w:r>
+      <w:r>
+        <w:t xml:space="preserve"> </w:t>
+      </w:r>
+      <w:r>
+        <w:t xml:space="preserve">Psychology Using Large Language Models</w:t>
+      </w:r>
+      <w:r>
+        <w:t xml:space="preserve">, Curr Dir Psychol Sci 35 (2026) 59–65. https://doi.org/</w:t>
+      </w:r>
+      <w:hyperlink r:id="rId77">
+        <w:r>
+          <w:rPr>
+            <w:rStyle w:val="Hyperlink"/>
+          </w:rPr>
+          <w:t xml:space="preserve">10.1177/09637214251382083</w:t>
+        </w:r>
+      </w:hyperlink>
+      <w:r>
+        <w:t xml:space="preserve">.</w:t>
+      </w:r>
+    </w:p>
+    <w:bookmarkEnd w:id="78"/>
+    <w:bookmarkStart w:id="80" w:name="X77c6a6fb7e9371a37a306d4adddd389bde7954b"/>
+    <w:p>
+      <w:pPr>
+        <w:pStyle w:val="Bibliography"/>
+      </w:pPr>
+      <w:r>
+        <w:t xml:space="preserve">[15]</w:t>
+      </w:r>
+      <w:r>
+        <w:t xml:space="preserve"> </w:t>
+      </w:r>
+      <w:r>
+        <w:t xml:space="preserve">	</w:t>
+      </w:r>
+      <w:r>
         <w:t xml:space="preserve">M. Aria, C. Cuccurullo, Bibliometrix :</w:t>
       </w:r>
       <w:r>
@@ -7911,9 +9344,9 @@
         <w:t xml:space="preserve"> </w:t>
       </w:r>
       <w:r>
-        <w:t xml:space="preserve">for comprehensive science mapping analysis, J. Informetr. 11 (2017) 959–975. https://doi.org/</w:t>
-      </w:r>
-      <w:hyperlink r:id="rId46">
+        <w:t xml:space="preserve">for comprehensive science mapping analysis, Journal of Informetrics 11 (2017) 959–975. https://doi.org/</w:t>
+      </w:r>
+      <w:hyperlink r:id="rId79">
         <w:r>
           <w:rPr>
             <w:rStyle w:val="Hyperlink"/>
@@ -7925,14 +9358,14 @@
         <w:t xml:space="preserve">.</w:t>
       </w:r>
     </w:p>
-    <w:bookmarkEnd w:id="47"/>
-    <w:bookmarkStart w:id="49" w:name="ref-xuBibliometricAnalysisTechnology2021"/>
+    <w:bookmarkEnd w:id="80"/>
+    <w:bookmarkStart w:id="82" w:name="ref-donthuHowConductBibliometric2021"/>
     <w:p>
       <w:pPr>
         <w:pStyle w:val="Bibliography"/>
       </w:pPr>
       <w:r>
-        <w:t xml:space="preserve">[3]</w:t>
+        <w:t xml:space="preserve">[16]</w:t>
       </w:r>
       <w:r>
         <w:t xml:space="preserve"> </w:t>
@@ -7941,109 +9374,6 @@
         <w:t xml:space="preserve">	</w:t>
       </w:r>
       <w:r>
-        <w:t xml:space="preserve">Z. Xu, Z. Ge, X. Wang, M. Skare, Bibliometric analysis of technology adoption literature published from 1997 to 2020, Technol. Forecast. Soc. Change 170 (2021) 120896. https://doi.org/</w:t>
-      </w:r>
-      <w:hyperlink r:id="rId48">
-        <w:r>
-          <w:rPr>
-            <w:rStyle w:val="Hyperlink"/>
-          </w:rPr>
-          <w:t xml:space="preserve">10.1016/j.techfore.2021.120896</w:t>
-        </w:r>
-      </w:hyperlink>
-      <w:r>
-        <w:t xml:space="preserve">.</w:t>
-      </w:r>
-    </w:p>
-    <w:bookmarkEnd w:id="49"/>
-    <w:bookmarkStart w:id="50" w:name="ref-freyEcologyRiskMapping2024"/>
-    <w:p>
-      <w:pPr>
-        <w:pStyle w:val="Bibliography"/>
-      </w:pPr>
-      <w:r>
-        <w:t xml:space="preserve">[4]</w:t>
-      </w:r>
-      <w:r>
-        <w:t xml:space="preserve"> </w:t>
-      </w:r>
-      <w:r>
-        <w:t xml:space="preserve">	</w:t>
-      </w:r>
-      <w:r>
-        <w:t xml:space="preserve">R. Frey, O. Fischer, The</w:t>
-      </w:r>
-      <w:r>
-        <w:t xml:space="preserve"> </w:t>
-      </w:r>
-      <w:r>
-        <w:t xml:space="preserve">Ecology</w:t>
-      </w:r>
-      <w:r>
-        <w:t xml:space="preserve"> </w:t>
-      </w:r>
-      <w:r>
-        <w:t xml:space="preserve">of</w:t>
-      </w:r>
-      <w:r>
-        <w:t xml:space="preserve"> </w:t>
-      </w:r>
-      <w:r>
-        <w:t xml:space="preserve">Risk</w:t>
-      </w:r>
-      <w:r>
-        <w:t xml:space="preserve">:</w:t>
-      </w:r>
-      <w:r>
-        <w:t xml:space="preserve"> </w:t>
-      </w:r>
-      <w:r>
-        <w:t xml:space="preserve">Mapping</w:t>
-      </w:r>
-      <w:r>
-        <w:t xml:space="preserve"> </w:t>
-      </w:r>
-      <w:r>
-        <w:t xml:space="preserve">the</w:t>
-      </w:r>
-      <w:r>
-        <w:t xml:space="preserve"> </w:t>
-      </w:r>
-      <w:r>
-        <w:t xml:space="preserve">Risky Choices Prevalent</w:t>
-      </w:r>
-      <w:r>
-        <w:t xml:space="preserve"> </w:t>
-      </w:r>
-      <w:r>
-        <w:t xml:space="preserve">in</w:t>
-      </w:r>
-      <w:r>
-        <w:t xml:space="preserve"> </w:t>
-      </w:r>
-      <w:r>
-        <w:t xml:space="preserve">Modern Life</w:t>
-      </w:r>
-      <w:r>
-        <w:t xml:space="preserve">, (2024).</w:t>
-      </w:r>
-    </w:p>
-    <w:bookmarkEnd w:id="50"/>
-    <w:bookmarkStart w:id="52" w:name="ref-donthuHowConductBibliometric2021"/>
-    <w:p>
-      <w:pPr>
-        <w:pStyle w:val="Bibliography"/>
-      </w:pPr>
-      <w:r>
-        <w:t xml:space="preserve">[5]</w:t>
-      </w:r>
-      <w:r>
-        <w:t xml:space="preserve"> </w:t>
-      </w:r>
-      <w:r>
-        <w:t xml:space="preserve">	</w:t>
-      </w:r>
-      <w:r>
         <w:t xml:space="preserve">N. Donthu, S. Kumar, D. Mukherjee, N. Pandey, W.M. Lim, How to conduct a bibliometric analysis:</w:t>
       </w:r>
       <w:r>
@@ -8056,9 +9386,9 @@
         <w:t xml:space="preserve"> </w:t>
       </w:r>
       <w:r>
-        <w:t xml:space="preserve">overview and guidelines, J. Bus. Res. 133 (2021) 285–296. https://doi.org/</w:t>
-      </w:r>
-      <w:hyperlink r:id="rId51">
+        <w:t xml:space="preserve">overview and guidelines, Journal of Business Research 133 (2021) 285–296. https://doi.org/</w:t>
+      </w:r>
+      <w:hyperlink r:id="rId81">
         <w:r>
           <w:rPr>
             <w:rStyle w:val="Hyperlink"/>
@@ -8070,14 +9400,14 @@
         <w:t xml:space="preserve">.</w:t>
       </w:r>
     </w:p>
-    <w:bookmarkEnd w:id="52"/>
-    <w:bookmarkStart w:id="54" w:name="ref-mcinnesUMAPUniformManifold2018"/>
+    <w:bookmarkEnd w:id="82"/>
+    <w:bookmarkStart w:id="84" w:name="ref-mccombsAgendaSettingFunction1972"/>
     <w:p>
       <w:pPr>
         <w:pStyle w:val="Bibliography"/>
       </w:pPr>
       <w:r>
-        <w:t xml:space="preserve">[6]</w:t>
+        <w:t xml:space="preserve">[17]</w:t>
       </w:r>
       <w:r>
         <w:t xml:space="preserve"> </w:t>
@@ -8086,6 +9416,294 @@
         <w:t xml:space="preserve">	</w:t>
       </w:r>
       <w:r>
+        <w:t xml:space="preserve">M.E. McCombs, D.L. Shaw, The agenda-setting function of mass media, Public Opinion Quarterly 36 (1972) 176–187. https://doi.org/</w:t>
+      </w:r>
+      <w:hyperlink r:id="rId83">
+        <w:r>
+          <w:rPr>
+            <w:rStyle w:val="Hyperlink"/>
+          </w:rPr>
+          <w:t xml:space="preserve">10.1086/267990</w:t>
+        </w:r>
+      </w:hyperlink>
+      <w:r>
+        <w:t xml:space="preserve">.</w:t>
+      </w:r>
+    </w:p>
+    <w:bookmarkEnd w:id="84"/>
+    <w:bookmarkStart w:id="86" w:name="Xd03644679f67c68f6191dfa0765e8a671cb0399"/>
+    <w:p>
+      <w:pPr>
+        <w:pStyle w:val="Bibliography"/>
+      </w:pPr>
+      <w:r>
+        <w:t xml:space="preserve">[18]</w:t>
+      </w:r>
+      <w:r>
+        <w:t xml:space="preserve"> </w:t>
+      </w:r>
+      <w:r>
+        <w:t xml:space="preserve">	</w:t>
+      </w:r>
+      <w:r>
+        <w:t xml:space="preserve">A. Humphreys, Megamarketing:</w:t>
+      </w:r>
+      <w:r>
+        <w:t xml:space="preserve"> </w:t>
+      </w:r>
+      <w:r>
+        <w:t xml:space="preserve">The</w:t>
+      </w:r>
+      <w:r>
+        <w:t xml:space="preserve"> </w:t>
+      </w:r>
+      <w:r>
+        <w:t xml:space="preserve">creation of markets as a social process, Journal of Marketing 74 (2010) 1–19. https://doi.org/</w:t>
+      </w:r>
+      <w:hyperlink r:id="rId85">
+        <w:r>
+          <w:rPr>
+            <w:rStyle w:val="Hyperlink"/>
+          </w:rPr>
+          <w:t xml:space="preserve">10.1509/jm.74.2.1</w:t>
+        </w:r>
+      </w:hyperlink>
+      <w:r>
+        <w:t xml:space="preserve">.</w:t>
+      </w:r>
+    </w:p>
+    <w:bookmarkEnd w:id="86"/>
+    <w:bookmarkStart w:id="88" w:name="ref-humphreysAutomatedTextAnalysis2018"/>
+    <w:p>
+      <w:pPr>
+        <w:pStyle w:val="Bibliography"/>
+      </w:pPr>
+      <w:r>
+        <w:t xml:space="preserve">[19]</w:t>
+      </w:r>
+      <w:r>
+        <w:t xml:space="preserve"> </w:t>
+      </w:r>
+      <w:r>
+        <w:t xml:space="preserve">	</w:t>
+      </w:r>
+      <w:r>
+        <w:t xml:space="preserve">A. Humphreys, R.J.-H. Wang, Automated text analysis for consumer research, Journal of Consumer Research 44 (2018) 1274–1306. https://doi.org/</w:t>
+      </w:r>
+      <w:hyperlink r:id="rId87">
+        <w:r>
+          <w:rPr>
+            <w:rStyle w:val="Hyperlink"/>
+          </w:rPr>
+          <w:t xml:space="preserve">10.1093/jcr/ucx104</w:t>
+        </w:r>
+      </w:hyperlink>
+      <w:r>
+        <w:t xml:space="preserve">.</w:t>
+      </w:r>
+    </w:p>
+    <w:bookmarkEnd w:id="88"/>
+    <w:bookmarkStart w:id="90" w:name="ref-jedidiR2MIndex2021"/>
+    <w:p>
+      <w:pPr>
+        <w:pStyle w:val="Bibliography"/>
+      </w:pPr>
+      <w:r>
+        <w:t xml:space="preserve">[20]</w:t>
+      </w:r>
+      <w:r>
+        <w:t xml:space="preserve"> </w:t>
+      </w:r>
+      <w:r>
+        <w:t xml:space="preserve">	</w:t>
+      </w:r>
+      <w:r>
+        <w:t xml:space="preserve">K. Jedidi, B.H. Schmitt, M. Ben Sliman, Y. Li,</w:t>
+      </w:r>
+      <w:r>
+        <w:t xml:space="preserve"> </w:t>
+      </w:r>
+      <w:r>
+        <w:t xml:space="preserve">R2M</w:t>
+      </w:r>
+      <w:r>
+        <w:t xml:space="preserve"> </w:t>
+      </w:r>
+      <w:r>
+        <w:t xml:space="preserve">index 1.0:</w:t>
+      </w:r>
+      <w:r>
+        <w:t xml:space="preserve"> </w:t>
+      </w:r>
+      <w:r>
+        <w:t xml:space="preserve">Assessing</w:t>
+      </w:r>
+      <w:r>
+        <w:t xml:space="preserve"> </w:t>
+      </w:r>
+      <w:r>
+        <w:t xml:space="preserve">the practical relevance of academic marketing articles, Journal of Marketing 85 (2021) 22–41. https://doi.org/</w:t>
+      </w:r>
+      <w:hyperlink r:id="rId89">
+        <w:r>
+          <w:rPr>
+            <w:rStyle w:val="Hyperlink"/>
+          </w:rPr>
+          <w:t xml:space="preserve">10.1177/00222429211028145</w:t>
+        </w:r>
+      </w:hyperlink>
+      <w:r>
+        <w:t xml:space="preserve">.</w:t>
+      </w:r>
+    </w:p>
+    <w:bookmarkEnd w:id="90"/>
+    <w:bookmarkStart w:id="92" w:name="ref-vanheerdeRealityCheckInfusing2021"/>
+    <w:p>
+      <w:pPr>
+        <w:pStyle w:val="Bibliography"/>
+      </w:pPr>
+      <w:r>
+        <w:t xml:space="preserve">[21]</w:t>
+      </w:r>
+      <w:r>
+        <w:t xml:space="preserve"> </w:t>
+      </w:r>
+      <w:r>
+        <w:t xml:space="preserve">	</w:t>
+      </w:r>
+      <w:r>
+        <w:t xml:space="preserve">H.J. van Heerde, C. Moorman, C.P. Moreau, R.W. Palmatier, Reality check:</w:t>
+      </w:r>
+      <w:r>
+        <w:t xml:space="preserve"> </w:t>
+      </w:r>
+      <w:r>
+        <w:t xml:space="preserve">Infusing</w:t>
+      </w:r>
+      <w:r>
+        <w:t xml:space="preserve"> </w:t>
+      </w:r>
+      <w:r>
+        <w:t xml:space="preserve">ecological value into academic marketing research, Journal of Marketing 85 (2021) 1–13. https://doi.org/</w:t>
+      </w:r>
+      <w:hyperlink r:id="rId91">
+        <w:r>
+          <w:rPr>
+            <w:rStyle w:val="Hyperlink"/>
+          </w:rPr>
+          <w:t xml:space="preserve">10.1177/0022242921992383</w:t>
+        </w:r>
+      </w:hyperlink>
+      <w:r>
+        <w:t xml:space="preserve">.</w:t>
+      </w:r>
+    </w:p>
+    <w:bookmarkEnd w:id="92"/>
+    <w:bookmarkStart w:id="94" w:name="ref-chandyBetterMarketingBetter2021"/>
+    <w:p>
+      <w:pPr>
+        <w:pStyle w:val="Bibliography"/>
+      </w:pPr>
+      <w:r>
+        <w:t xml:space="preserve">[22]</w:t>
+      </w:r>
+      <w:r>
+        <w:t xml:space="preserve"> </w:t>
+      </w:r>
+      <w:r>
+        <w:t xml:space="preserve">	</w:t>
+      </w:r>
+      <w:r>
+        <w:t xml:space="preserve">R.K. Chandy, G.V. Johar, C. Moorman, J.H. Roberts, Better marketing for a better world, Journal of Marketing 85 (2021) 1–9. https://doi.org/</w:t>
+      </w:r>
+      <w:hyperlink r:id="rId93">
+        <w:r>
+          <w:rPr>
+            <w:rStyle w:val="Hyperlink"/>
+          </w:rPr>
+          <w:t xml:space="preserve">10.1177/00222429211003690</w:t>
+        </w:r>
+      </w:hyperlink>
+      <w:r>
+        <w:t xml:space="preserve">.</w:t>
+      </w:r>
+    </w:p>
+    <w:bookmarkEnd w:id="94"/>
+    <w:bookmarkStart w:id="96" w:name="ref-bjorkPublishingDelayScholarly2013"/>
+    <w:p>
+      <w:pPr>
+        <w:pStyle w:val="Bibliography"/>
+      </w:pPr>
+      <w:r>
+        <w:t xml:space="preserve">[23]</w:t>
+      </w:r>
+      <w:r>
+        <w:t xml:space="preserve"> </w:t>
+      </w:r>
+      <w:r>
+        <w:t xml:space="preserve">	</w:t>
+      </w:r>
+      <w:r>
+        <w:t xml:space="preserve">B.-C. Björk, D. Solomon, The publishing delay in scholarly peer-reviewed journals, Journal of Informetrics 7 (2013) 914–923. https://doi.org/</w:t>
+      </w:r>
+      <w:hyperlink r:id="rId95">
+        <w:r>
+          <w:rPr>
+            <w:rStyle w:val="Hyperlink"/>
+          </w:rPr>
+          <w:t xml:space="preserve">10.1016/j.joi.2013.09.001</w:t>
+        </w:r>
+      </w:hyperlink>
+      <w:r>
+        <w:t xml:space="preserve">.</w:t>
+      </w:r>
+    </w:p>
+    <w:bookmarkEnd w:id="96"/>
+    <w:bookmarkStart w:id="98" w:name="Xe2d6bc7484b7c2393b057240f09a7c5cc958e61"/>
+    <w:p>
+      <w:pPr>
+        <w:pStyle w:val="Bibliography"/>
+      </w:pPr>
+      <w:r>
+        <w:t xml:space="preserve">[24]</w:t>
+      </w:r>
+      <w:r>
+        <w:t xml:space="preserve"> </w:t>
+      </w:r>
+      <w:r>
+        <w:t xml:space="preserve">	</w:t>
+      </w:r>
+      <w:r>
+        <w:t xml:space="preserve">G. Ellison, The slowdown of the economics publishing process, Journal of Political Economy 110 (2002) 947–993. https://doi.org/</w:t>
+      </w:r>
+      <w:hyperlink r:id="rId97">
+        <w:r>
+          <w:rPr>
+            <w:rStyle w:val="Hyperlink"/>
+          </w:rPr>
+          <w:t xml:space="preserve">10.1086/341868</w:t>
+        </w:r>
+      </w:hyperlink>
+      <w:r>
+        <w:t xml:space="preserve">.</w:t>
+      </w:r>
+    </w:p>
+    <w:bookmarkEnd w:id="98"/>
+    <w:bookmarkStart w:id="100" w:name="ref-mcinnesUMAPUniformManifold2018"/>
+    <w:p>
+      <w:pPr>
+        <w:pStyle w:val="Bibliography"/>
+      </w:pPr>
+      <w:r>
+        <w:t xml:space="preserve">[25]</w:t>
+      </w:r>
+      <w:r>
+        <w:t xml:space="preserve"> </w:t>
+      </w:r>
+      <w:r>
+        <w:t xml:space="preserve">	</w:t>
+      </w:r>
+      <w:r>
         <w:t xml:space="preserve">L. McInnes, J. Healy, N. Saul, L. Großberger,</w:t>
       </w:r>
       <w:r>
@@ -8116,9 +9734,9 @@
         <w:t xml:space="preserve">Projection</w:t>
       </w:r>
       <w:r>
-        <w:t xml:space="preserve">, J. Open Source Softw. 3 (2018) 861. https://doi.org/</w:t>
-      </w:r>
-      <w:hyperlink r:id="rId53">
+        <w:t xml:space="preserve">, JOSS 3 (2018) 861. https://doi.org/</w:t>
+      </w:r>
+      <w:hyperlink r:id="rId99">
         <w:r>
           <w:rPr>
             <w:rStyle w:val="Hyperlink"/>
@@ -8130,14 +9748,14 @@
         <w:t xml:space="preserve">.</w:t>
       </w:r>
     </w:p>
-    <w:bookmarkEnd w:id="54"/>
-    <w:bookmarkStart w:id="55" w:name="X1ee6c0be2793064c85ed6527d182657f89961b8"/>
+    <w:bookmarkEnd w:id="100"/>
+    <w:bookmarkStart w:id="101" w:name="X1ee6c0be2793064c85ed6527d182657f89961b8"/>
     <w:p>
       <w:pPr>
         <w:pStyle w:val="Bibliography"/>
       </w:pPr>
       <w:r>
-        <w:t xml:space="preserve">[7]</w:t>
+        <w:t xml:space="preserve">[26]</w:t>
       </w:r>
       <w:r>
         <w:t xml:space="preserve"> </w:t>
@@ -8149,14 +9767,14 @@
         <w:t xml:space="preserve">J. MacQueen, Some methods for classification and analysis of multivariate observations, in: L.M. Le Cam, J. Neyman (Eds.), Proceedings of the Fifth Berkeley Symposium on Mathematical Statistics and Probability, University of California Press, Berkeley, CA, 1967: pp. 281–297.</w:t>
       </w:r>
     </w:p>
-    <w:bookmarkEnd w:id="55"/>
-    <w:bookmarkStart w:id="57" w:name="ref-GPT41MiniModel"/>
+    <w:bookmarkEnd w:id="101"/>
+    <w:bookmarkStart w:id="103" w:name="ref-GPT41MiniModel"/>
     <w:p>
       <w:pPr>
         <w:pStyle w:val="Bibliography"/>
       </w:pPr>
       <w:r>
-        <w:t xml:space="preserve">[8]</w:t>
+        <w:t xml:space="preserve">[27]</w:t>
       </w:r>
       <w:r>
         <w:t xml:space="preserve"> </w:t>
@@ -8194,7 +9812,7 @@
       <w:r>
         <w:t xml:space="preserve"> </w:t>
       </w:r>
-      <w:hyperlink r:id="rId56">
+      <w:hyperlink r:id="rId102">
         <w:r>
           <w:rPr>
             <w:rStyle w:val="Hyperlink"/>
@@ -8209,14 +9827,14 @@
         <w:t xml:space="preserve">(accessed July 22, 2026).</w:t>
       </w:r>
     </w:p>
-    <w:bookmarkEnd w:id="57"/>
-    <w:bookmarkStart w:id="59" w:name="ref-reimers2019sentencebert"/>
+    <w:bookmarkEnd w:id="103"/>
+    <w:bookmarkStart w:id="105" w:name="ref-reimers2019sentencebert"/>
     <w:p>
       <w:pPr>
         <w:pStyle w:val="Bibliography"/>
       </w:pPr>
       <w:r>
-        <w:t xml:space="preserve">[9]</w:t>
+        <w:t xml:space="preserve">[28]</w:t>
       </w:r>
       <w:r>
         <w:t xml:space="preserve"> </w:t>
@@ -8254,7 +9872,7 @@
       <w:r>
         <w:t xml:space="preserve">, in: Proceedings of the 2019 Conference on Empirical Methods in Natural Language Processing and the 9th International Joint Conference on Natural Language Processing, Association for Computational Linguistics, 2019: pp. 3982–3992. https://doi.org/</w:t>
       </w:r>
-      <w:hyperlink r:id="rId58">
+      <w:hyperlink r:id="rId104">
         <w:r>
           <w:rPr>
             <w:rStyle w:val="Hyperlink"/>
@@ -8266,14 +9884,14 @@
         <w:t xml:space="preserve">.</w:t>
       </w:r>
     </w:p>
-    <w:bookmarkEnd w:id="59"/>
-    <w:bookmarkStart w:id="60" w:name="ref-wang2020minilm"/>
+    <w:bookmarkEnd w:id="105"/>
+    <w:bookmarkStart w:id="106" w:name="ref-wang2020minilm"/>
     <w:p>
       <w:pPr>
         <w:pStyle w:val="Bibliography"/>
       </w:pPr>
       <w:r>
-        <w:t xml:space="preserve">[10]</w:t>
+        <w:t xml:space="preserve">[29]</w:t>
       </w:r>
       <w:r>
         <w:t xml:space="preserve"> </w:t>
@@ -8306,14 +9924,14 @@
         <w:t xml:space="preserve">self-attention distillation for task-agnostic compression of pre-trained transformers, in: Advances in Neural Information Processing Systems, 2020: pp. 5776–5788.</w:t>
       </w:r>
     </w:p>
-    <w:bookmarkEnd w:id="60"/>
-    <w:bookmarkStart w:id="62" w:name="ref-sentenceTransformersAllMiniLML6v2"/>
+    <w:bookmarkEnd w:id="106"/>
+    <w:bookmarkStart w:id="108" w:name="ref-sentenceTransformersAllMiniLML6v2"/>
     <w:p>
       <w:pPr>
         <w:pStyle w:val="Bibliography"/>
       </w:pPr>
       <w:r>
-        <w:t xml:space="preserve">[11]</w:t>
+        <w:t xml:space="preserve">[30]</w:t>
       </w:r>
       <w:r>
         <w:t xml:space="preserve"> </w:t>
@@ -8333,7 +9951,7 @@
       <w:r>
         <w:t xml:space="preserve"> </w:t>
       </w:r>
-      <w:hyperlink r:id="rId61">
+      <w:hyperlink r:id="rId107">
         <w:r>
           <w:rPr>
             <w:rStyle w:val="Hyperlink"/>
@@ -8345,14 +9963,14 @@
         <w:t xml:space="preserve">.</w:t>
       </w:r>
     </w:p>
-    <w:bookmarkEnd w:id="62"/>
-    <w:bookmarkStart w:id="64" w:name="ref-file2013computerInternet"/>
+    <w:bookmarkEnd w:id="108"/>
+    <w:bookmarkStart w:id="110" w:name="ref-roberts2021mediacloud"/>
     <w:p>
       <w:pPr>
         <w:pStyle w:val="Bibliography"/>
       </w:pPr>
       <w:r>
-        <w:t xml:space="preserve">[12]</w:t>
+        <w:t xml:space="preserve">[31]</w:t>
       </w:r>
       <w:r>
         <w:t xml:space="preserve"> </w:t>
@@ -8361,12 +9979,117 @@
         <w:t xml:space="preserve">	</w:t>
       </w:r>
       <w:r>
+        <w:t xml:space="preserve">H. Roberts, R. Bhargava, L. Valiukas, D. Jen, M.M. Malik, C.S. Bishop, E.B. Ndulue, A. Dave, J. Clark, B. Etling, others, Media cloud:</w:t>
+      </w:r>
+      <w:r>
+        <w:t xml:space="preserve"> </w:t>
+      </w:r>
+      <w:r>
+        <w:t xml:space="preserve">Massive</w:t>
+      </w:r>
+      <w:r>
+        <w:t xml:space="preserve"> </w:t>
+      </w:r>
+      <w:r>
+        <w:t xml:space="preserve">open source collection of global news on the open web, in: Proceedings of the International</w:t>
+      </w:r>
+      <w:r>
+        <w:t xml:space="preserve"> </w:t>
+      </w:r>
+      <w:r>
+        <w:t xml:space="preserve">AAAI</w:t>
+      </w:r>
+      <w:r>
+        <w:t xml:space="preserve"> </w:t>
+      </w:r>
+      <w:r>
+        <w:t xml:space="preserve">Conference on Web and Social Media, 2021: pp. 1034–1045. https://doi.org/</w:t>
+      </w:r>
+      <w:hyperlink r:id="rId109">
+        <w:r>
+          <w:rPr>
+            <w:rStyle w:val="Hyperlink"/>
+          </w:rPr>
+          <w:t xml:space="preserve">10.1609/icwsm.v15i1.18127</w:t>
+        </w:r>
+      </w:hyperlink>
+      <w:r>
+        <w:t xml:space="preserve">.</w:t>
+      </w:r>
+    </w:p>
+    <w:bookmarkEnd w:id="110"/>
+    <w:bookmarkStart w:id="112" w:name="ref-bermejoMediaCloud202026"/>
+    <w:p>
+      <w:pPr>
+        <w:pStyle w:val="Bibliography"/>
+      </w:pPr>
+      <w:r>
+        <w:t xml:space="preserve">[32]</w:t>
+      </w:r>
+      <w:r>
+        <w:t xml:space="preserve"> </w:t>
+      </w:r>
+      <w:r>
+        <w:t xml:space="preserve">	</w:t>
+      </w:r>
+      <w:r>
+        <w:t xml:space="preserve">F. Bermejo, R. Bhargava, P. Budne, P. Gulley, E. Leon, R. McGrady, E.B. Ndulue, E. Zuckerman, Media</w:t>
+      </w:r>
+      <w:r>
+        <w:t xml:space="preserve"> </w:t>
+      </w:r>
+      <w:r>
+        <w:t xml:space="preserve">Cloud</w:t>
+      </w:r>
+      <w:r>
+        <w:t xml:space="preserve"> </w:t>
+      </w:r>
+      <w:r>
+        <w:t xml:space="preserve">2.0:</w:t>
+      </w:r>
+      <w:r>
+        <w:t xml:space="preserve"> </w:t>
+      </w:r>
+      <w:r>
+        <w:t xml:space="preserve">An Updated Open Web News Archive</w:t>
+      </w:r>
+      <w:r>
+        <w:t xml:space="preserve">, ICWSM 20 (2026) 2735–2746. https://doi.org/</w:t>
+      </w:r>
+      <w:hyperlink r:id="rId111">
+        <w:r>
+          <w:rPr>
+            <w:rStyle w:val="Hyperlink"/>
+          </w:rPr>
+          <w:t xml:space="preserve">10.1609/icwsm.v20i1.42778</w:t>
+        </w:r>
+      </w:hyperlink>
+      <w:r>
+        <w:t xml:space="preserve">.</w:t>
+      </w:r>
+    </w:p>
+    <w:bookmarkEnd w:id="112"/>
+    <w:bookmarkStart w:id="114" w:name="ref-file2013computerInternet"/>
+    <w:p>
+      <w:pPr>
+        <w:pStyle w:val="Bibliography"/>
+      </w:pPr>
+      <w:r>
+        <w:t xml:space="preserve">[33]</w:t>
+      </w:r>
+      <w:r>
+        <w:t xml:space="preserve"> </w:t>
+      </w:r>
+      <w:r>
+        <w:t xml:space="preserve">	</w:t>
+      </w:r>
+      <w:r>
         <w:t xml:space="preserve">T. File, Computer and internet use in the united states, U.S. Census Bureau, 2013.</w:t>
       </w:r>
       <w:r>
         <w:t xml:space="preserve"> </w:t>
       </w:r>
-      <w:hyperlink r:id="rId63">
+      <w:hyperlink r:id="rId113">
         <w:r>
           <w:rPr>
             <w:rStyle w:val="Hyperlink"/>
@@ -8378,14 +10101,14 @@
         <w:t xml:space="preserve">.</w:t>
       </w:r>
     </w:p>
-    <w:bookmarkEnd w:id="64"/>
-    <w:bookmarkStart w:id="66" w:name="ref-perrin2015socialMedia"/>
+    <w:bookmarkEnd w:id="114"/>
+    <w:bookmarkStart w:id="116" w:name="ref-perrin2015socialMedia"/>
     <w:p>
       <w:pPr>
         <w:pStyle w:val="Bibliography"/>
       </w:pPr>
       <w:r>
-        <w:t xml:space="preserve">[13]</w:t>
+        <w:t xml:space="preserve">[34]</w:t>
       </w:r>
       <w:r>
         <w:t xml:space="preserve"> </w:t>
@@ -8399,7 +10122,7 @@
       <w:r>
         <w:t xml:space="preserve"> </w:t>
       </w:r>
-      <w:hyperlink r:id="rId65">
+      <w:hyperlink r:id="rId115">
         <w:r>
           <w:rPr>
             <w:rStyle w:val="Hyperlink"/>
@@ -8411,14 +10134,14 @@
         <w:t xml:space="preserve">.</w:t>
       </w:r>
     </w:p>
-    <w:bookmarkEnd w:id="66"/>
-    <w:bookmarkStart w:id="68" w:name="ref-pewSocialMediaFactSheet"/>
+    <w:bookmarkEnd w:id="116"/>
+    <w:bookmarkStart w:id="118" w:name="ref-pewSocialMediaFactSheet"/>
     <w:p>
       <w:pPr>
         <w:pStyle w:val="Bibliography"/>
       </w:pPr>
       <w:r>
-        <w:t xml:space="preserve">[14]</w:t>
+        <w:t xml:space="preserve">[35]</w:t>
       </w:r>
       <w:r>
         <w:t xml:space="preserve"> </w:t>
@@ -8432,7 +10155,7 @@
       <w:r>
         <w:t xml:space="preserve"> </w:t>
       </w:r>
-      <w:hyperlink r:id="rId67">
+      <w:hyperlink r:id="rId117">
         <w:r>
           <w:rPr>
             <w:rStyle w:val="Hyperlink"/>
@@ -8447,14 +10170,14 @@
         <w:t xml:space="preserve">(accessed July 21, 2026).</w:t>
       </w:r>
     </w:p>
-    <w:bookmarkEnd w:id="68"/>
-    <w:bookmarkStart w:id="70" w:name="ref-openai2022chatgpt"/>
+    <w:bookmarkEnd w:id="118"/>
+    <w:bookmarkStart w:id="120" w:name="ref-openai2022chatgpt"/>
     <w:p>
       <w:pPr>
         <w:pStyle w:val="Bibliography"/>
       </w:pPr>
       <w:r>
-        <w:t xml:space="preserve">[15]</w:t>
+        <w:t xml:space="preserve">[36]</w:t>
       </w:r>
       <w:r>
         <w:t xml:space="preserve"> </w:t>
@@ -8477,7 +10200,7 @@
       <w:r>
         <w:t xml:space="preserve"> </w:t>
       </w:r>
-      <w:hyperlink r:id="rId69">
+      <w:hyperlink r:id="rId119">
         <w:r>
           <w:rPr>
             <w:rStyle w:val="Hyperlink"/>
@@ -8492,115 +10215,10 @@
         <w:t xml:space="preserve">(accessed July 21, 2026).</w:t>
       </w:r>
     </w:p>
-    <w:bookmarkEnd w:id="70"/>
-    <w:bookmarkStart w:id="72" w:name="ref-roberts2021mediacloud"/>
-    <w:p>
-      <w:pPr>
-        <w:pStyle w:val="Bibliography"/>
-      </w:pPr>
-      <w:r>
-        <w:t xml:space="preserve">[16]</w:t>
-      </w:r>
-      <w:r>
-        <w:t xml:space="preserve"> </w:t>
-      </w:r>
-      <w:r>
-        <w:t xml:space="preserve">	</w:t>
-      </w:r>
-      <w:r>
-        <w:t xml:space="preserve">H. Roberts, R. Bhargava, L. Valiukas, D. Jen, M.M. Malik, C.S. Bishop, E.B. Ndulue, A. Dave, J. Clark, B. Etling, others, Media cloud:</w:t>
-      </w:r>
-      <w:r>
-        <w:t xml:space="preserve"> </w:t>
-      </w:r>
-      <w:r>
-        <w:t xml:space="preserve">Massive</w:t>
-      </w:r>
-      <w:r>
-        <w:t xml:space="preserve"> </w:t>
-      </w:r>
-      <w:r>
-        <w:t xml:space="preserve">open source collection of global news on the open web, in: Proceedings of the International</w:t>
-      </w:r>
-      <w:r>
-        <w:t xml:space="preserve"> </w:t>
-      </w:r>
-      <w:r>
-        <w:t xml:space="preserve">AAAI</w:t>
-      </w:r>
-      <w:r>
-        <w:t xml:space="preserve"> </w:t>
-      </w:r>
-      <w:r>
-        <w:t xml:space="preserve">Conference on Web and Social Media, 2021: pp. 1034–1045. https://doi.org/</w:t>
-      </w:r>
-      <w:hyperlink r:id="rId71">
-        <w:r>
-          <w:rPr>
-            <w:rStyle w:val="Hyperlink"/>
-          </w:rPr>
-          <w:t xml:space="preserve">10.1609/icwsm.v15i1.18127</w:t>
-        </w:r>
-      </w:hyperlink>
-      <w:r>
-        <w:t xml:space="preserve">.</w:t>
-      </w:r>
-    </w:p>
-    <w:bookmarkEnd w:id="72"/>
-    <w:bookmarkStart w:id="74" w:name="ref-bermejoMediaCloud202026"/>
-    <w:p>
-      <w:pPr>
-        <w:pStyle w:val="Bibliography"/>
-      </w:pPr>
-      <w:r>
-        <w:t xml:space="preserve">[17]</w:t>
-      </w:r>
-      <w:r>
-        <w:t xml:space="preserve"> </w:t>
-      </w:r>
-      <w:r>
-        <w:t xml:space="preserve">	</w:t>
-      </w:r>
-      <w:r>
-        <w:t xml:space="preserve">F. Bermejo, R. Bhargava, P. Budne, P. Gulley, E. Leon, R. McGrady, E.B. Ndulue, E. Zuckerman, Media</w:t>
-      </w:r>
-      <w:r>
-        <w:t xml:space="preserve"> </w:t>
-      </w:r>
-      <w:r>
-        <w:t xml:space="preserve">Cloud</w:t>
-      </w:r>
-      <w:r>
-        <w:t xml:space="preserve"> </w:t>
-      </w:r>
-      <w:r>
-        <w:t xml:space="preserve">2.0:</w:t>
-      </w:r>
-      <w:r>
-        <w:t xml:space="preserve"> </w:t>
-      </w:r>
-      <w:r>
-        <w:t xml:space="preserve">An Updated Open Web News Archive</w:t>
-      </w:r>
-      <w:r>
-        <w:t xml:space="preserve">, Proc. Int. AAAI Conf. Web Soc. Media 20 (2026) 2735–2746. https://doi.org/</w:t>
-      </w:r>
-      <w:hyperlink r:id="rId73">
-        <w:r>
-          <w:rPr>
-            <w:rStyle w:val="Hyperlink"/>
-          </w:rPr>
-          <w:t xml:space="preserve">10.1609/icwsm.v20i1.42778</w:t>
-        </w:r>
-      </w:hyperlink>
-      <w:r>
-        <w:t xml:space="preserve">.</w:t>
-      </w:r>
-    </w:p>
-    <w:bookmarkEnd w:id="74"/>
-    <w:bookmarkEnd w:id="75"/>
-    <w:bookmarkEnd w:id="76"/>
-    <w:bookmarkEnd w:id="77"/>
+    <w:bookmarkEnd w:id="120"/>
+    <w:bookmarkEnd w:id="121"/>
+    <w:bookmarkEnd w:id="122"/>
+    <w:bookmarkEnd w:id="123"/>
     <w:sectPr>
       <w:footnotePr>
         <w:numRestart w:val="eachSect"/>
@@ -9082,6 +10700,91 @@
       <w:rPr>
         <w:rFonts w:ascii="Wingdings" w:hAnsi="Wingdings" w:cs="Wingdings" w:hint="default"/>
       </w:rPr>
+    </w:lvl>
+  </w:abstractNum>
+  <w:abstractNum w:abstractNumId="99411">
+    <w:nsid w:val="00A99411"/>
+    <w:multiLevelType w:val="multilevel"/>
+    <w:lvl w:ilvl="0">
+      <w:start w:val="1"/>
+      <w:numFmt w:val="decimal"/>
+      <w:lvlText w:val="%1."/>
+      <w:lvlJc w:val="left"/>
+      <w:pPr>
+        <w:ind w:left="720" w:hanging="360"/>
+      </w:pPr>
+    </w:lvl>
+    <w:lvl w:ilvl="1">
+      <w:start w:val="1"/>
+      <w:numFmt w:val="decimal"/>
+      <w:lvlText w:val="%2."/>
+      <w:lvlJc w:val="left"/>
+      <w:pPr>
+        <w:ind w:left="1440" w:hanging="360"/>
+      </w:pPr>
+    </w:lvl>
+    <w:lvl w:ilvl="2">
+      <w:start w:val="1"/>
+      <w:numFmt w:val="decimal"/>
+      <w:lvlText w:val="%3."/>
+      <w:lvlJc w:val="left"/>
+      <w:pPr>
+        <w:ind w:left="2160" w:hanging="360"/>
+      </w:pPr>
+    </w:lvl>
+    <w:lvl w:ilvl="3">
+      <w:start w:val="1"/>
+      <w:numFmt w:val="decimal"/>
+      <w:lvlText w:val="%4."/>
+      <w:lvlJc w:val="left"/>
+      <w:pPr>
+        <w:ind w:left="2880" w:hanging="360"/>
+      </w:pPr>
+    </w:lvl>
+    <w:lvl w:ilvl="4">
+      <w:start w:val="1"/>
+      <w:numFmt w:val="decimal"/>
+      <w:lvlText w:val="%5."/>
+      <w:lvlJc w:val="left"/>
+      <w:pPr>
+        <w:ind w:left="3600" w:hanging="360"/>
+      </w:pPr>
+    </w:lvl>
+    <w:lvl w:ilvl="5">
+      <w:start w:val="1"/>
+      <w:numFmt w:val="decimal"/>
+      <w:lvlText w:val="%6."/>
+      <w:lvlJc w:val="left"/>
+      <w:pPr>
+        <w:ind w:left="4320" w:hanging="360"/>
+      </w:pPr>
+    </w:lvl>
+    <w:lvl w:ilvl="6">
+      <w:start w:val="1"/>
+      <w:numFmt w:val="decimal"/>
+      <w:lvlText w:val="%7."/>
+      <w:lvlJc w:val="left"/>
+      <w:pPr>
+        <w:ind w:left="5040" w:hanging="360"/>
+      </w:pPr>
+    </w:lvl>
+    <w:lvl w:ilvl="7">
+      <w:start w:val="1"/>
+      <w:numFmt w:val="decimal"/>
+      <w:lvlText w:val="%8."/>
+      <w:lvlJc w:val="left"/>
+      <w:pPr>
+        <w:ind w:left="5760" w:hanging="360"/>
+      </w:pPr>
+    </w:lvl>
+    <w:lvl w:ilvl="8">
+      <w:start w:val="1"/>
+      <w:numFmt w:val="decimal"/>
+      <w:lvlText w:val="%9."/>
+      <w:lvlJc w:val="left"/>
+      <w:pPr>
+        <w:ind w:left="6480" w:hanging="360"/>
+      </w:pPr>
     </w:lvl>
   </w:abstractNum>
   <w:num w16cid:durableId="1658804836" w:numId="1">
@@ -9240,6 +10943,9 @@
   <w:num w16cid:durableId="606084244" w:numId="43">
     <w:abstractNumId w:val="1"/>
   </w:num>
+  <w:num w16cid:durableId="709961587" w:numId="44">
+    <w:abstractNumId w:val="0"/>
+  </w:num>
   <w:num w:numId="1000">
     <w:abstractNumId w:val="990"/>
   </w:num>
@@ -9262,7 +10968,34 @@
     <w:abstractNumId w:val="991"/>
   </w:num>
   <w:num w:numId="1007">
-    <w:abstractNumId w:val="991"/>
+    <w:abstractNumId w:val="99411"/>
+    <w:lvlOverride w:ilvl="0">
+      <w:startOverride w:val="1"/>
+    </w:lvlOverride>
+    <w:lvlOverride w:ilvl="1">
+      <w:startOverride w:val="1"/>
+    </w:lvlOverride>
+    <w:lvlOverride w:ilvl="2">
+      <w:startOverride w:val="1"/>
+    </w:lvlOverride>
+    <w:lvlOverride w:ilvl="3">
+      <w:startOverride w:val="1"/>
+    </w:lvlOverride>
+    <w:lvlOverride w:ilvl="4">
+      <w:startOverride w:val="1"/>
+    </w:lvlOverride>
+    <w:lvlOverride w:ilvl="5">
+      <w:startOverride w:val="1"/>
+    </w:lvlOverride>
+    <w:lvlOverride w:ilvl="6">
+      <w:startOverride w:val="1"/>
+    </w:lvlOverride>
+    <w:lvlOverride w:ilvl="7">
+      <w:startOverride w:val="1"/>
+    </w:lvlOverride>
+    <w:lvlOverride w:ilvl="8">
+      <w:startOverride w:val="1"/>
+    </w:lvlOverride>
   </w:num>
   <w:num w:numId="1008">
     <w:abstractNumId w:val="991"/>
@@ -9283,12 +11016,6 @@
     <w:abstractNumId w:val="991"/>
   </w:num>
   <w:num w:numId="1014">
-    <w:abstractNumId w:val="991"/>
-  </w:num>
-  <w:num w:numId="1015">
-    <w:abstractNumId w:val="991"/>
-  </w:num>
-  <w:num w:numId="1016">
     <w:abstractNumId w:val="991"/>
   </w:num>
 </w:numbering>
@@ -9765,7 +11492,6 @@
   <w:style w:default="1" w:styleId="DefaultParagraphFont" w:type="character">
     <w:name w:val="Default Paragraph Font"/>
     <w:uiPriority w:val="1"/>
-    <w:semiHidden/>
     <w:unhideWhenUsed/>
   </w:style>
   <w:style w:default="1" w:styleId="TableNormal" w:type="table">
@@ -9793,8 +11519,9 @@
     <w:name w:val="Body Text"/>
     <w:basedOn w:val="Normal"/>
     <w:qFormat/>
+    <w:rsid w:val="00784D68"/>
     <w:pPr>
-      <w:spacing w:after="180" w:before="180"/>
+      <w:spacing w:after="0"/>
     </w:pPr>
   </w:style>
   <w:style w:customStyle="1" w:styleId="FirstParagraph" w:type="paragraph">
@@ -10574,6 +12301,58 @@
       <w:ind w:left="480"/>
     </w:pPr>
   </w:style>
+  <w:style w:styleId="CommentReference" w:type="character">
+    <w:name w:val="annotation reference"/>
+    <w:basedOn w:val="DefaultParagraphFont"/>
+    <w:rsid w:val="00784D68"/>
+    <w:rPr>
+      <w:sz w:val="16"/>
+      <w:szCs w:val="16"/>
+    </w:rPr>
+  </w:style>
+  <w:style w:styleId="CommentText" w:type="paragraph">
+    <w:name w:val="annotation text"/>
+    <w:basedOn w:val="Normal"/>
+    <w:link w:val="CommentTextChar"/>
+    <w:rsid w:val="00784D68"/>
+    <w:rPr>
+      <w:sz w:val="20"/>
+      <w:szCs w:val="20"/>
+    </w:rPr>
+  </w:style>
+  <w:style w:customStyle="1" w:styleId="CommentTextChar" w:type="character">
+    <w:name w:val="Comment Text Char"/>
+    <w:basedOn w:val="DefaultParagraphFont"/>
+    <w:link w:val="CommentText"/>
+    <w:rsid w:val="00784D68"/>
+    <w:rPr>
+      <w:sz w:val="20"/>
+      <w:szCs w:val="20"/>
+    </w:rPr>
+  </w:style>
+  <w:style w:styleId="CommentSubject" w:type="paragraph">
+    <w:name w:val="annotation subject"/>
+    <w:basedOn w:val="CommentText"/>
+    <w:next w:val="CommentText"/>
+    <w:link w:val="CommentSubjectChar"/>
+    <w:rsid w:val="00784D68"/>
+    <w:rPr>
+      <w:b/>
+      <w:bCs/>
+    </w:rPr>
+  </w:style>
+  <w:style w:customStyle="1" w:styleId="CommentSubjectChar" w:type="character">
+    <w:name w:val="Comment Subject Char"/>
+    <w:basedOn w:val="CommentTextChar"/>
+    <w:link w:val="CommentSubject"/>
+    <w:rsid w:val="00784D68"/>
+    <w:rPr>
+      <w:b/>
+      <w:bCs/>
+      <w:sz w:val="20"/>
+      <w:szCs w:val="20"/>
+    </w:rPr>
+  </w:style>
 </w:styles>
 </file>
 

</xml_diff>

<commit_message>
Publish website from b550560
</commit_message>
<xml_diff>
--- a/main-docx/manuscript.docx
+++ b/main-docx/manuscript.docx
@@ -152,35 +152,25 @@
         <w:br w:type="page"/>
       </w:r>
     </w:p>
-    <w:bookmarkStart w:id="21" w:name="Xafe68fb07b0f0d8b3ea921713925e0ff66638bd"/>
+    <w:bookmarkStart w:id="21" w:name="abstract"/>
     <w:p>
       <w:pPr>
         <w:pStyle w:val="Heading1"/>
       </w:pPr>
       <w:r>
-        <w:t xml:space="preserve">Mapping the Field of Consumers and Technology</w:t>
+        <w:t xml:space="preserve">Abstract</w:t>
+      </w:r>
+    </w:p>
+    <w:p>
+      <w:pPr>
+        <w:pStyle w:val="FirstParagraph"/>
+      </w:pPr>
+      <w:r>
+        <w:t xml:space="preserve">Consumer-facing technologies increasingly shape everyday life, yet research on them remains fragmented across labels, domains, and time. We map the evolution of empirical consumer-technology research published between 2000 and June 2026 in seven leading marketing and consumer-behavior journals. Using a two-stage large-language-model based screening procedure, we identified 1,102 articles examining consumer-facing technologies. We standardized the extracted technology terms, represented them as semantic embeddings, and grouped 901 canonical technologies into 16 clusters using UMAP and k-means clustering. We then examined changes in cluster prevalence over time and compared academic attention with U.S. news coverage of consumer-facing technologies under academic study. Consumer-technology research expanded sharply after 2013, while its focus shows clear patterns of emphasizing specific technologies, most recently generative AI. Academic attention was uneven across clusters, with marketer-relevant and emerging technologies receiving disproportionate emphasis compared to U.S. news coverage. These patterns suggest that the field often follows technological novelty and public visibility, while mature or diffuse technologies may become less visible as research objects. Our map reduces fragmentation and supports more cumulative research across related technologies. We call for stronger emphasis on defragmenting the research landscape of consumer-technology, renewed attention to normalized technologies, and closer scrutiny of whether visible technologies warrant dominance or merely reflect short-lived novelty.</w:t>
       </w:r>
     </w:p>
     <w:bookmarkEnd w:id="21"/>
-    <w:bookmarkStart w:id="22" w:name="abstract"/>
-    <w:p>
-      <w:pPr>
-        <w:pStyle w:val="Heading1"/>
-      </w:pPr>
-      <w:r>
-        <w:t xml:space="preserve">Abstract</w:t>
-      </w:r>
-    </w:p>
-    <w:p>
-      <w:pPr>
-        <w:pStyle w:val="FirstParagraph"/>
-      </w:pPr>
-      <w:r>
-        <w:t xml:space="preserve">Consumer-facing technologies increasingly shape everyday life, yet research on them remains fragmented across labels, domains, and time. We map the evolution of empirical consumer-technology research published between 2000 and June 2026 in seven leading marketing and consumer-behavior journals. Using a two-stage large-language-model based screening procedure, we identified 1,102 articles examining consumer-facing technologies. We standardized the extracted technology terms, represented them as semantic embeddings, and grouped 901 canonical technologies into 16 clusters using UMAP and k-means clustering. We then examined changes in cluster prevalence over time and compared academic attention with U.S. news coverage of consumer-facing technologies under academic study. Consumer-technology research expanded sharply after 2013, while its focus shows clear patterns of emphasizing specific technologies, most recently generative AI. Academic attention was uneven across clusters, with marketer-relevant and emerging technologies receiving disproportionate emphasis compared to U.S. news coverage. These patterns suggest that the field often follows technological novelty and public visibility, while mature or diffuse technologies may become less visible as research objects. Our map reduces fragmentation and supports more cumulative research across related technologies. We call for stronger emphasis on defragmenting the research landscape of consumer-technology, renewed attention to normalized technologies, and closer scrutiny of whether visible technologies warrant dominance or merely reflect short-lived novelty.</w:t>
-      </w:r>
-    </w:p>
-    <w:bookmarkEnd w:id="22"/>
-    <w:bookmarkStart w:id="23" w:name="introduction"/>
+    <w:bookmarkStart w:id="22" w:name="introduction"/>
     <w:p>
       <w:pPr>
         <w:pStyle w:val="Heading1"/>
@@ -608,8 +598,8 @@
         <w:t xml:space="preserve">We contextualize the allocation of academic attention by comparing academically identified technologies with their visibility in U.S. national news media. Because the evidence base available when a consumer technology becomes publicly contested is largely the one this field produces, systematic divergence between the two identifies technologies on which the field is generating more or less evidence than their public visibility would suggest. The comparison also provides an external check on technologies whose academic visibility declines as they become normalized, a pattern the academic corpus cannot reveal on its own.</w:t>
       </w:r>
     </w:p>
-    <w:bookmarkEnd w:id="23"/>
-    <w:bookmarkStart w:id="26" w:name="theoretical-background"/>
+    <w:bookmarkEnd w:id="22"/>
+    <w:bookmarkStart w:id="25" w:name="theoretical-background"/>
     <w:p>
       <w:pPr>
         <w:pStyle w:val="Heading1"/>
@@ -618,7 +608,7 @@
         <w:t xml:space="preserve">2. Theoretical Background</w:t>
       </w:r>
     </w:p>
-    <w:bookmarkStart w:id="24" w:name="X619ecd5bbf2e57749a355082ff3f62b2834c864"/>
+    <w:bookmarkStart w:id="23" w:name="X619ecd5bbf2e57749a355082ff3f62b2834c864"/>
     <w:p>
       <w:pPr>
         <w:pStyle w:val="Heading2"/>
@@ -1140,118 +1130,118 @@
         <w:t xml:space="preserve">, where we compare it directly against the corpus obtained this way.</w:t>
       </w:r>
     </w:p>
+    <w:bookmarkEnd w:id="23"/>
+    <w:bookmarkStart w:id="24" w:name="X11cdaa7ed06a82c1f5a1e8905ad2ceb56463ad0"/>
+    <w:p>
+      <w:pPr>
+        <w:pStyle w:val="Heading2"/>
+      </w:pPr>
+      <w:r>
+        <w:t xml:space="preserve">2.2 Mapping Academic Literature Against Media Attention</w:t>
+      </w:r>
+    </w:p>
+    <w:p>
+      <w:pPr>
+        <w:pStyle w:val="FirstParagraph"/>
+      </w:pPr>
+      <w:r>
+        <w:t xml:space="preserve">Attention is a scarce resource in public discourse, and news media allocate it selectively. Agenda-setting research has long established that the prominence a topic receives in news coverage corresponds closely to the prominence it acquires in public awareness</w:t>
+      </w:r>
+      <w:r>
+        <w:t xml:space="preserve"> </w:t>
+      </w:r>
+      <w:r>
+        <w:t xml:space="preserve">[17]</w:t>
+      </w:r>
+      <w:r>
+        <w:t xml:space="preserve">. News coverage is therefore not a direct measure of adoption, use, or societal importance, but it is a defensible indicator of which objects were publicly visible at a given time, and in what volume relative to one another. This logic has also been adopted in consumer research (see for example</w:t>
+      </w:r>
+      <w:r>
+        <w:t xml:space="preserve"> </w:t>
+      </w:r>
+      <w:r>
+        <w:t xml:space="preserve">[18]</w:t>
+      </w:r>
+      <w:r>
+        <w:t xml:space="preserve">;</w:t>
+      </w:r>
+      <w:r>
+        <w:t xml:space="preserve"> </w:t>
+      </w:r>
+      <w:r>
+        <w:t xml:space="preserve">[19]</w:t>
+      </w:r>
+      <w:r>
+        <w:t xml:space="preserve">). Closest to our own comparison,</w:t>
+      </w:r>
+      <w:r>
+        <w:t xml:space="preserve"> </w:t>
+      </w:r>
+      <w:r>
+        <w:t xml:space="preserve">[20]</w:t>
+      </w:r>
+      <w:r>
+        <w:t xml:space="preserve"> </w:t>
+      </w:r>
+      <w:r>
+        <w:t xml:space="preserve">benchmark the topical composition of academic marketing articles against the topics appearing in practitioner outlets, and use the resulting mismatch as evidence that academic and applied agendas have partially decoupled. We extend that logic in two respects: our benchmark corpus is general national news rather than trade publications, which shifts the reference point from managerial to public attention; and our unit of comparison is the technology itself rather than the topic of the article.</w:t>
+      </w:r>
+    </w:p>
+    <w:p>
+      <w:pPr>
+        <w:pStyle w:val="BodyText"/>
+      </w:pPr>
+      <w:r>
+        <w:t xml:space="preserve">The allocation of academic attention across technologies is consequential, and editorials in the field’s leading outlets have argued repeatedly that it should be evaluated against conditions outside the academy rather than against internal disciplinary convention</w:t>
+      </w:r>
+      <w:r>
+        <w:t xml:space="preserve"> </w:t>
+      </w:r>
+      <w:r>
+        <w:t xml:space="preserve">[21]</w:t>
+      </w:r>
+      <w:r>
+        <w:t xml:space="preserve">, and that the field has been slow to direct attention toward the questions its own members consider consequential</w:t>
+      </w:r>
+      <w:r>
+        <w:t xml:space="preserve"> </w:t>
+      </w:r>
+      <w:r>
+        <w:t xml:space="preserve">[22]</w:t>
+      </w:r>
+      <w:r>
+        <w:t xml:space="preserve">. Consumer-facing technologies are a case where this concern is unusually sharp: they reach large populations quickly, their effects on consumers are often contested in public before they are examined empirically, and the evidence base available to regulators and consumer advocates is largely the one the field chooses to produce. Where academic and public attention diverge substantially and persistently, the divergence identifies technologies on which the field is producing either more or less evidence than their public visibility would suggest.</w:t>
+      </w:r>
+    </w:p>
+    <w:p>
+      <w:pPr>
+        <w:pStyle w:val="BodyText"/>
+      </w:pPr>
+      <w:r>
+        <w:t xml:space="preserve">We treat the comparison as descriptive rather than normative, for two reasons. First, media visibility reflects news values—novelty, conflict, and event structure—as much as it reflects consumer relevance, so neither corpus constitutes a benchmark for the other. Second, the publication date of an academic article is separated from the decision to study a technology by a review process that in the social sciences routinely spans multiple years</w:t>
+      </w:r>
+      <w:r>
+        <w:t xml:space="preserve"> </w:t>
+      </w:r>
+      <w:r>
+        <w:t xml:space="preserve">[23]</w:t>
+      </w:r>
+      <w:r>
+        <w:t xml:space="preserve">, and that has lengthened substantially over recent decades, largely through the expansion of revision requirements</w:t>
+      </w:r>
+      <w:r>
+        <w:t xml:space="preserve"> </w:t>
+      </w:r>
+      <w:r>
+        <w:t xml:space="preserve">[24]</w:t>
+      </w:r>
+      <w:r>
+        <w:t xml:space="preserve">.</w:t>
+      </w:r>
+    </w:p>
     <w:bookmarkEnd w:id="24"/>
-    <w:bookmarkStart w:id="25" w:name="X11cdaa7ed06a82c1f5a1e8905ad2ceb56463ad0"/>
-    <w:p>
-      <w:pPr>
-        <w:pStyle w:val="Heading2"/>
-      </w:pPr>
-      <w:r>
-        <w:t xml:space="preserve">2.2 Mapping Academic Literature Against Media Attention</w:t>
-      </w:r>
-    </w:p>
-    <w:p>
-      <w:pPr>
-        <w:pStyle w:val="FirstParagraph"/>
-      </w:pPr>
-      <w:r>
-        <w:t xml:space="preserve">Attention is a scarce resource in public discourse, and news media allocate it selectively. Agenda-setting research has long established that the prominence a topic receives in news coverage corresponds closely to the prominence it acquires in public awareness</w:t>
-      </w:r>
-      <w:r>
-        <w:t xml:space="preserve"> </w:t>
-      </w:r>
-      <w:r>
-        <w:t xml:space="preserve">[17]</w:t>
-      </w:r>
-      <w:r>
-        <w:t xml:space="preserve">. News coverage is therefore not a direct measure of adoption, use, or societal importance, but it is a defensible indicator of which objects were publicly visible at a given time, and in what volume relative to one another. This logic has also been adopted in consumer research (see for example</w:t>
-      </w:r>
-      <w:r>
-        <w:t xml:space="preserve"> </w:t>
-      </w:r>
-      <w:r>
-        <w:t xml:space="preserve">[18]</w:t>
-      </w:r>
-      <w:r>
-        <w:t xml:space="preserve">;</w:t>
-      </w:r>
-      <w:r>
-        <w:t xml:space="preserve"> </w:t>
-      </w:r>
-      <w:r>
-        <w:t xml:space="preserve">[19]</w:t>
-      </w:r>
-      <w:r>
-        <w:t xml:space="preserve">). Closest to our own comparison,</w:t>
-      </w:r>
-      <w:r>
-        <w:t xml:space="preserve"> </w:t>
-      </w:r>
-      <w:r>
-        <w:t xml:space="preserve">[20]</w:t>
-      </w:r>
-      <w:r>
-        <w:t xml:space="preserve"> </w:t>
-      </w:r>
-      <w:r>
-        <w:t xml:space="preserve">benchmark the topical composition of academic marketing articles against the topics appearing in practitioner outlets, and use the resulting mismatch as evidence that academic and applied agendas have partially decoupled. We extend that logic in two respects: our benchmark corpus is general national news rather than trade publications, which shifts the reference point from managerial to public attention; and our unit of comparison is the technology itself rather than the topic of the article.</w:t>
-      </w:r>
-    </w:p>
-    <w:p>
-      <w:pPr>
-        <w:pStyle w:val="BodyText"/>
-      </w:pPr>
-      <w:r>
-        <w:t xml:space="preserve">The allocation of academic attention across technologies is consequential, and editorials in the field’s leading outlets have argued repeatedly that it should be evaluated against conditions outside the academy rather than against internal disciplinary convention</w:t>
-      </w:r>
-      <w:r>
-        <w:t xml:space="preserve"> </w:t>
-      </w:r>
-      <w:r>
-        <w:t xml:space="preserve">[21]</w:t>
-      </w:r>
-      <w:r>
-        <w:t xml:space="preserve">, and that the field has been slow to direct attention toward the questions its own members consider consequential</w:t>
-      </w:r>
-      <w:r>
-        <w:t xml:space="preserve"> </w:t>
-      </w:r>
-      <w:r>
-        <w:t xml:space="preserve">[22]</w:t>
-      </w:r>
-      <w:r>
-        <w:t xml:space="preserve">. Consumer-facing technologies are a case where this concern is unusually sharp: they reach large populations quickly, their effects on consumers are often contested in public before they are examined empirically, and the evidence base available to regulators and consumer advocates is largely the one the field chooses to produce. Where academic and public attention diverge substantially and persistently, the divergence identifies technologies on which the field is producing either more or less evidence than their public visibility would suggest.</w:t>
-      </w:r>
-    </w:p>
-    <w:p>
-      <w:pPr>
-        <w:pStyle w:val="BodyText"/>
-      </w:pPr>
-      <w:r>
-        <w:t xml:space="preserve">We treat the comparison as descriptive rather than normative, for two reasons. First, media visibility reflects news values—novelty, conflict, and event structure—as much as it reflects consumer relevance, so neither corpus constitutes a benchmark for the other. Second, the publication date of an academic article is separated from the decision to study a technology by a review process that in the social sciences routinely spans multiple years</w:t>
-      </w:r>
-      <w:r>
-        <w:t xml:space="preserve"> </w:t>
-      </w:r>
-      <w:r>
-        <w:t xml:space="preserve">[23]</w:t>
-      </w:r>
-      <w:r>
-        <w:t xml:space="preserve">, and that has lengthened substantially over recent decades, largely through the expansion of revision requirements</w:t>
-      </w:r>
-      <w:r>
-        <w:t xml:space="preserve"> </w:t>
-      </w:r>
-      <w:r>
-        <w:t xml:space="preserve">[24]</w:t>
-      </w:r>
-      <w:r>
-        <w:t xml:space="preserve">.</w:t>
-      </w:r>
-    </w:p>
     <w:bookmarkEnd w:id="25"/>
-    <w:bookmarkEnd w:id="26"/>
-    <w:bookmarkStart w:id="35" w:name="methods"/>
+    <w:bookmarkStart w:id="34" w:name="methods"/>
     <w:p>
       <w:pPr>
         <w:pStyle w:val="Heading1"/>
@@ -1377,7 +1367,7 @@
         <w:t xml:space="preserve">, and examined both the overall composition of these clusters and changes in their prevalence over time.</w:t>
       </w:r>
     </w:p>
-    <w:bookmarkStart w:id="28" w:name="article-identification"/>
+    <w:bookmarkStart w:id="27" w:name="article-identification"/>
     <w:p>
       <w:pPr>
         <w:pStyle w:val="Heading2"/>
@@ -2010,7 +2000,7 @@
       <w:r>
         <w:t xml:space="preserve"> </w:t>
       </w:r>
-      <w:hyperlink r:id="rId27">
+      <w:hyperlink r:id="rId26">
         <w:r>
           <w:rPr>
             <w:rStyle w:val="Hyperlink"/>
@@ -2025,8 +2015,8 @@
         <w:t xml:space="preserve">.</w:t>
       </w:r>
     </w:p>
-    <w:bookmarkEnd w:id="28"/>
-    <w:bookmarkStart w:id="29" w:name="standardizing-technology-terms"/>
+    <w:bookmarkEnd w:id="27"/>
+    <w:bookmarkStart w:id="28" w:name="standardizing-technology-terms"/>
     <w:p>
       <w:pPr>
         <w:pStyle w:val="Heading2"/>
@@ -2104,8 +2094,8 @@
         <w:t xml:space="preserve">canonical technologies. All subsequent analyses were performed on these 901 technologies.</w:t>
       </w:r>
     </w:p>
-    <w:bookmarkEnd w:id="29"/>
-    <w:bookmarkStart w:id="31" w:name="clustering-technology-terms"/>
+    <w:bookmarkEnd w:id="28"/>
+    <w:bookmarkStart w:id="30" w:name="clustering-technology-terms"/>
     <w:p>
       <w:pPr>
         <w:pStyle w:val="Heading2"/>
@@ -2229,7 +2219,7 @@
       <w:r>
         <w:t xml:space="preserve"> </w:t>
       </w:r>
-      <w:hyperlink r:id="rId30">
+      <w:hyperlink r:id="rId29">
         <w:r>
           <w:rPr>
             <w:rStyle w:val="Hyperlink"/>
@@ -2247,8 +2237,8 @@
         <w:t xml:space="preserve">report all comparisons evaluated across embedding models, cluster solutions, and similarity thresholds for deduplication.</w:t>
       </w:r>
     </w:p>
-    <w:bookmarkEnd w:id="31"/>
-    <w:bookmarkStart w:id="34" w:name="comparing-against-media-mentions"/>
+    <w:bookmarkEnd w:id="30"/>
+    <w:bookmarkStart w:id="33" w:name="comparing-against-media-mentions"/>
     <w:p>
       <w:pPr>
         <w:pStyle w:val="Heading2"/>
@@ -2382,7 +2372,7 @@
       <w:r>
         <w:t xml:space="preserve"> </w:t>
       </w:r>
-      <w:hyperlink r:id="rId32">
+      <w:hyperlink r:id="rId31">
         <w:r>
           <w:rPr>
             <w:rStyle w:val="Hyperlink"/>
@@ -2407,7 +2397,7 @@
       <w:r>
         <w:t xml:space="preserve"> </w:t>
       </w:r>
-      <w:hyperlink r:id="rId33">
+      <w:hyperlink r:id="rId32">
         <w:r>
           <w:rPr>
             <w:rStyle w:val="Hyperlink"/>
@@ -2422,9 +2412,9 @@
         <w:t xml:space="preserve">).</w:t>
       </w:r>
     </w:p>
+    <w:bookmarkEnd w:id="33"/>
     <w:bookmarkEnd w:id="34"/>
-    <w:bookmarkEnd w:id="35"/>
-    <w:bookmarkStart w:id="49" w:name="results"/>
+    <w:bookmarkStart w:id="48" w:name="results"/>
     <w:p>
       <w:pPr>
         <w:pStyle w:val="Heading1"/>
@@ -2836,7 +2826,7 @@
       <w:tr>
         <w:tc>
           <w:tcPr/>
-          <w:bookmarkStart w:id="39" w:name="fig-technology-map"/>
+          <w:bookmarkStart w:id="38" w:name="fig-technology-map"/>
           <w:p>
             <w:pPr>
               <w:pStyle w:val="Compact"/>
@@ -2847,18 +2837,18 @@
                 <wp:inline>
                   <wp:extent cx="5943600" cy="2786062"/>
                   <wp:effectExtent b="0" l="0" r="0" t="0"/>
-                  <wp:docPr descr="" title="" id="37" name="Picture"/>
+                  <wp:docPr descr="" title="" id="36" name="Picture"/>
                   <a:graphic>
                     <a:graphicData uri="http://schemas.openxmlformats.org/drawingml/2006/picture">
                       <pic:pic>
                         <pic:nvPicPr>
-                          <pic:cNvPr descr="./figures/technologies/map_D_vosviewer_overlay.png" id="38" name="Picture"/>
+                          <pic:cNvPr descr="./figures/technologies/map_D_vosviewer_overlay.png" id="37" name="Picture"/>
                           <pic:cNvPicPr>
                             <a:picLocks noChangeArrowheads="1" noChangeAspect="1"/>
                           </pic:cNvPicPr>
                         </pic:nvPicPr>
                         <pic:blipFill>
-                          <a:blip r:embed="rId36"/>
+                          <a:blip r:embed="rId35"/>
                           <a:stretch>
                             <a:fillRect/>
                           </a:stretch>
@@ -2898,7 +2888,7 @@
               <w:t xml:space="preserve">Figure 1: Semantic map of consumer-facing technology clusters in the academic corpus. Faded points represent individual canonical technologies, colors indicate cluster membership, and labeled bubbles represent cluster centers. Bubble size corresponds to the number of academic articles assigned to each cluster. Spatial proximity represents similarity in the two-dimensional UMAP projection.</w:t>
             </w:r>
           </w:p>
-          <w:bookmarkEnd w:id="39"/>
+          <w:bookmarkEnd w:id="38"/>
         </w:tc>
       </w:tr>
     </w:tbl>
@@ -3071,7 +3061,7 @@
       <w:tr>
         <w:tc>
           <w:tcPr/>
-          <w:bookmarkStart w:id="43" w:name="fig-academic-panels"/>
+          <w:bookmarkStart w:id="42" w:name="fig-academic-panels"/>
           <w:p>
             <w:pPr>
               <w:pStyle w:val="Compact"/>
@@ -3082,18 +3072,18 @@
                 <wp:inline>
                   <wp:extent cx="5943600" cy="2971800"/>
                   <wp:effectExtent b="0" l="0" r="0" t="0"/>
-                  <wp:docPr descr="" title="" id="41" name="Picture"/>
+                  <wp:docPr descr="" title="" id="40" name="Picture"/>
                   <a:graphic>
                     <a:graphicData uri="http://schemas.openxmlformats.org/drawingml/2006/picture">
                       <pic:pic>
                         <pic:nvPicPr>
-                          <pic:cNvPr descr="./figures/technologies/progression_panels_AB_k16.png" id="42" name="Picture"/>
+                          <pic:cNvPr descr="./figures/technologies/progression_panels_AB_k16.png" id="41" name="Picture"/>
                           <pic:cNvPicPr>
                             <a:picLocks noChangeArrowheads="1" noChangeAspect="1"/>
                           </pic:cNvPicPr>
                         </pic:nvPicPr>
                         <pic:blipFill>
-                          <a:blip r:embed="rId40"/>
+                          <a:blip r:embed="rId39"/>
                           <a:stretch>
                             <a:fillRect/>
                           </a:stretch>
@@ -3133,11 +3123,11 @@
               <w:t xml:space="preserve">Figure 2: Academic articles on consumer-facing technologies over time, 2000–2026. Panel A shows annual article counts; Panel B shows each technology cluster’s share of articles.</w:t>
             </w:r>
           </w:p>
-          <w:bookmarkEnd w:id="43"/>
+          <w:bookmarkEnd w:id="42"/>
         </w:tc>
       </w:tr>
     </w:tbl>
-    <w:bookmarkStart w:id="48" w:name="X4e6240e6ec785c3a4d37880cef56abf617949fa"/>
+    <w:bookmarkStart w:id="47" w:name="X4e6240e6ec785c3a4d37880cef56abf617949fa"/>
     <w:p>
       <w:pPr>
         <w:pStyle w:val="Heading2"/>
@@ -3429,7 +3419,7 @@
       <w:tr>
         <w:tc>
           <w:tcPr/>
-          <w:bookmarkStart w:id="47" w:name="fig-academic-media-comparison"/>
+          <w:bookmarkStart w:id="46" w:name="fig-academic-media-comparison"/>
           <w:p>
             <w:pPr>
               <w:pStyle w:val="Compact"/>
@@ -3440,18 +3430,18 @@
                 <wp:inline>
                   <wp:extent cx="5943600" cy="2331433"/>
                   <wp:effectExtent b="0" l="0" r="0" t="0"/>
-                  <wp:docPr descr="" title="" id="45" name="Picture"/>
+                  <wp:docPr descr="" title="" id="44" name="Picture"/>
                   <a:graphic>
                     <a:graphicData uri="http://schemas.openxmlformats.org/drawingml/2006/picture">
                       <pic:pic>
                         <pic:nvPicPr>
-                          <pic:cNvPr descr="./figures/compare/combined/coverage_scatter.png" id="46" name="Picture"/>
+                          <pic:cNvPr descr="./figures/compare/combined/coverage_scatter.png" id="45" name="Picture"/>
                           <pic:cNvPicPr>
                             <a:picLocks noChangeArrowheads="1" noChangeAspect="1"/>
                           </pic:cNvPicPr>
                         </pic:nvPicPr>
                         <pic:blipFill>
-                          <a:blip r:embed="rId44"/>
+                          <a:blip r:embed="rId43"/>
                           <a:stretch>
                             <a:fillRect/>
                           </a:stretch>
@@ -3491,13 +3481,13 @@
               <w:t xml:space="preserve">Figure 3: Mean annual academic and media attention shares across technology clusters, 2008–2026. Panel A shows the relative basis (share of technology-related mentions only); Panel B shows the absolute basis (share of all publications/articles that year). The diagonal indicates equal attention shares. Points above the line receive a comparatively larger academic share; points below the line receive a comparatively larger media share. Media attention serves as an external indicator of visibility rather than a normative benchmark for research priorities.</w:t>
             </w:r>
           </w:p>
-          <w:bookmarkEnd w:id="47"/>
+          <w:bookmarkEnd w:id="46"/>
         </w:tc>
       </w:tr>
     </w:tbl>
+    <w:bookmarkEnd w:id="47"/>
     <w:bookmarkEnd w:id="48"/>
-    <w:bookmarkEnd w:id="49"/>
-    <w:bookmarkStart w:id="123" w:name="discussion"/>
+    <w:bookmarkStart w:id="122" w:name="discussion"/>
     <w:p>
       <w:pPr>
         <w:pStyle w:val="Heading1"/>
@@ -3848,7 +3838,7 @@
       <w:tr>
         <w:tc>
           <w:tcPr/>
-          <w:bookmarkStart w:id="50" w:name="tbl-academic-clusters"/>
+          <w:bookmarkStart w:id="49" w:name="tbl-academic-clusters"/>
           <w:p>
             <w:pPr>
               <w:jc w:val="center"/>
@@ -8552,7 +8542,7 @@
               </w:tc>
             </w:tr>
           </w:tbl>
-          <w:bookmarkEnd w:id="50"/>
+          <w:bookmarkEnd w:id="49"/>
         </w:tc>
       </w:tr>
     </w:tbl>
@@ -8563,7 +8553,7 @@
         </w:sectPr>
       </w:pPr>
     </w:p>
-    <w:bookmarkStart w:id="122" w:name="references"/>
+    <w:bookmarkStart w:id="121" w:name="references"/>
     <w:p>
       <w:pPr>
         <w:pStyle w:val="Heading2"/>
@@ -8572,8 +8562,8 @@
         <w:t xml:space="preserve">5.1 References</w:t>
       </w:r>
     </w:p>
-    <w:bookmarkStart w:id="121" w:name="refs"/>
-    <w:bookmarkStart w:id="52" w:name="X72593c4dfb69f74898c26f494bd8ac79ee05da9"/>
+    <w:bookmarkStart w:id="120" w:name="refs"/>
+    <w:bookmarkStart w:id="51" w:name="X72593c4dfb69f74898c26f494bd8ac79ee05da9"/>
     <w:p>
       <w:pPr>
         <w:pStyle w:val="Bibliography"/>
@@ -8599,7 +8589,7 @@
       <w:r>
         <w:t xml:space="preserve">, PLoS ONE 15 (2020) e0242676. https://doi.org/</w:t>
       </w:r>
-      <w:hyperlink r:id="rId51">
+      <w:hyperlink r:id="rId50">
         <w:r>
           <w:rPr>
             <w:rStyle w:val="Hyperlink"/>
@@ -8611,8 +8601,8 @@
         <w:t xml:space="preserve">.</w:t>
       </w:r>
     </w:p>
-    <w:bookmarkEnd w:id="52"/>
-    <w:bookmarkStart w:id="54" w:name="ref-NewYorkTimes"/>
+    <w:bookmarkEnd w:id="51"/>
+    <w:bookmarkStart w:id="53" w:name="ref-NewYorkTimes"/>
     <w:p>
       <w:pPr>
         <w:pStyle w:val="Bibliography"/>
@@ -8653,7 +8643,7 @@
       <w:r>
         <w:t xml:space="preserve"> </w:t>
       </w:r>
-      <w:hyperlink r:id="rId53">
+      <w:hyperlink r:id="rId52">
         <w:r>
           <w:rPr>
             <w:rStyle w:val="Hyperlink"/>
@@ -8668,8 +8658,8 @@
         <w:t xml:space="preserve">(accessed March 5, 2026).</w:t>
       </w:r>
     </w:p>
-    <w:bookmarkEnd w:id="54"/>
-    <w:bookmarkStart w:id="56" w:name="ref-hoffmanRiseNewTechnologies2022"/>
+    <w:bookmarkEnd w:id="53"/>
+    <w:bookmarkStart w:id="55" w:name="ref-hoffmanRiseNewTechnologies2022"/>
     <w:p>
       <w:pPr>
         <w:pStyle w:val="Bibliography"/>
@@ -8740,7 +8730,7 @@
       <w:r>
         <w:t xml:space="preserve">, Journal of Marketing 86 (2022) 1–6. https://doi.org/</w:t>
       </w:r>
-      <w:hyperlink r:id="rId55">
+      <w:hyperlink r:id="rId54">
         <w:r>
           <w:rPr>
             <w:rStyle w:val="Hyperlink"/>
@@ -8752,8 +8742,8 @@
         <w:t xml:space="preserve">.</w:t>
       </w:r>
     </w:p>
-    <w:bookmarkEnd w:id="56"/>
-    <w:bookmarkStart w:id="58" w:name="X1340cb48341094413e9edc50fe664b533937814"/>
+    <w:bookmarkEnd w:id="55"/>
+    <w:bookmarkStart w:id="57" w:name="X1340cb48341094413e9edc50fe664b533937814"/>
     <w:p>
       <w:pPr>
         <w:pStyle w:val="Bibliography"/>
@@ -8791,7 +8781,7 @@
       <w:r>
         <w:t xml:space="preserve">, Journal of Interactive Marketing 51 (2020) 57–71. https://doi.org/</w:t>
       </w:r>
-      <w:hyperlink r:id="rId57">
+      <w:hyperlink r:id="rId56">
         <w:r>
           <w:rPr>
             <w:rStyle w:val="Hyperlink"/>
@@ -8803,8 +8793,8 @@
         <w:t xml:space="preserve">.</w:t>
       </w:r>
     </w:p>
-    <w:bookmarkEnd w:id="58"/>
-    <w:bookmarkStart w:id="60" w:name="Xbe4389e589697fbbdacbb7038a652d2e67cde7c"/>
+    <w:bookmarkEnd w:id="57"/>
+    <w:bookmarkStart w:id="59" w:name="Xbe4389e589697fbbdacbb7038a652d2e67cde7c"/>
     <w:p>
       <w:pPr>
         <w:pStyle w:val="Bibliography"/>
@@ -8839,7 +8829,7 @@
       <w:r>
         <w:t xml:space="preserve">, Journal of Marketing 85 (2021) 131–151. https://doi.org/</w:t>
       </w:r>
-      <w:hyperlink r:id="rId59">
+      <w:hyperlink r:id="rId58">
         <w:r>
           <w:rPr>
             <w:rStyle w:val="Hyperlink"/>
@@ -8851,8 +8841,8 @@
         <w:t xml:space="preserve">.</w:t>
       </w:r>
     </w:p>
-    <w:bookmarkEnd w:id="60"/>
-    <w:bookmarkStart w:id="62" w:name="X8df770385ab26c30e7652ccd1d3423a7bc02440"/>
+    <w:bookmarkEnd w:id="59"/>
+    <w:bookmarkStart w:id="61" w:name="X8df770385ab26c30e7652ccd1d3423a7bc02440"/>
     <w:p>
       <w:pPr>
         <w:pStyle w:val="Bibliography"/>
@@ -8869,7 +8859,7 @@
       <w:r>
         <w:t xml:space="preserve">T.P. Novak, D.L. Hoffman, Relationship journeys in the internet of things: A new framework for understanding interactions between consumers and smart objects, J. Of the Acad. Mark. Sci. 47 (2019) 216–237. https://doi.org/</w:t>
       </w:r>
-      <w:hyperlink r:id="rId61">
+      <w:hyperlink r:id="rId60">
         <w:r>
           <w:rPr>
             <w:rStyle w:val="Hyperlink"/>
@@ -8881,8 +8871,8 @@
         <w:t xml:space="preserve">.</w:t>
       </w:r>
     </w:p>
-    <w:bookmarkEnd w:id="62"/>
-    <w:bookmarkStart w:id="64" w:name="ref-rijsdijkHowTodaysConsumers2009"/>
+    <w:bookmarkEnd w:id="61"/>
+    <w:bookmarkStart w:id="63" w:name="ref-rijsdijkHowTodaysConsumers2009"/>
     <w:p>
       <w:pPr>
         <w:pStyle w:val="Bibliography"/>
@@ -8932,7 +8922,7 @@
       <w:r>
         <w:t xml:space="preserve">, J of Product Innov Manag 26 (2009) 24–42. https://doi.org/</w:t>
       </w:r>
-      <w:hyperlink r:id="rId63">
+      <w:hyperlink r:id="rId62">
         <w:r>
           <w:rPr>
             <w:rStyle w:val="Hyperlink"/>
@@ -8944,8 +8934,8 @@
         <w:t xml:space="preserve">.</w:t>
       </w:r>
     </w:p>
-    <w:bookmarkEnd w:id="64"/>
-    <w:bookmarkStart w:id="66" w:name="ref-stocchiMarketingResearchMobile2022"/>
+    <w:bookmarkEnd w:id="63"/>
+    <w:bookmarkStart w:id="65" w:name="ref-stocchiMarketingResearchMobile2022"/>
     <w:p>
       <w:pPr>
         <w:pStyle w:val="Bibliography"/>
@@ -8974,7 +8964,7 @@
       <w:r>
         <w:t xml:space="preserve">apps: Past, present and future, J. Of the Acad. Mark. Sci. 50 (2022) 195–225. https://doi.org/</w:t>
       </w:r>
-      <w:hyperlink r:id="rId65">
+      <w:hyperlink r:id="rId64">
         <w:r>
           <w:rPr>
             <w:rStyle w:val="Hyperlink"/>
@@ -8986,8 +8976,8 @@
         <w:t xml:space="preserve">.</w:t>
       </w:r>
     </w:p>
-    <w:bookmarkEnd w:id="66"/>
-    <w:bookmarkStart w:id="68" w:name="Xf8f9d66e4c22d7efb700b1c4dec05a624d856bf"/>
+    <w:bookmarkEnd w:id="65"/>
+    <w:bookmarkStart w:id="67" w:name="Xf8f9d66e4c22d7efb700b1c4dec05a624d856bf"/>
     <w:p>
       <w:pPr>
         <w:pStyle w:val="Bibliography"/>
@@ -9076,7 +9066,7 @@
       <w:r>
         <w:t xml:space="preserve">, Journal of Marketing 80 (2016) 146–172. https://doi.org/</w:t>
       </w:r>
-      <w:hyperlink r:id="rId67">
+      <w:hyperlink r:id="rId66">
         <w:r>
           <w:rPr>
             <w:rStyle w:val="Hyperlink"/>
@@ -9088,8 +9078,8 @@
         <w:t xml:space="preserve">.</w:t>
       </w:r>
     </w:p>
-    <w:bookmarkEnd w:id="68"/>
-    <w:bookmarkStart w:id="70" w:name="ref-liSocialMediaMarketing2023"/>
+    <w:bookmarkEnd w:id="67"/>
+    <w:bookmarkStart w:id="69" w:name="ref-liSocialMediaMarketing2023"/>
     <w:p>
       <w:pPr>
         <w:pStyle w:val="Bibliography"/>
@@ -9118,7 +9108,7 @@
       <w:r>
         <w:t xml:space="preserve">bases, methodological aspects, and thematic focus, Psychology and Marketing 40 (2023) 124–145. https://doi.org/</w:t>
       </w:r>
-      <w:hyperlink r:id="rId69">
+      <w:hyperlink r:id="rId68">
         <w:r>
           <w:rPr>
             <w:rStyle w:val="Hyperlink"/>
@@ -9130,8 +9120,8 @@
         <w:t xml:space="preserve">.</w:t>
       </w:r>
     </w:p>
-    <w:bookmarkEnd w:id="70"/>
-    <w:bookmarkStart w:id="72" w:name="X68758628a51006eed83679cb9ece873deb7b1f0"/>
+    <w:bookmarkEnd w:id="69"/>
+    <w:bookmarkStart w:id="71" w:name="X68758628a51006eed83679cb9ece873deb7b1f0"/>
     <w:p>
       <w:pPr>
         <w:pStyle w:val="Bibliography"/>
@@ -9160,7 +9150,7 @@
       <w:r>
         <w:t xml:space="preserve">systematic review of two decades of research, Australian Journal of Management 50 (2025) 55–79. https://doi.org/</w:t>
       </w:r>
-      <w:hyperlink r:id="rId71">
+      <w:hyperlink r:id="rId70">
         <w:r>
           <w:rPr>
             <w:rStyle w:val="Hyperlink"/>
@@ -9172,8 +9162,8 @@
         <w:t xml:space="preserve">.</w:t>
       </w:r>
     </w:p>
-    <w:bookmarkEnd w:id="72"/>
-    <w:bookmarkStart w:id="74" w:name="ref-pagePRISMA2020Explanation2021"/>
+    <w:bookmarkEnd w:id="71"/>
+    <w:bookmarkStart w:id="73" w:name="ref-pagePRISMA2020Explanation2021"/>
     <w:p>
       <w:pPr>
         <w:pStyle w:val="Bibliography"/>
@@ -9202,7 +9192,7 @@
       <w:r>
         <w:t xml:space="preserve">2020 explanation and elaboration: Updated guidance and exemplars for reporting systematic reviews, BMJ (2021) n160. https://doi.org/</w:t>
       </w:r>
-      <w:hyperlink r:id="rId73">
+      <w:hyperlink r:id="rId72">
         <w:r>
           <w:rPr>
             <w:rStyle w:val="Hyperlink"/>
@@ -9214,8 +9204,8 @@
         <w:t xml:space="preserve">.</w:t>
       </w:r>
     </w:p>
-    <w:bookmarkEnd w:id="74"/>
-    <w:bookmarkStart w:id="76" w:name="ref-abellFoodTechnologyUsing2024"/>
+    <w:bookmarkEnd w:id="73"/>
+    <w:bookmarkStart w:id="75" w:name="ref-abellFoodTechnologyUsing2024"/>
     <w:p>
       <w:pPr>
         <w:pStyle w:val="Bibliography"/>
@@ -9244,7 +9234,7 @@
       <w:r>
         <w:t xml:space="preserve">digital devices for restaurant orders leads to indulgent outcomes, J. Of the Acad. Mark. Sci. 52 (2024) 1673–1691. https://doi.org/</w:t>
       </w:r>
-      <w:hyperlink r:id="rId75">
+      <w:hyperlink r:id="rId74">
         <w:r>
           <w:rPr>
             <w:rStyle w:val="Hyperlink"/>
@@ -9256,8 +9246,8 @@
         <w:t xml:space="preserve">.</w:t>
       </w:r>
     </w:p>
-    <w:bookmarkEnd w:id="76"/>
-    <w:bookmarkStart w:id="78" w:name="ref-wulffEscapingJingleJangleJungle2026"/>
+    <w:bookmarkEnd w:id="75"/>
+    <w:bookmarkStart w:id="77" w:name="ref-wulffEscapingJingleJangleJungle2026"/>
     <w:p>
       <w:pPr>
         <w:pStyle w:val="Bibliography"/>
@@ -9304,7 +9294,7 @@
       <w:r>
         <w:t xml:space="preserve">, Curr Dir Psychol Sci 35 (2026) 59–65. https://doi.org/</w:t>
       </w:r>
-      <w:hyperlink r:id="rId77">
+      <w:hyperlink r:id="rId76">
         <w:r>
           <w:rPr>
             <w:rStyle w:val="Hyperlink"/>
@@ -9316,8 +9306,8 @@
         <w:t xml:space="preserve">.</w:t>
       </w:r>
     </w:p>
-    <w:bookmarkEnd w:id="78"/>
-    <w:bookmarkStart w:id="80" w:name="X77c6a6fb7e9371a37a306d4adddd389bde7954b"/>
+    <w:bookmarkEnd w:id="77"/>
+    <w:bookmarkStart w:id="79" w:name="X77c6a6fb7e9371a37a306d4adddd389bde7954b"/>
     <w:p>
       <w:pPr>
         <w:pStyle w:val="Bibliography"/>
@@ -9346,7 +9336,7 @@
       <w:r>
         <w:t xml:space="preserve">for comprehensive science mapping analysis, Journal of Informetrics 11 (2017) 959–975. https://doi.org/</w:t>
       </w:r>
-      <w:hyperlink r:id="rId79">
+      <w:hyperlink r:id="rId78">
         <w:r>
           <w:rPr>
             <w:rStyle w:val="Hyperlink"/>
@@ -9358,8 +9348,8 @@
         <w:t xml:space="preserve">.</w:t>
       </w:r>
     </w:p>
-    <w:bookmarkEnd w:id="80"/>
-    <w:bookmarkStart w:id="82" w:name="ref-donthuHowConductBibliometric2021"/>
+    <w:bookmarkEnd w:id="79"/>
+    <w:bookmarkStart w:id="81" w:name="ref-donthuHowConductBibliometric2021"/>
     <w:p>
       <w:pPr>
         <w:pStyle w:val="Bibliography"/>
@@ -9388,7 +9378,7 @@
       <w:r>
         <w:t xml:space="preserve">overview and guidelines, Journal of Business Research 133 (2021) 285–296. https://doi.org/</w:t>
       </w:r>
-      <w:hyperlink r:id="rId81">
+      <w:hyperlink r:id="rId80">
         <w:r>
           <w:rPr>
             <w:rStyle w:val="Hyperlink"/>
@@ -9400,8 +9390,8 @@
         <w:t xml:space="preserve">.</w:t>
       </w:r>
     </w:p>
-    <w:bookmarkEnd w:id="82"/>
-    <w:bookmarkStart w:id="84" w:name="ref-mccombsAgendaSettingFunction1972"/>
+    <w:bookmarkEnd w:id="81"/>
+    <w:bookmarkStart w:id="83" w:name="ref-mccombsAgendaSettingFunction1972"/>
     <w:p>
       <w:pPr>
         <w:pStyle w:val="Bibliography"/>
@@ -9418,7 +9408,7 @@
       <w:r>
         <w:t xml:space="preserve">M.E. McCombs, D.L. Shaw, The agenda-setting function of mass media, Public Opinion Quarterly 36 (1972) 176–187. https://doi.org/</w:t>
       </w:r>
-      <w:hyperlink r:id="rId83">
+      <w:hyperlink r:id="rId82">
         <w:r>
           <w:rPr>
             <w:rStyle w:val="Hyperlink"/>
@@ -9430,8 +9420,8 @@
         <w:t xml:space="preserve">.</w:t>
       </w:r>
     </w:p>
-    <w:bookmarkEnd w:id="84"/>
-    <w:bookmarkStart w:id="86" w:name="Xd03644679f67c68f6191dfa0765e8a671cb0399"/>
+    <w:bookmarkEnd w:id="83"/>
+    <w:bookmarkStart w:id="85" w:name="Xd03644679f67c68f6191dfa0765e8a671cb0399"/>
     <w:p>
       <w:pPr>
         <w:pStyle w:val="Bibliography"/>
@@ -9460,7 +9450,7 @@
       <w:r>
         <w:t xml:space="preserve">creation of markets as a social process, Journal of Marketing 74 (2010) 1–19. https://doi.org/</w:t>
       </w:r>
-      <w:hyperlink r:id="rId85">
+      <w:hyperlink r:id="rId84">
         <w:r>
           <w:rPr>
             <w:rStyle w:val="Hyperlink"/>
@@ -9472,8 +9462,8 @@
         <w:t xml:space="preserve">.</w:t>
       </w:r>
     </w:p>
-    <w:bookmarkEnd w:id="86"/>
-    <w:bookmarkStart w:id="88" w:name="ref-humphreysAutomatedTextAnalysis2018"/>
+    <w:bookmarkEnd w:id="85"/>
+    <w:bookmarkStart w:id="87" w:name="ref-humphreysAutomatedTextAnalysis2018"/>
     <w:p>
       <w:pPr>
         <w:pStyle w:val="Bibliography"/>
@@ -9490,7 +9480,7 @@
       <w:r>
         <w:t xml:space="preserve">A. Humphreys, R.J.-H. Wang, Automated text analysis for consumer research, Journal of Consumer Research 44 (2018) 1274–1306. https://doi.org/</w:t>
       </w:r>
-      <w:hyperlink r:id="rId87">
+      <w:hyperlink r:id="rId86">
         <w:r>
           <w:rPr>
             <w:rStyle w:val="Hyperlink"/>
@@ -9502,8 +9492,8 @@
         <w:t xml:space="preserve">.</w:t>
       </w:r>
     </w:p>
-    <w:bookmarkEnd w:id="88"/>
-    <w:bookmarkStart w:id="90" w:name="ref-jedidiR2MIndex2021"/>
+    <w:bookmarkEnd w:id="87"/>
+    <w:bookmarkStart w:id="89" w:name="ref-jedidiR2MIndex2021"/>
     <w:p>
       <w:pPr>
         <w:pStyle w:val="Bibliography"/>
@@ -9544,7 +9534,7 @@
       <w:r>
         <w:t xml:space="preserve">the practical relevance of academic marketing articles, Journal of Marketing 85 (2021) 22–41. https://doi.org/</w:t>
       </w:r>
-      <w:hyperlink r:id="rId89">
+      <w:hyperlink r:id="rId88">
         <w:r>
           <w:rPr>
             <w:rStyle w:val="Hyperlink"/>
@@ -9556,8 +9546,8 @@
         <w:t xml:space="preserve">.</w:t>
       </w:r>
     </w:p>
-    <w:bookmarkEnd w:id="90"/>
-    <w:bookmarkStart w:id="92" w:name="ref-vanheerdeRealityCheckInfusing2021"/>
+    <w:bookmarkEnd w:id="89"/>
+    <w:bookmarkStart w:id="91" w:name="ref-vanheerdeRealityCheckInfusing2021"/>
     <w:p>
       <w:pPr>
         <w:pStyle w:val="Bibliography"/>
@@ -9586,7 +9576,7 @@
       <w:r>
         <w:t xml:space="preserve">ecological value into academic marketing research, Journal of Marketing 85 (2021) 1–13. https://doi.org/</w:t>
       </w:r>
-      <w:hyperlink r:id="rId91">
+      <w:hyperlink r:id="rId90">
         <w:r>
           <w:rPr>
             <w:rStyle w:val="Hyperlink"/>
@@ -9598,8 +9588,8 @@
         <w:t xml:space="preserve">.</w:t>
       </w:r>
     </w:p>
-    <w:bookmarkEnd w:id="92"/>
-    <w:bookmarkStart w:id="94" w:name="ref-chandyBetterMarketingBetter2021"/>
+    <w:bookmarkEnd w:id="91"/>
+    <w:bookmarkStart w:id="93" w:name="ref-chandyBetterMarketingBetter2021"/>
     <w:p>
       <w:pPr>
         <w:pStyle w:val="Bibliography"/>
@@ -9616,7 +9606,7 @@
       <w:r>
         <w:t xml:space="preserve">R.K. Chandy, G.V. Johar, C. Moorman, J.H. Roberts, Better marketing for a better world, Journal of Marketing 85 (2021) 1–9. https://doi.org/</w:t>
       </w:r>
-      <w:hyperlink r:id="rId93">
+      <w:hyperlink r:id="rId92">
         <w:r>
           <w:rPr>
             <w:rStyle w:val="Hyperlink"/>
@@ -9628,8 +9618,8 @@
         <w:t xml:space="preserve">.</w:t>
       </w:r>
     </w:p>
-    <w:bookmarkEnd w:id="94"/>
-    <w:bookmarkStart w:id="96" w:name="ref-bjorkPublishingDelayScholarly2013"/>
+    <w:bookmarkEnd w:id="93"/>
+    <w:bookmarkStart w:id="95" w:name="ref-bjorkPublishingDelayScholarly2013"/>
     <w:p>
       <w:pPr>
         <w:pStyle w:val="Bibliography"/>
@@ -9646,7 +9636,7 @@
       <w:r>
         <w:t xml:space="preserve">B.-C. Björk, D. Solomon, The publishing delay in scholarly peer-reviewed journals, Journal of Informetrics 7 (2013) 914–923. https://doi.org/</w:t>
       </w:r>
-      <w:hyperlink r:id="rId95">
+      <w:hyperlink r:id="rId94">
         <w:r>
           <w:rPr>
             <w:rStyle w:val="Hyperlink"/>
@@ -9658,8 +9648,8 @@
         <w:t xml:space="preserve">.</w:t>
       </w:r>
     </w:p>
-    <w:bookmarkEnd w:id="96"/>
-    <w:bookmarkStart w:id="98" w:name="Xe2d6bc7484b7c2393b057240f09a7c5cc958e61"/>
+    <w:bookmarkEnd w:id="95"/>
+    <w:bookmarkStart w:id="97" w:name="Xe2d6bc7484b7c2393b057240f09a7c5cc958e61"/>
     <w:p>
       <w:pPr>
         <w:pStyle w:val="Bibliography"/>
@@ -9676,7 +9666,7 @@
       <w:r>
         <w:t xml:space="preserve">G. Ellison, The slowdown of the economics publishing process, Journal of Political Economy 110 (2002) 947–993. https://doi.org/</w:t>
       </w:r>
-      <w:hyperlink r:id="rId97">
+      <w:hyperlink r:id="rId96">
         <w:r>
           <w:rPr>
             <w:rStyle w:val="Hyperlink"/>
@@ -9688,8 +9678,8 @@
         <w:t xml:space="preserve">.</w:t>
       </w:r>
     </w:p>
-    <w:bookmarkEnd w:id="98"/>
-    <w:bookmarkStart w:id="100" w:name="ref-mcinnesUMAPUniformManifold2018"/>
+    <w:bookmarkEnd w:id="97"/>
+    <w:bookmarkStart w:id="99" w:name="ref-mcinnesUMAPUniformManifold2018"/>
     <w:p>
       <w:pPr>
         <w:pStyle w:val="Bibliography"/>
@@ -9736,7 +9726,7 @@
       <w:r>
         <w:t xml:space="preserve">, JOSS 3 (2018) 861. https://doi.org/</w:t>
       </w:r>
-      <w:hyperlink r:id="rId99">
+      <w:hyperlink r:id="rId98">
         <w:r>
           <w:rPr>
             <w:rStyle w:val="Hyperlink"/>
@@ -9748,14 +9738,33 @@
         <w:t xml:space="preserve">.</w:t>
       </w:r>
     </w:p>
+    <w:bookmarkEnd w:id="99"/>
+    <w:bookmarkStart w:id="100" w:name="X1ee6c0be2793064c85ed6527d182657f89961b8"/>
+    <w:p>
+      <w:pPr>
+        <w:pStyle w:val="Bibliography"/>
+      </w:pPr>
+      <w:r>
+        <w:t xml:space="preserve">[26]</w:t>
+      </w:r>
+      <w:r>
+        <w:t xml:space="preserve"> </w:t>
+      </w:r>
+      <w:r>
+        <w:t xml:space="preserve">	</w:t>
+      </w:r>
+      <w:r>
+        <w:t xml:space="preserve">J. MacQueen, Some methods for classification and analysis of multivariate observations, in: L.M. Le Cam, J. Neyman (Eds.), Proceedings of the Fifth Berkeley Symposium on Mathematical Statistics and Probability, University of California Press, Berkeley, CA, 1967: pp. 281–297.</w:t>
+      </w:r>
+    </w:p>
     <w:bookmarkEnd w:id="100"/>
-    <w:bookmarkStart w:id="101" w:name="X1ee6c0be2793064c85ed6527d182657f89961b8"/>
+    <w:bookmarkStart w:id="102" w:name="ref-GPT41MiniModel"/>
     <w:p>
       <w:pPr>
         <w:pStyle w:val="Bibliography"/>
       </w:pPr>
       <w:r>
-        <w:t xml:space="preserve">[26]</w:t>
+        <w:t xml:space="preserve">[27]</w:t>
       </w:r>
       <w:r>
         <w:t xml:space="preserve"> </w:t>
@@ -9764,25 +9773,6 @@
         <w:t xml:space="preserve">	</w:t>
       </w:r>
       <w:r>
-        <w:t xml:space="preserve">J. MacQueen, Some methods for classification and analysis of multivariate observations, in: L.M. Le Cam, J. Neyman (Eds.), Proceedings of the Fifth Berkeley Symposium on Mathematical Statistics and Probability, University of California Press, Berkeley, CA, 1967: pp. 281–297.</w:t>
-      </w:r>
-    </w:p>
-    <w:bookmarkEnd w:id="101"/>
-    <w:bookmarkStart w:id="103" w:name="ref-GPT41MiniModel"/>
-    <w:p>
-      <w:pPr>
-        <w:pStyle w:val="Bibliography"/>
-      </w:pPr>
-      <w:r>
-        <w:t xml:space="preserve">[27]</w:t>
-      </w:r>
-      <w:r>
-        <w:t xml:space="preserve"> </w:t>
-      </w:r>
-      <w:r>
-        <w:t xml:space="preserve">	</w:t>
-      </w:r>
-      <w:r>
         <w:t xml:space="preserve">GPT-4</w:t>
       </w:r>
       <w:r>
@@ -9812,7 +9802,7 @@
       <w:r>
         <w:t xml:space="preserve"> </w:t>
       </w:r>
-      <w:hyperlink r:id="rId102">
+      <w:hyperlink r:id="rId101">
         <w:r>
           <w:rPr>
             <w:rStyle w:val="Hyperlink"/>
@@ -9827,8 +9817,8 @@
         <w:t xml:space="preserve">(accessed July 22, 2026).</w:t>
       </w:r>
     </w:p>
-    <w:bookmarkEnd w:id="103"/>
-    <w:bookmarkStart w:id="105" w:name="ref-reimers2019sentencebert"/>
+    <w:bookmarkEnd w:id="102"/>
+    <w:bookmarkStart w:id="104" w:name="ref-reimers2019sentencebert"/>
     <w:p>
       <w:pPr>
         <w:pStyle w:val="Bibliography"/>
@@ -9872,7 +9862,7 @@
       <w:r>
         <w:t xml:space="preserve">, in: Proceedings of the 2019 Conference on Empirical Methods in Natural Language Processing and the 9th International Joint Conference on Natural Language Processing, Association for Computational Linguistics, 2019: pp. 3982–3992. https://doi.org/</w:t>
       </w:r>
-      <w:hyperlink r:id="rId104">
+      <w:hyperlink r:id="rId103">
         <w:r>
           <w:rPr>
             <w:rStyle w:val="Hyperlink"/>
@@ -9884,14 +9874,54 @@
         <w:t xml:space="preserve">.</w:t>
       </w:r>
     </w:p>
+    <w:bookmarkEnd w:id="104"/>
+    <w:bookmarkStart w:id="105" w:name="ref-wang2020minilm"/>
+    <w:p>
+      <w:pPr>
+        <w:pStyle w:val="Bibliography"/>
+      </w:pPr>
+      <w:r>
+        <w:t xml:space="preserve">[29]</w:t>
+      </w:r>
+      <w:r>
+        <w:t xml:space="preserve"> </w:t>
+      </w:r>
+      <w:r>
+        <w:t xml:space="preserve">	</w:t>
+      </w:r>
+      <w:r>
+        <w:t xml:space="preserve">W. Wang, F. Wei, L. Dong, H. Bao, N. Yang, M. Zhou,</w:t>
+      </w:r>
+      <w:r>
+        <w:t xml:space="preserve"> </w:t>
+      </w:r>
+      <w:r>
+        <w:t xml:space="preserve">MiniLM</w:t>
+      </w:r>
+      <w:r>
+        <w:t xml:space="preserve">:</w:t>
+      </w:r>
+      <w:r>
+        <w:t xml:space="preserve"> </w:t>
+      </w:r>
+      <w:r>
+        <w:t xml:space="preserve">Deep</w:t>
+      </w:r>
+      <w:r>
+        <w:t xml:space="preserve"> </w:t>
+      </w:r>
+      <w:r>
+        <w:t xml:space="preserve">self-attention distillation for task-agnostic compression of pre-trained transformers, in: Advances in Neural Information Processing Systems, 2020: pp. 5776–5788.</w:t>
+      </w:r>
+    </w:p>
     <w:bookmarkEnd w:id="105"/>
-    <w:bookmarkStart w:id="106" w:name="ref-wang2020minilm"/>
+    <w:bookmarkStart w:id="107" w:name="ref-sentenceTransformersAllMiniLML6v2"/>
     <w:p>
       <w:pPr>
         <w:pStyle w:val="Bibliography"/>
       </w:pPr>
       <w:r>
-        <w:t xml:space="preserve">[29]</w:t>
+        <w:t xml:space="preserve">[30]</w:t>
       </w:r>
       <w:r>
         <w:t xml:space="preserve"> </w:t>
@@ -9900,46 +9930,6 @@
         <w:t xml:space="preserve">	</w:t>
       </w:r>
       <w:r>
-        <w:t xml:space="preserve">W. Wang, F. Wei, L. Dong, H. Bao, N. Yang, M. Zhou,</w:t>
-      </w:r>
-      <w:r>
-        <w:t xml:space="preserve"> </w:t>
-      </w:r>
-      <w:r>
-        <w:t xml:space="preserve">MiniLM</w:t>
-      </w:r>
-      <w:r>
-        <w:t xml:space="preserve">:</w:t>
-      </w:r>
-      <w:r>
-        <w:t xml:space="preserve"> </w:t>
-      </w:r>
-      <w:r>
-        <w:t xml:space="preserve">Deep</w:t>
-      </w:r>
-      <w:r>
-        <w:t xml:space="preserve"> </w:t>
-      </w:r>
-      <w:r>
-        <w:t xml:space="preserve">self-attention distillation for task-agnostic compression of pre-trained transformers, in: Advances in Neural Information Processing Systems, 2020: pp. 5776–5788.</w:t>
-      </w:r>
-    </w:p>
-    <w:bookmarkEnd w:id="106"/>
-    <w:bookmarkStart w:id="108" w:name="ref-sentenceTransformersAllMiniLML6v2"/>
-    <w:p>
-      <w:pPr>
-        <w:pStyle w:val="Bibliography"/>
-      </w:pPr>
-      <w:r>
-        <w:t xml:space="preserve">[30]</w:t>
-      </w:r>
-      <w:r>
-        <w:t xml:space="preserve"> </w:t>
-      </w:r>
-      <w:r>
-        <w:t xml:space="preserve">	</w:t>
-      </w:r>
-      <w:r>
         <w:t xml:space="preserve">Sentence Transformers, All-</w:t>
       </w:r>
       <w:r>
@@ -9951,7 +9941,7 @@
       <w:r>
         <w:t xml:space="preserve"> </w:t>
       </w:r>
-      <w:hyperlink r:id="rId107">
+      <w:hyperlink r:id="rId106">
         <w:r>
           <w:rPr>
             <w:rStyle w:val="Hyperlink"/>
@@ -9963,8 +9953,8 @@
         <w:t xml:space="preserve">.</w:t>
       </w:r>
     </w:p>
-    <w:bookmarkEnd w:id="108"/>
-    <w:bookmarkStart w:id="110" w:name="ref-roberts2021mediacloud"/>
+    <w:bookmarkEnd w:id="107"/>
+    <w:bookmarkStart w:id="109" w:name="ref-roberts2021mediacloud"/>
     <w:p>
       <w:pPr>
         <w:pStyle w:val="Bibliography"/>
@@ -10005,7 +9995,7 @@
       <w:r>
         <w:t xml:space="preserve">Conference on Web and Social Media, 2021: pp. 1034–1045. https://doi.org/</w:t>
       </w:r>
-      <w:hyperlink r:id="rId109">
+      <w:hyperlink r:id="rId108">
         <w:r>
           <w:rPr>
             <w:rStyle w:val="Hyperlink"/>
@@ -10017,8 +10007,8 @@
         <w:t xml:space="preserve">.</w:t>
       </w:r>
     </w:p>
-    <w:bookmarkEnd w:id="110"/>
-    <w:bookmarkStart w:id="112" w:name="ref-bermejoMediaCloud202026"/>
+    <w:bookmarkEnd w:id="109"/>
+    <w:bookmarkStart w:id="111" w:name="ref-bermejoMediaCloud202026"/>
     <w:p>
       <w:pPr>
         <w:pStyle w:val="Bibliography"/>
@@ -10056,7 +10046,7 @@
       <w:r>
         <w:t xml:space="preserve">, ICWSM 20 (2026) 2735–2746. https://doi.org/</w:t>
       </w:r>
-      <w:hyperlink r:id="rId111">
+      <w:hyperlink r:id="rId110">
         <w:r>
           <w:rPr>
             <w:rStyle w:val="Hyperlink"/>
@@ -10068,8 +10058,8 @@
         <w:t xml:space="preserve">.</w:t>
       </w:r>
     </w:p>
-    <w:bookmarkEnd w:id="112"/>
-    <w:bookmarkStart w:id="114" w:name="ref-file2013computerInternet"/>
+    <w:bookmarkEnd w:id="111"/>
+    <w:bookmarkStart w:id="113" w:name="ref-file2013computerInternet"/>
     <w:p>
       <w:pPr>
         <w:pStyle w:val="Bibliography"/>
@@ -10089,7 +10079,7 @@
       <w:r>
         <w:t xml:space="preserve"> </w:t>
       </w:r>
-      <w:hyperlink r:id="rId113">
+      <w:hyperlink r:id="rId112">
         <w:r>
           <w:rPr>
             <w:rStyle w:val="Hyperlink"/>
@@ -10101,8 +10091,8 @@
         <w:t xml:space="preserve">.</w:t>
       </w:r>
     </w:p>
-    <w:bookmarkEnd w:id="114"/>
-    <w:bookmarkStart w:id="116" w:name="ref-perrin2015socialMedia"/>
+    <w:bookmarkEnd w:id="113"/>
+    <w:bookmarkStart w:id="115" w:name="ref-perrin2015socialMedia"/>
     <w:p>
       <w:pPr>
         <w:pStyle w:val="Bibliography"/>
@@ -10122,7 +10112,7 @@
       <w:r>
         <w:t xml:space="preserve"> </w:t>
       </w:r>
-      <w:hyperlink r:id="rId115">
+      <w:hyperlink r:id="rId114">
         <w:r>
           <w:rPr>
             <w:rStyle w:val="Hyperlink"/>
@@ -10134,8 +10124,8 @@
         <w:t xml:space="preserve">.</w:t>
       </w:r>
     </w:p>
-    <w:bookmarkEnd w:id="116"/>
-    <w:bookmarkStart w:id="118" w:name="ref-pewSocialMediaFactSheet"/>
+    <w:bookmarkEnd w:id="115"/>
+    <w:bookmarkStart w:id="117" w:name="ref-pewSocialMediaFactSheet"/>
     <w:p>
       <w:pPr>
         <w:pStyle w:val="Bibliography"/>
@@ -10155,7 +10145,7 @@
       <w:r>
         <w:t xml:space="preserve"> </w:t>
       </w:r>
-      <w:hyperlink r:id="rId117">
+      <w:hyperlink r:id="rId116">
         <w:r>
           <w:rPr>
             <w:rStyle w:val="Hyperlink"/>
@@ -10170,8 +10160,8 @@
         <w:t xml:space="preserve">(accessed July 21, 2026).</w:t>
       </w:r>
     </w:p>
-    <w:bookmarkEnd w:id="118"/>
-    <w:bookmarkStart w:id="120" w:name="ref-openai2022chatgpt"/>
+    <w:bookmarkEnd w:id="117"/>
+    <w:bookmarkStart w:id="119" w:name="ref-openai2022chatgpt"/>
     <w:p>
       <w:pPr>
         <w:pStyle w:val="Bibliography"/>
@@ -10200,7 +10190,7 @@
       <w:r>
         <w:t xml:space="preserve"> </w:t>
       </w:r>
-      <w:hyperlink r:id="rId119">
+      <w:hyperlink r:id="rId118">
         <w:r>
           <w:rPr>
             <w:rStyle w:val="Hyperlink"/>
@@ -10215,10 +10205,10 @@
         <w:t xml:space="preserve">(accessed July 21, 2026).</w:t>
       </w:r>
     </w:p>
+    <w:bookmarkEnd w:id="119"/>
     <w:bookmarkEnd w:id="120"/>
     <w:bookmarkEnd w:id="121"/>
     <w:bookmarkEnd w:id="122"/>
-    <w:bookmarkEnd w:id="123"/>
     <w:sectPr>
       <w:footnotePr>
         <w:numRestart w:val="eachSect"/>

</xml_diff>